<commit_message>
Report: optimization on final-model scenarios - effect distribution, crop rotation norms, scenario robustness
</commit_message>
<xml_diff>
--- a/report/out/rshb_yield_forecast_report.docx
+++ b/report/out/rshb_yield_forecast_report.docx
@@ -121,7 +121,7 @@
       <w:pPr>
         <w:pStyle w:val="1"/>
       </w:pPr>
-      <w:bookmarkStart w:id="0" w:name="_Toc244072294"/>
+      <w:bookmarkStart w:id="0" w:name="_Toc244072818"/>
       <w:r>
         <w:lastRenderedPageBreak/>
         <w:t>Аннотация</w:t>
@@ -163,10 +163,10 @@
         <w:ind w:firstLine="425"/>
       </w:pPr>
       <w:r>
-        <w:t>Сверх кейса решена задача оптимизации структуры посевов. По погодным сценариям прошлых лет строится распределение прибыли любого плана, и линейная программа с мерой риска CVaR ищет план с лучшим сочетанием средней прибыли и прибыли в плохие годы при ограничениях севооборота. На исторической проверке 2012–2025 годов небольшая перестройка плана (не более 10 п. п. на культуру) дала по факту 1 788 руб. на гектар дополнительной прибыли и оказалась выгоднее текущего плана в 74</w:t>
-      </w:r>
-      <w:r>
-        <w:t xml:space="preserve"> % случаев. Результаты доступны в прототипе — статическом сайте «Агрокаст».</w:t>
+        <w:t>Сверх кейса решена задача оптимизации структуры посевов. Итоговая модель прогоняется на погоде прошлых сезонов, и для любого плана строится распределение прибыли, и линейная программа с мерой риска CVaR ищет план с лучшим сочетанием средней прибыли и прибыли в плохие годы при ограничениях севооборота. На сезон 2026 года сдвиг не более 5 п. п. на культуру поднимает ожидаемую прибыль в среднем на 15 % и даёт выигрыш у 97</w:t>
+      </w:r>
+      <w:r>
+        <w:t xml:space="preserve"> % субъектов, причём прибыль в плохие годы растёт почти так же. На исторической проверке 2012–2025 годов небольшая перестройка плана (не более 10 п. п. на культуру) дала по факту 1 788 руб. на гектар дополнительной прибыли и оказалась выгоднее текущего плана в 74 % случаев. Результаты доступны в прототипе — статическом сайте «Агрокаст».</w:t>
       </w:r>
     </w:p>
     <w:p>
@@ -187,7 +187,7 @@
       <w:pPr>
         <w:pStyle w:val="21"/>
       </w:pPr>
-      <w:bookmarkStart w:id="1" w:name="_Toc244072295"/>
+      <w:bookmarkStart w:id="1" w:name="_Toc244072819"/>
       <w:r>
         <w:t>Ключевые цифры</w:t>
       </w:r>
@@ -546,7 +546,7 @@
       <w:r>
         <w:fldChar w:fldCharType="separate"/>
       </w:r>
-      <w:hyperlink w:anchor="_Toc244072294" w:history="1">
+      <w:hyperlink w:anchor="_Toc244072818" w:history="1">
         <w:r>
           <w:rPr>
             <w:rStyle w:val="aff8"/>
@@ -573,7 +573,7 @@
             <w:noProof/>
             <w:webHidden/>
           </w:rPr>
-          <w:instrText xml:space="preserve"> PAGEREF _Toc244072294 \h </w:instrText>
+          <w:instrText xml:space="preserve"> PAGEREF _Toc244072818 \h </w:instrText>
         </w:r>
         <w:r>
           <w:rPr>
@@ -620,7 +620,7 @@
           <w14:ligatures w14:val="standardContextual"/>
         </w:rPr>
       </w:pPr>
-      <w:hyperlink w:anchor="_Toc244072295" w:history="1">
+      <w:hyperlink w:anchor="_Toc244072819" w:history="1">
         <w:r>
           <w:rPr>
             <w:rStyle w:val="aff8"/>
@@ -647,7 +647,7 @@
             <w:noProof/>
             <w:webHidden/>
           </w:rPr>
-          <w:instrText xml:space="preserve"> PAGEREF _Toc244072295 \h </w:instrText>
+          <w:instrText xml:space="preserve"> PAGEREF _Toc244072819 \h </w:instrText>
         </w:r>
         <w:r>
           <w:rPr>
@@ -694,7 +694,7 @@
           <w14:ligatures w14:val="standardContextual"/>
         </w:rPr>
       </w:pPr>
-      <w:hyperlink w:anchor="_Toc244072296" w:history="1">
+      <w:hyperlink w:anchor="_Toc244072820" w:history="1">
         <w:r>
           <w:rPr>
             <w:rStyle w:val="aff8"/>
@@ -721,7 +721,7 @@
             <w:noProof/>
             <w:webHidden/>
           </w:rPr>
-          <w:instrText xml:space="preserve"> PAGEREF _Toc244072296 \h </w:instrText>
+          <w:instrText xml:space="preserve"> PAGEREF _Toc244072820 \h </w:instrText>
         </w:r>
         <w:r>
           <w:rPr>
@@ -768,7 +768,7 @@
           <w14:ligatures w14:val="standardContextual"/>
         </w:rPr>
       </w:pPr>
-      <w:hyperlink w:anchor="_Toc244072297" w:history="1">
+      <w:hyperlink w:anchor="_Toc244072821" w:history="1">
         <w:r>
           <w:rPr>
             <w:rStyle w:val="aff8"/>
@@ -795,7 +795,7 @@
             <w:noProof/>
             <w:webHidden/>
           </w:rPr>
-          <w:instrText xml:space="preserve"> PAGEREF _Toc244072297 \h </w:instrText>
+          <w:instrText xml:space="preserve"> PAGEREF _Toc244072821 \h </w:instrText>
         </w:r>
         <w:r>
           <w:rPr>
@@ -842,7 +842,7 @@
           <w14:ligatures w14:val="standardContextual"/>
         </w:rPr>
       </w:pPr>
-      <w:hyperlink w:anchor="_Toc244072298" w:history="1">
+      <w:hyperlink w:anchor="_Toc244072822" w:history="1">
         <w:r>
           <w:rPr>
             <w:rStyle w:val="aff8"/>
@@ -869,7 +869,7 @@
             <w:noProof/>
             <w:webHidden/>
           </w:rPr>
-          <w:instrText xml:space="preserve"> PAGEREF _Toc244072298 \h </w:instrText>
+          <w:instrText xml:space="preserve"> PAGEREF _Toc244072822 \h </w:instrText>
         </w:r>
         <w:r>
           <w:rPr>
@@ -916,7 +916,7 @@
           <w14:ligatures w14:val="standardContextual"/>
         </w:rPr>
       </w:pPr>
-      <w:hyperlink w:anchor="_Toc244072299" w:history="1">
+      <w:hyperlink w:anchor="_Toc244072823" w:history="1">
         <w:r>
           <w:rPr>
             <w:rStyle w:val="aff8"/>
@@ -943,7 +943,7 @@
             <w:noProof/>
             <w:webHidden/>
           </w:rPr>
-          <w:instrText xml:space="preserve"> PAGEREF _Toc244072299 \h </w:instrText>
+          <w:instrText xml:space="preserve"> PAGEREF _Toc244072823 \h </w:instrText>
         </w:r>
         <w:r>
           <w:rPr>
@@ -990,7 +990,7 @@
           <w14:ligatures w14:val="standardContextual"/>
         </w:rPr>
       </w:pPr>
-      <w:hyperlink w:anchor="_Toc244072300" w:history="1">
+      <w:hyperlink w:anchor="_Toc244072824" w:history="1">
         <w:r>
           <w:rPr>
             <w:rStyle w:val="aff8"/>
@@ -1017,7 +1017,7 @@
             <w:noProof/>
             <w:webHidden/>
           </w:rPr>
-          <w:instrText xml:space="preserve"> PAGEREF _Toc244072300 \h </w:instrText>
+          <w:instrText xml:space="preserve"> PAGEREF _Toc244072824 \h </w:instrText>
         </w:r>
         <w:r>
           <w:rPr>
@@ -1064,7 +1064,7 @@
           <w14:ligatures w14:val="standardContextual"/>
         </w:rPr>
       </w:pPr>
-      <w:hyperlink w:anchor="_Toc244072301" w:history="1">
+      <w:hyperlink w:anchor="_Toc244072825" w:history="1">
         <w:r>
           <w:rPr>
             <w:rStyle w:val="aff8"/>
@@ -1091,7 +1091,7 @@
             <w:noProof/>
             <w:webHidden/>
           </w:rPr>
-          <w:instrText xml:space="preserve"> PAGEREF _Toc244072301 \h </w:instrText>
+          <w:instrText xml:space="preserve"> PAGEREF _Toc244072825 \h </w:instrText>
         </w:r>
         <w:r>
           <w:rPr>
@@ -1138,7 +1138,7 @@
           <w14:ligatures w14:val="standardContextual"/>
         </w:rPr>
       </w:pPr>
-      <w:hyperlink w:anchor="_Toc244072302" w:history="1">
+      <w:hyperlink w:anchor="_Toc244072826" w:history="1">
         <w:r>
           <w:rPr>
             <w:rStyle w:val="aff8"/>
@@ -1165,7 +1165,7 @@
             <w:noProof/>
             <w:webHidden/>
           </w:rPr>
-          <w:instrText xml:space="preserve"> PAGEREF _Toc244072302 \h </w:instrText>
+          <w:instrText xml:space="preserve"> PAGEREF _Toc244072826 \h </w:instrText>
         </w:r>
         <w:r>
           <w:rPr>
@@ -1212,7 +1212,7 @@
           <w14:ligatures w14:val="standardContextual"/>
         </w:rPr>
       </w:pPr>
-      <w:hyperlink w:anchor="_Toc244072303" w:history="1">
+      <w:hyperlink w:anchor="_Toc244072827" w:history="1">
         <w:r>
           <w:rPr>
             <w:rStyle w:val="aff8"/>
@@ -1239,7 +1239,7 @@
             <w:noProof/>
             <w:webHidden/>
           </w:rPr>
-          <w:instrText xml:space="preserve"> PAGEREF _Toc244072303 \h </w:instrText>
+          <w:instrText xml:space="preserve"> PAGEREF _Toc244072827 \h </w:instrText>
         </w:r>
         <w:r>
           <w:rPr>
@@ -1286,7 +1286,7 @@
           <w14:ligatures w14:val="standardContextual"/>
         </w:rPr>
       </w:pPr>
-      <w:hyperlink w:anchor="_Toc244072304" w:history="1">
+      <w:hyperlink w:anchor="_Toc244072828" w:history="1">
         <w:r>
           <w:rPr>
             <w:rStyle w:val="aff8"/>
@@ -1313,7 +1313,7 @@
             <w:noProof/>
             <w:webHidden/>
           </w:rPr>
-          <w:instrText xml:space="preserve"> PAGEREF _Toc244072304 \h </w:instrText>
+          <w:instrText xml:space="preserve"> PAGEREF _Toc244072828 \h </w:instrText>
         </w:r>
         <w:r>
           <w:rPr>
@@ -1360,7 +1360,7 @@
           <w14:ligatures w14:val="standardContextual"/>
         </w:rPr>
       </w:pPr>
-      <w:hyperlink w:anchor="_Toc244072305" w:history="1">
+      <w:hyperlink w:anchor="_Toc244072829" w:history="1">
         <w:r>
           <w:rPr>
             <w:rStyle w:val="aff8"/>
@@ -1387,7 +1387,7 @@
             <w:noProof/>
             <w:webHidden/>
           </w:rPr>
-          <w:instrText xml:space="preserve"> PAGEREF _Toc244072305 \h </w:instrText>
+          <w:instrText xml:space="preserve"> PAGEREF _Toc244072829 \h </w:instrText>
         </w:r>
         <w:r>
           <w:rPr>
@@ -1434,7 +1434,7 @@
           <w14:ligatures w14:val="standardContextual"/>
         </w:rPr>
       </w:pPr>
-      <w:hyperlink w:anchor="_Toc244072306" w:history="1">
+      <w:hyperlink w:anchor="_Toc244072830" w:history="1">
         <w:r>
           <w:rPr>
             <w:rStyle w:val="aff8"/>
@@ -1461,7 +1461,7 @@
             <w:noProof/>
             <w:webHidden/>
           </w:rPr>
-          <w:instrText xml:space="preserve"> PAGEREF _Toc244072306 \h </w:instrText>
+          <w:instrText xml:space="preserve"> PAGEREF _Toc244072830 \h </w:instrText>
         </w:r>
         <w:r>
           <w:rPr>
@@ -1508,7 +1508,7 @@
           <w14:ligatures w14:val="standardContextual"/>
         </w:rPr>
       </w:pPr>
-      <w:hyperlink w:anchor="_Toc244072307" w:history="1">
+      <w:hyperlink w:anchor="_Toc244072831" w:history="1">
         <w:r>
           <w:rPr>
             <w:rStyle w:val="aff8"/>
@@ -1535,7 +1535,7 @@
             <w:noProof/>
             <w:webHidden/>
           </w:rPr>
-          <w:instrText xml:space="preserve"> PAGEREF _Toc244072307 \h </w:instrText>
+          <w:instrText xml:space="preserve"> PAGEREF _Toc244072831 \h </w:instrText>
         </w:r>
         <w:r>
           <w:rPr>
@@ -1582,7 +1582,7 @@
           <w14:ligatures w14:val="standardContextual"/>
         </w:rPr>
       </w:pPr>
-      <w:hyperlink w:anchor="_Toc244072308" w:history="1">
+      <w:hyperlink w:anchor="_Toc244072832" w:history="1">
         <w:r>
           <w:rPr>
             <w:rStyle w:val="aff8"/>
@@ -1609,7 +1609,7 @@
             <w:noProof/>
             <w:webHidden/>
           </w:rPr>
-          <w:instrText xml:space="preserve"> PAGEREF _Toc244072308 \h </w:instrText>
+          <w:instrText xml:space="preserve"> PAGEREF _Toc244072832 \h </w:instrText>
         </w:r>
         <w:r>
           <w:rPr>
@@ -1656,7 +1656,7 @@
           <w14:ligatures w14:val="standardContextual"/>
         </w:rPr>
       </w:pPr>
-      <w:hyperlink w:anchor="_Toc244072309" w:history="1">
+      <w:hyperlink w:anchor="_Toc244072833" w:history="1">
         <w:r>
           <w:rPr>
             <w:rStyle w:val="aff8"/>
@@ -1683,7 +1683,7 @@
             <w:noProof/>
             <w:webHidden/>
           </w:rPr>
-          <w:instrText xml:space="preserve"> PAGEREF _Toc244072309 \h </w:instrText>
+          <w:instrText xml:space="preserve"> PAGEREF _Toc244072833 \h </w:instrText>
         </w:r>
         <w:r>
           <w:rPr>
@@ -1730,7 +1730,7 @@
           <w14:ligatures w14:val="standardContextual"/>
         </w:rPr>
       </w:pPr>
-      <w:hyperlink w:anchor="_Toc244072310" w:history="1">
+      <w:hyperlink w:anchor="_Toc244072834" w:history="1">
         <w:r>
           <w:rPr>
             <w:rStyle w:val="aff8"/>
@@ -1757,7 +1757,7 @@
             <w:noProof/>
             <w:webHidden/>
           </w:rPr>
-          <w:instrText xml:space="preserve"> PAGEREF _Toc244072310 \h </w:instrText>
+          <w:instrText xml:space="preserve"> PAGEREF _Toc244072834 \h </w:instrText>
         </w:r>
         <w:r>
           <w:rPr>
@@ -1804,7 +1804,7 @@
           <w14:ligatures w14:val="standardContextual"/>
         </w:rPr>
       </w:pPr>
-      <w:hyperlink w:anchor="_Toc244072311" w:history="1">
+      <w:hyperlink w:anchor="_Toc244072835" w:history="1">
         <w:r>
           <w:rPr>
             <w:rStyle w:val="aff8"/>
@@ -1831,7 +1831,7 @@
             <w:noProof/>
             <w:webHidden/>
           </w:rPr>
-          <w:instrText xml:space="preserve"> PAGEREF _Toc244072311 \h </w:instrText>
+          <w:instrText xml:space="preserve"> PAGEREF _Toc244072835 \h </w:instrText>
         </w:r>
         <w:r>
           <w:rPr>
@@ -1878,7 +1878,7 @@
           <w14:ligatures w14:val="standardContextual"/>
         </w:rPr>
       </w:pPr>
-      <w:hyperlink w:anchor="_Toc244072312" w:history="1">
+      <w:hyperlink w:anchor="_Toc244072836" w:history="1">
         <w:r>
           <w:rPr>
             <w:rStyle w:val="aff8"/>
@@ -1905,7 +1905,7 @@
             <w:noProof/>
             <w:webHidden/>
           </w:rPr>
-          <w:instrText xml:space="preserve"> PAGEREF _Toc244072312 \h </w:instrText>
+          <w:instrText xml:space="preserve"> PAGEREF _Toc244072836 \h </w:instrText>
         </w:r>
         <w:r>
           <w:rPr>
@@ -1952,7 +1952,7 @@
           <w14:ligatures w14:val="standardContextual"/>
         </w:rPr>
       </w:pPr>
-      <w:hyperlink w:anchor="_Toc244072313" w:history="1">
+      <w:hyperlink w:anchor="_Toc244072837" w:history="1">
         <w:r>
           <w:rPr>
             <w:rStyle w:val="aff8"/>
@@ -1979,7 +1979,7 @@
             <w:noProof/>
             <w:webHidden/>
           </w:rPr>
-          <w:instrText xml:space="preserve"> PAGEREF _Toc244072313 \h </w:instrText>
+          <w:instrText xml:space="preserve"> PAGEREF _Toc244072837 \h </w:instrText>
         </w:r>
         <w:r>
           <w:rPr>
@@ -2026,7 +2026,7 @@
           <w14:ligatures w14:val="standardContextual"/>
         </w:rPr>
       </w:pPr>
-      <w:hyperlink w:anchor="_Toc244072314" w:history="1">
+      <w:hyperlink w:anchor="_Toc244072838" w:history="1">
         <w:r>
           <w:rPr>
             <w:rStyle w:val="aff8"/>
@@ -2053,7 +2053,7 @@
             <w:noProof/>
             <w:webHidden/>
           </w:rPr>
-          <w:instrText xml:space="preserve"> PAGEREF _Toc244072314 \h </w:instrText>
+          <w:instrText xml:space="preserve"> PAGEREF _Toc244072838 \h </w:instrText>
         </w:r>
         <w:r>
           <w:rPr>
@@ -2100,7 +2100,7 @@
           <w14:ligatures w14:val="standardContextual"/>
         </w:rPr>
       </w:pPr>
-      <w:hyperlink w:anchor="_Toc244072315" w:history="1">
+      <w:hyperlink w:anchor="_Toc244072839" w:history="1">
         <w:r>
           <w:rPr>
             <w:rStyle w:val="aff8"/>
@@ -2127,7 +2127,7 @@
             <w:noProof/>
             <w:webHidden/>
           </w:rPr>
-          <w:instrText xml:space="preserve"> PAGEREF _Toc244072315 \h </w:instrText>
+          <w:instrText xml:space="preserve"> PAGEREF _Toc244072839 \h </w:instrText>
         </w:r>
         <w:r>
           <w:rPr>
@@ -2174,7 +2174,7 @@
           <w14:ligatures w14:val="standardContextual"/>
         </w:rPr>
       </w:pPr>
-      <w:hyperlink w:anchor="_Toc244072316" w:history="1">
+      <w:hyperlink w:anchor="_Toc244072840" w:history="1">
         <w:r>
           <w:rPr>
             <w:rStyle w:val="aff8"/>
@@ -2201,7 +2201,7 @@
             <w:noProof/>
             <w:webHidden/>
           </w:rPr>
-          <w:instrText xml:space="preserve"> PAGEREF _Toc244072316 \h </w:instrText>
+          <w:instrText xml:space="preserve"> PAGEREF _Toc244072840 \h </w:instrText>
         </w:r>
         <w:r>
           <w:rPr>
@@ -2248,7 +2248,7 @@
           <w14:ligatures w14:val="standardContextual"/>
         </w:rPr>
       </w:pPr>
-      <w:hyperlink w:anchor="_Toc244072317" w:history="1">
+      <w:hyperlink w:anchor="_Toc244072841" w:history="1">
         <w:r>
           <w:rPr>
             <w:rStyle w:val="aff8"/>
@@ -2275,7 +2275,7 @@
             <w:noProof/>
             <w:webHidden/>
           </w:rPr>
-          <w:instrText xml:space="preserve"> PAGEREF _Toc244072317 \h </w:instrText>
+          <w:instrText xml:space="preserve"> PAGEREF _Toc244072841 \h </w:instrText>
         </w:r>
         <w:r>
           <w:rPr>
@@ -2322,7 +2322,7 @@
           <w14:ligatures w14:val="standardContextual"/>
         </w:rPr>
       </w:pPr>
-      <w:hyperlink w:anchor="_Toc244072318" w:history="1">
+      <w:hyperlink w:anchor="_Toc244072842" w:history="1">
         <w:r>
           <w:rPr>
             <w:rStyle w:val="aff8"/>
@@ -2349,7 +2349,7 @@
             <w:noProof/>
             <w:webHidden/>
           </w:rPr>
-          <w:instrText xml:space="preserve"> PAGEREF _Toc244072318 \h </w:instrText>
+          <w:instrText xml:space="preserve"> PAGEREF _Toc244072842 \h </w:instrText>
         </w:r>
         <w:r>
           <w:rPr>
@@ -2396,7 +2396,7 @@
           <w14:ligatures w14:val="standardContextual"/>
         </w:rPr>
       </w:pPr>
-      <w:hyperlink w:anchor="_Toc244072319" w:history="1">
+      <w:hyperlink w:anchor="_Toc244072843" w:history="1">
         <w:r>
           <w:rPr>
             <w:rStyle w:val="aff8"/>
@@ -2423,7 +2423,7 @@
             <w:noProof/>
             <w:webHidden/>
           </w:rPr>
-          <w:instrText xml:space="preserve"> PAGEREF _Toc244072319 \h </w:instrText>
+          <w:instrText xml:space="preserve"> PAGEREF _Toc244072843 \h </w:instrText>
         </w:r>
         <w:r>
           <w:rPr>
@@ -2470,7 +2470,7 @@
           <w14:ligatures w14:val="standardContextual"/>
         </w:rPr>
       </w:pPr>
-      <w:hyperlink w:anchor="_Toc244072320" w:history="1">
+      <w:hyperlink w:anchor="_Toc244072844" w:history="1">
         <w:r>
           <w:rPr>
             <w:rStyle w:val="aff8"/>
@@ -2497,7 +2497,7 @@
             <w:noProof/>
             <w:webHidden/>
           </w:rPr>
-          <w:instrText xml:space="preserve"> PAGEREF _Toc244072320 \h </w:instrText>
+          <w:instrText xml:space="preserve"> PAGEREF _Toc244072844 \h </w:instrText>
         </w:r>
         <w:r>
           <w:rPr>
@@ -2544,7 +2544,7 @@
           <w14:ligatures w14:val="standardContextual"/>
         </w:rPr>
       </w:pPr>
-      <w:hyperlink w:anchor="_Toc244072321" w:history="1">
+      <w:hyperlink w:anchor="_Toc244072845" w:history="1">
         <w:r>
           <w:rPr>
             <w:rStyle w:val="aff8"/>
@@ -2571,7 +2571,7 @@
             <w:noProof/>
             <w:webHidden/>
           </w:rPr>
-          <w:instrText xml:space="preserve"> PAGEREF _Toc244072321 \h </w:instrText>
+          <w:instrText xml:space="preserve"> PAGEREF _Toc244072845 \h </w:instrText>
         </w:r>
         <w:r>
           <w:rPr>
@@ -2618,7 +2618,7 @@
           <w14:ligatures w14:val="standardContextual"/>
         </w:rPr>
       </w:pPr>
-      <w:hyperlink w:anchor="_Toc244072322" w:history="1">
+      <w:hyperlink w:anchor="_Toc244072846" w:history="1">
         <w:r>
           <w:rPr>
             <w:rStyle w:val="aff8"/>
@@ -2645,7 +2645,7 @@
             <w:noProof/>
             <w:webHidden/>
           </w:rPr>
-          <w:instrText xml:space="preserve"> PAGEREF _Toc244072322 \h </w:instrText>
+          <w:instrText xml:space="preserve"> PAGEREF _Toc244072846 \h </w:instrText>
         </w:r>
         <w:r>
           <w:rPr>
@@ -2692,7 +2692,7 @@
           <w14:ligatures w14:val="standardContextual"/>
         </w:rPr>
       </w:pPr>
-      <w:hyperlink w:anchor="_Toc244072323" w:history="1">
+      <w:hyperlink w:anchor="_Toc244072847" w:history="1">
         <w:r>
           <w:rPr>
             <w:rStyle w:val="aff8"/>
@@ -2719,7 +2719,7 @@
             <w:noProof/>
             <w:webHidden/>
           </w:rPr>
-          <w:instrText xml:space="preserve"> PAGEREF _Toc244072323 \h </w:instrText>
+          <w:instrText xml:space="preserve"> PAGEREF _Toc244072847 \h </w:instrText>
         </w:r>
         <w:r>
           <w:rPr>
@@ -2766,7 +2766,7 @@
           <w14:ligatures w14:val="standardContextual"/>
         </w:rPr>
       </w:pPr>
-      <w:hyperlink w:anchor="_Toc244072324" w:history="1">
+      <w:hyperlink w:anchor="_Toc244072848" w:history="1">
         <w:r>
           <w:rPr>
             <w:rStyle w:val="aff8"/>
@@ -2793,7 +2793,7 @@
             <w:noProof/>
             <w:webHidden/>
           </w:rPr>
-          <w:instrText xml:space="preserve"> PAGEREF _Toc244072324 \h </w:instrText>
+          <w:instrText xml:space="preserve"> PAGEREF _Toc244072848 \h </w:instrText>
         </w:r>
         <w:r>
           <w:rPr>
@@ -2840,7 +2840,7 @@
           <w14:ligatures w14:val="standardContextual"/>
         </w:rPr>
       </w:pPr>
-      <w:hyperlink w:anchor="_Toc244072325" w:history="1">
+      <w:hyperlink w:anchor="_Toc244072849" w:history="1">
         <w:r>
           <w:rPr>
             <w:rStyle w:val="aff8"/>
@@ -2867,7 +2867,7 @@
             <w:noProof/>
             <w:webHidden/>
           </w:rPr>
-          <w:instrText xml:space="preserve"> PAGEREF _Toc244072325 \h </w:instrText>
+          <w:instrText xml:space="preserve"> PAGEREF _Toc244072849 \h </w:instrText>
         </w:r>
         <w:r>
           <w:rPr>
@@ -2914,7 +2914,7 @@
           <w14:ligatures w14:val="standardContextual"/>
         </w:rPr>
       </w:pPr>
-      <w:hyperlink w:anchor="_Toc244072326" w:history="1">
+      <w:hyperlink w:anchor="_Toc244072850" w:history="1">
         <w:r>
           <w:rPr>
             <w:rStyle w:val="aff8"/>
@@ -2941,7 +2941,7 @@
             <w:noProof/>
             <w:webHidden/>
           </w:rPr>
-          <w:instrText xml:space="preserve"> PAGEREF _Toc244072326 \h </w:instrText>
+          <w:instrText xml:space="preserve"> PAGEREF _Toc244072850 \h </w:instrText>
         </w:r>
         <w:r>
           <w:rPr>
@@ -2988,7 +2988,7 @@
           <w14:ligatures w14:val="standardContextual"/>
         </w:rPr>
       </w:pPr>
-      <w:hyperlink w:anchor="_Toc244072327" w:history="1">
+      <w:hyperlink w:anchor="_Toc244072851" w:history="1">
         <w:r>
           <w:rPr>
             <w:rStyle w:val="aff8"/>
@@ -3015,7 +3015,7 @@
             <w:noProof/>
             <w:webHidden/>
           </w:rPr>
-          <w:instrText xml:space="preserve"> PAGEREF _Toc244072327 \h </w:instrText>
+          <w:instrText xml:space="preserve"> PAGEREF _Toc244072851 \h </w:instrText>
         </w:r>
         <w:r>
           <w:rPr>
@@ -3062,7 +3062,7 @@
           <w14:ligatures w14:val="standardContextual"/>
         </w:rPr>
       </w:pPr>
-      <w:hyperlink w:anchor="_Toc244072328" w:history="1">
+      <w:hyperlink w:anchor="_Toc244072852" w:history="1">
         <w:r>
           <w:rPr>
             <w:rStyle w:val="aff8"/>
@@ -3089,7 +3089,7 @@
             <w:noProof/>
             <w:webHidden/>
           </w:rPr>
-          <w:instrText xml:space="preserve"> PAGEREF _Toc244072328 \h </w:instrText>
+          <w:instrText xml:space="preserve"> PAGEREF _Toc244072852 \h </w:instrText>
         </w:r>
         <w:r>
           <w:rPr>
@@ -3136,7 +3136,7 @@
           <w14:ligatures w14:val="standardContextual"/>
         </w:rPr>
       </w:pPr>
-      <w:hyperlink w:anchor="_Toc244072329" w:history="1">
+      <w:hyperlink w:anchor="_Toc244072853" w:history="1">
         <w:r>
           <w:rPr>
             <w:rStyle w:val="aff8"/>
@@ -3163,7 +3163,7 @@
             <w:noProof/>
             <w:webHidden/>
           </w:rPr>
-          <w:instrText xml:space="preserve"> PAGEREF _Toc244072329 \h </w:instrText>
+          <w:instrText xml:space="preserve"> PAGEREF _Toc244072853 \h </w:instrText>
         </w:r>
         <w:r>
           <w:rPr>
@@ -3210,7 +3210,7 @@
           <w14:ligatures w14:val="standardContextual"/>
         </w:rPr>
       </w:pPr>
-      <w:hyperlink w:anchor="_Toc244072330" w:history="1">
+      <w:hyperlink w:anchor="_Toc244072854" w:history="1">
         <w:r>
           <w:rPr>
             <w:rStyle w:val="aff8"/>
@@ -3237,7 +3237,7 @@
             <w:noProof/>
             <w:webHidden/>
           </w:rPr>
-          <w:instrText xml:space="preserve"> PAGEREF _Toc244072330 \h </w:instrText>
+          <w:instrText xml:space="preserve"> PAGEREF _Toc244072854 \h </w:instrText>
         </w:r>
         <w:r>
           <w:rPr>
@@ -3284,7 +3284,7 @@
           <w14:ligatures w14:val="standardContextual"/>
         </w:rPr>
       </w:pPr>
-      <w:hyperlink w:anchor="_Toc244072331" w:history="1">
+      <w:hyperlink w:anchor="_Toc244072855" w:history="1">
         <w:r>
           <w:rPr>
             <w:rStyle w:val="aff8"/>
@@ -3311,7 +3311,7 @@
             <w:noProof/>
             <w:webHidden/>
           </w:rPr>
-          <w:instrText xml:space="preserve"> PAGEREF _Toc244072331 \h </w:instrText>
+          <w:instrText xml:space="preserve"> PAGEREF _Toc244072855 \h </w:instrText>
         </w:r>
         <w:r>
           <w:rPr>
@@ -3358,7 +3358,7 @@
           <w14:ligatures w14:val="standardContextual"/>
         </w:rPr>
       </w:pPr>
-      <w:hyperlink w:anchor="_Toc244072332" w:history="1">
+      <w:hyperlink w:anchor="_Toc244072856" w:history="1">
         <w:r>
           <w:rPr>
             <w:rStyle w:val="aff8"/>
@@ -3385,7 +3385,7 @@
             <w:noProof/>
             <w:webHidden/>
           </w:rPr>
-          <w:instrText xml:space="preserve"> PAGEREF _Toc244072332 \h </w:instrText>
+          <w:instrText xml:space="preserve"> PAGEREF _Toc244072856 \h </w:instrText>
         </w:r>
         <w:r>
           <w:rPr>
@@ -3432,7 +3432,7 @@
           <w14:ligatures w14:val="standardContextual"/>
         </w:rPr>
       </w:pPr>
-      <w:hyperlink w:anchor="_Toc244072333" w:history="1">
+      <w:hyperlink w:anchor="_Toc244072857" w:history="1">
         <w:r>
           <w:rPr>
             <w:rStyle w:val="aff8"/>
@@ -3459,7 +3459,7 @@
             <w:noProof/>
             <w:webHidden/>
           </w:rPr>
-          <w:instrText xml:space="preserve"> PAGEREF _Toc244072333 \h </w:instrText>
+          <w:instrText xml:space="preserve"> PAGEREF _Toc244072857 \h </w:instrText>
         </w:r>
         <w:r>
           <w:rPr>
@@ -3506,7 +3506,7 @@
           <w14:ligatures w14:val="standardContextual"/>
         </w:rPr>
       </w:pPr>
-      <w:hyperlink w:anchor="_Toc244072334" w:history="1">
+      <w:hyperlink w:anchor="_Toc244072858" w:history="1">
         <w:r>
           <w:rPr>
             <w:rStyle w:val="aff8"/>
@@ -3533,7 +3533,7 @@
             <w:noProof/>
             <w:webHidden/>
           </w:rPr>
-          <w:instrText xml:space="preserve"> PAGEREF _Toc244072334 \h </w:instrText>
+          <w:instrText xml:space="preserve"> PAGEREF _Toc244072858 \h </w:instrText>
         </w:r>
         <w:r>
           <w:rPr>
@@ -3580,7 +3580,7 @@
           <w14:ligatures w14:val="standardContextual"/>
         </w:rPr>
       </w:pPr>
-      <w:hyperlink w:anchor="_Toc244072335" w:history="1">
+      <w:hyperlink w:anchor="_Toc244072859" w:history="1">
         <w:r>
           <w:rPr>
             <w:rStyle w:val="aff8"/>
@@ -3607,7 +3607,7 @@
             <w:noProof/>
             <w:webHidden/>
           </w:rPr>
-          <w:instrText xml:space="preserve"> PAGEREF _Toc244072335 \h </w:instrText>
+          <w:instrText xml:space="preserve"> PAGEREF _Toc244072859 \h </w:instrText>
         </w:r>
         <w:r>
           <w:rPr>
@@ -3654,7 +3654,7 @@
           <w14:ligatures w14:val="standardContextual"/>
         </w:rPr>
       </w:pPr>
-      <w:hyperlink w:anchor="_Toc244072336" w:history="1">
+      <w:hyperlink w:anchor="_Toc244072860" w:history="1">
         <w:r>
           <w:rPr>
             <w:rStyle w:val="aff8"/>
@@ -3681,7 +3681,7 @@
             <w:noProof/>
             <w:webHidden/>
           </w:rPr>
-          <w:instrText xml:space="preserve"> PAGEREF _Toc244072336 \h </w:instrText>
+          <w:instrText xml:space="preserve"> PAGEREF _Toc244072860 \h </w:instrText>
         </w:r>
         <w:r>
           <w:rPr>
@@ -3728,7 +3728,7 @@
           <w14:ligatures w14:val="standardContextual"/>
         </w:rPr>
       </w:pPr>
-      <w:hyperlink w:anchor="_Toc244072337" w:history="1">
+      <w:hyperlink w:anchor="_Toc244072861" w:history="1">
         <w:r>
           <w:rPr>
             <w:rStyle w:val="aff8"/>
@@ -3755,7 +3755,7 @@
             <w:noProof/>
             <w:webHidden/>
           </w:rPr>
-          <w:instrText xml:space="preserve"> PAGEREF _Toc244072337 \h </w:instrText>
+          <w:instrText xml:space="preserve"> PAGEREF _Toc244072861 \h </w:instrText>
         </w:r>
         <w:r>
           <w:rPr>
@@ -3802,7 +3802,7 @@
           <w14:ligatures w14:val="standardContextual"/>
         </w:rPr>
       </w:pPr>
-      <w:hyperlink w:anchor="_Toc244072338" w:history="1">
+      <w:hyperlink w:anchor="_Toc244072862" w:history="1">
         <w:r>
           <w:rPr>
             <w:rStyle w:val="aff8"/>
@@ -3829,7 +3829,7 @@
             <w:noProof/>
             <w:webHidden/>
           </w:rPr>
-          <w:instrText xml:space="preserve"> PAGEREF _Toc244072338 \h </w:instrText>
+          <w:instrText xml:space="preserve"> PAGEREF _Toc244072862 \h </w:instrText>
         </w:r>
         <w:r>
           <w:rPr>
@@ -3876,7 +3876,7 @@
           <w14:ligatures w14:val="standardContextual"/>
         </w:rPr>
       </w:pPr>
-      <w:hyperlink w:anchor="_Toc244072339" w:history="1">
+      <w:hyperlink w:anchor="_Toc244072863" w:history="1">
         <w:r>
           <w:rPr>
             <w:rStyle w:val="aff8"/>
@@ -3903,7 +3903,7 @@
             <w:noProof/>
             <w:webHidden/>
           </w:rPr>
-          <w:instrText xml:space="preserve"> PAGEREF _Toc244072339 \h </w:instrText>
+          <w:instrText xml:space="preserve"> PAGEREF _Toc244072863 \h </w:instrText>
         </w:r>
         <w:r>
           <w:rPr>
@@ -3950,7 +3950,7 @@
           <w14:ligatures w14:val="standardContextual"/>
         </w:rPr>
       </w:pPr>
-      <w:hyperlink w:anchor="_Toc244072340" w:history="1">
+      <w:hyperlink w:anchor="_Toc244072864" w:history="1">
         <w:r>
           <w:rPr>
             <w:rStyle w:val="aff8"/>
@@ -3977,7 +3977,7 @@
             <w:noProof/>
             <w:webHidden/>
           </w:rPr>
-          <w:instrText xml:space="preserve"> PAGEREF _Toc244072340 \h </w:instrText>
+          <w:instrText xml:space="preserve"> PAGEREF _Toc244072864 \h </w:instrText>
         </w:r>
         <w:r>
           <w:rPr>
@@ -4024,7 +4024,7 @@
           <w14:ligatures w14:val="standardContextual"/>
         </w:rPr>
       </w:pPr>
-      <w:hyperlink w:anchor="_Toc244072341" w:history="1">
+      <w:hyperlink w:anchor="_Toc244072865" w:history="1">
         <w:r>
           <w:rPr>
             <w:rStyle w:val="aff8"/>
@@ -4051,7 +4051,7 @@
             <w:noProof/>
             <w:webHidden/>
           </w:rPr>
-          <w:instrText xml:space="preserve"> PAGEREF _Toc244072341 \h </w:instrText>
+          <w:instrText xml:space="preserve"> PAGEREF _Toc244072865 \h </w:instrText>
         </w:r>
         <w:r>
           <w:rPr>
@@ -4098,7 +4098,7 @@
           <w14:ligatures w14:val="standardContextual"/>
         </w:rPr>
       </w:pPr>
-      <w:hyperlink w:anchor="_Toc244072342" w:history="1">
+      <w:hyperlink w:anchor="_Toc244072866" w:history="1">
         <w:r>
           <w:rPr>
             <w:rStyle w:val="aff8"/>
@@ -4125,7 +4125,7 @@
             <w:noProof/>
             <w:webHidden/>
           </w:rPr>
-          <w:instrText xml:space="preserve"> PAGEREF _Toc244072342 \h </w:instrText>
+          <w:instrText xml:space="preserve"> PAGEREF _Toc244072866 \h </w:instrText>
         </w:r>
         <w:r>
           <w:rPr>
@@ -4172,7 +4172,7 @@
           <w14:ligatures w14:val="standardContextual"/>
         </w:rPr>
       </w:pPr>
-      <w:hyperlink w:anchor="_Toc244072343" w:history="1">
+      <w:hyperlink w:anchor="_Toc244072867" w:history="1">
         <w:r>
           <w:rPr>
             <w:rStyle w:val="aff8"/>
@@ -4199,7 +4199,7 @@
             <w:noProof/>
             <w:webHidden/>
           </w:rPr>
-          <w:instrText xml:space="preserve"> PAGEREF _Toc244072343 \h </w:instrText>
+          <w:instrText xml:space="preserve"> PAGEREF _Toc244072867 \h </w:instrText>
         </w:r>
         <w:r>
           <w:rPr>
@@ -4246,7 +4246,7 @@
           <w14:ligatures w14:val="standardContextual"/>
         </w:rPr>
       </w:pPr>
-      <w:hyperlink w:anchor="_Toc244072344" w:history="1">
+      <w:hyperlink w:anchor="_Toc244072868" w:history="1">
         <w:r>
           <w:rPr>
             <w:rStyle w:val="aff8"/>
@@ -4273,7 +4273,7 @@
             <w:noProof/>
             <w:webHidden/>
           </w:rPr>
-          <w:instrText xml:space="preserve"> PAGEREF _Toc244072344 \h </w:instrText>
+          <w:instrText xml:space="preserve"> PAGEREF _Toc244072868 \h </w:instrText>
         </w:r>
         <w:r>
           <w:rPr>
@@ -4320,7 +4320,7 @@
           <w14:ligatures w14:val="standardContextual"/>
         </w:rPr>
       </w:pPr>
-      <w:hyperlink w:anchor="_Toc244072345" w:history="1">
+      <w:hyperlink w:anchor="_Toc244072869" w:history="1">
         <w:r>
           <w:rPr>
             <w:rStyle w:val="aff8"/>
@@ -4347,7 +4347,7 @@
             <w:noProof/>
             <w:webHidden/>
           </w:rPr>
-          <w:instrText xml:space="preserve"> PAGEREF _Toc244072345 \h </w:instrText>
+          <w:instrText xml:space="preserve"> PAGEREF _Toc244072869 \h </w:instrText>
         </w:r>
         <w:r>
           <w:rPr>
@@ -4394,7 +4394,7 @@
           <w14:ligatures w14:val="standardContextual"/>
         </w:rPr>
       </w:pPr>
-      <w:hyperlink w:anchor="_Toc244072346" w:history="1">
+      <w:hyperlink w:anchor="_Toc244072870" w:history="1">
         <w:r>
           <w:rPr>
             <w:rStyle w:val="aff8"/>
@@ -4421,7 +4421,7 @@
             <w:noProof/>
             <w:webHidden/>
           </w:rPr>
-          <w:instrText xml:space="preserve"> PAGEREF _Toc244072346 \h </w:instrText>
+          <w:instrText xml:space="preserve"> PAGEREF _Toc244072870 \h </w:instrText>
         </w:r>
         <w:r>
           <w:rPr>
@@ -4468,7 +4468,7 @@
           <w14:ligatures w14:val="standardContextual"/>
         </w:rPr>
       </w:pPr>
-      <w:hyperlink w:anchor="_Toc244072347" w:history="1">
+      <w:hyperlink w:anchor="_Toc244072871" w:history="1">
         <w:r>
           <w:rPr>
             <w:rStyle w:val="aff8"/>
@@ -4495,7 +4495,7 @@
             <w:noProof/>
             <w:webHidden/>
           </w:rPr>
-          <w:instrText xml:space="preserve"> PAGEREF _Toc244072347 \h </w:instrText>
+          <w:instrText xml:space="preserve"> PAGEREF _Toc244072871 \h </w:instrText>
         </w:r>
         <w:r>
           <w:rPr>
@@ -4542,7 +4542,7 @@
           <w14:ligatures w14:val="standardContextual"/>
         </w:rPr>
       </w:pPr>
-      <w:hyperlink w:anchor="_Toc244072348" w:history="1">
+      <w:hyperlink w:anchor="_Toc244072872" w:history="1">
         <w:r>
           <w:rPr>
             <w:rStyle w:val="aff8"/>
@@ -4569,7 +4569,7 @@
             <w:noProof/>
             <w:webHidden/>
           </w:rPr>
-          <w:instrText xml:space="preserve"> PAGEREF _Toc244072348 \h </w:instrText>
+          <w:instrText xml:space="preserve"> PAGEREF _Toc244072872 \h </w:instrText>
         </w:r>
         <w:r>
           <w:rPr>
@@ -4616,7 +4616,7 @@
           <w14:ligatures w14:val="standardContextual"/>
         </w:rPr>
       </w:pPr>
-      <w:hyperlink w:anchor="_Toc244072349" w:history="1">
+      <w:hyperlink w:anchor="_Toc244072873" w:history="1">
         <w:r>
           <w:rPr>
             <w:rStyle w:val="aff8"/>
@@ -4643,7 +4643,7 @@
             <w:noProof/>
             <w:webHidden/>
           </w:rPr>
-          <w:instrText xml:space="preserve"> PAGEREF _Toc244072349 \h </w:instrText>
+          <w:instrText xml:space="preserve"> PAGEREF _Toc244072873 \h </w:instrText>
         </w:r>
         <w:r>
           <w:rPr>
@@ -4663,7 +4663,7 @@
             <w:noProof/>
             <w:webHidden/>
           </w:rPr>
-          <w:t>28</w:t>
+          <w:t>29</w:t>
         </w:r>
         <w:r>
           <w:rPr>
@@ -4690,7 +4690,7 @@
           <w14:ligatures w14:val="standardContextual"/>
         </w:rPr>
       </w:pPr>
-      <w:hyperlink w:anchor="_Toc244072350" w:history="1">
+      <w:hyperlink w:anchor="_Toc244072874" w:history="1">
         <w:r>
           <w:rPr>
             <w:rStyle w:val="aff8"/>
@@ -4717,7 +4717,7 @@
             <w:noProof/>
             <w:webHidden/>
           </w:rPr>
-          <w:instrText xml:space="preserve"> PAGEREF _Toc244072350 \h </w:instrText>
+          <w:instrText xml:space="preserve"> PAGEREF _Toc244072874 \h </w:instrText>
         </w:r>
         <w:r>
           <w:rPr>
@@ -4764,7 +4764,7 @@
           <w14:ligatures w14:val="standardContextual"/>
         </w:rPr>
       </w:pPr>
-      <w:hyperlink w:anchor="_Toc244072351" w:history="1">
+      <w:hyperlink w:anchor="_Toc244072875" w:history="1">
         <w:r>
           <w:rPr>
             <w:rStyle w:val="aff8"/>
@@ -4791,7 +4791,7 @@
             <w:noProof/>
             <w:webHidden/>
           </w:rPr>
-          <w:instrText xml:space="preserve"> PAGEREF _Toc244072351 \h </w:instrText>
+          <w:instrText xml:space="preserve"> PAGEREF _Toc244072875 \h </w:instrText>
         </w:r>
         <w:r>
           <w:rPr>
@@ -4838,7 +4838,7 @@
           <w14:ligatures w14:val="standardContextual"/>
         </w:rPr>
       </w:pPr>
-      <w:hyperlink w:anchor="_Toc244072352" w:history="1">
+      <w:hyperlink w:anchor="_Toc244072876" w:history="1">
         <w:r>
           <w:rPr>
             <w:rStyle w:val="aff8"/>
@@ -4865,7 +4865,7 @@
             <w:noProof/>
             <w:webHidden/>
           </w:rPr>
-          <w:instrText xml:space="preserve"> PAGEREF _Toc244072352 \h </w:instrText>
+          <w:instrText xml:space="preserve"> PAGEREF _Toc244072876 \h </w:instrText>
         </w:r>
         <w:r>
           <w:rPr>
@@ -4912,7 +4912,7 @@
           <w14:ligatures w14:val="standardContextual"/>
         </w:rPr>
       </w:pPr>
-      <w:hyperlink w:anchor="_Toc244072353" w:history="1">
+      <w:hyperlink w:anchor="_Toc244072877" w:history="1">
         <w:r>
           <w:rPr>
             <w:rStyle w:val="aff8"/>
@@ -4939,7 +4939,7 @@
             <w:noProof/>
             <w:webHidden/>
           </w:rPr>
-          <w:instrText xml:space="preserve"> PAGEREF _Toc244072353 \h </w:instrText>
+          <w:instrText xml:space="preserve"> PAGEREF _Toc244072877 \h </w:instrText>
         </w:r>
         <w:r>
           <w:rPr>
@@ -4986,7 +4986,7 @@
           <w14:ligatures w14:val="standardContextual"/>
         </w:rPr>
       </w:pPr>
-      <w:hyperlink w:anchor="_Toc244072354" w:history="1">
+      <w:hyperlink w:anchor="_Toc244072878" w:history="1">
         <w:r>
           <w:rPr>
             <w:rStyle w:val="aff8"/>
@@ -5013,7 +5013,7 @@
             <w:noProof/>
             <w:webHidden/>
           </w:rPr>
-          <w:instrText xml:space="preserve"> PAGEREF _Toc244072354 \h </w:instrText>
+          <w:instrText xml:space="preserve"> PAGEREF _Toc244072878 \h </w:instrText>
         </w:r>
         <w:r>
           <w:rPr>
@@ -5060,7 +5060,7 @@
           <w14:ligatures w14:val="standardContextual"/>
         </w:rPr>
       </w:pPr>
-      <w:hyperlink w:anchor="_Toc244072355" w:history="1">
+      <w:hyperlink w:anchor="_Toc244072879" w:history="1">
         <w:r>
           <w:rPr>
             <w:rStyle w:val="aff8"/>
@@ -5087,7 +5087,7 @@
             <w:noProof/>
             <w:webHidden/>
           </w:rPr>
-          <w:instrText xml:space="preserve"> PAGEREF _Toc244072355 \h </w:instrText>
+          <w:instrText xml:space="preserve"> PAGEREF _Toc244072879 \h </w:instrText>
         </w:r>
         <w:r>
           <w:rPr>
@@ -5134,7 +5134,7 @@
           <w14:ligatures w14:val="standardContextual"/>
         </w:rPr>
       </w:pPr>
-      <w:hyperlink w:anchor="_Toc244072356" w:history="1">
+      <w:hyperlink w:anchor="_Toc244072880" w:history="1">
         <w:r>
           <w:rPr>
             <w:rStyle w:val="aff8"/>
@@ -5161,7 +5161,7 @@
             <w:noProof/>
             <w:webHidden/>
           </w:rPr>
-          <w:instrText xml:space="preserve"> PAGEREF _Toc244072356 \h </w:instrText>
+          <w:instrText xml:space="preserve"> PAGEREF _Toc244072880 \h </w:instrText>
         </w:r>
         <w:r>
           <w:rPr>
@@ -5208,7 +5208,7 @@
           <w14:ligatures w14:val="standardContextual"/>
         </w:rPr>
       </w:pPr>
-      <w:hyperlink w:anchor="_Toc244072357" w:history="1">
+      <w:hyperlink w:anchor="_Toc244072881" w:history="1">
         <w:r>
           <w:rPr>
             <w:rStyle w:val="aff8"/>
@@ -5235,7 +5235,7 @@
             <w:noProof/>
             <w:webHidden/>
           </w:rPr>
-          <w:instrText xml:space="preserve"> PAGEREF _Toc244072357 \h </w:instrText>
+          <w:instrText xml:space="preserve"> PAGEREF _Toc244072881 \h </w:instrText>
         </w:r>
         <w:r>
           <w:rPr>
@@ -5282,7 +5282,7 @@
           <w14:ligatures w14:val="standardContextual"/>
         </w:rPr>
       </w:pPr>
-      <w:hyperlink w:anchor="_Toc244072358" w:history="1">
+      <w:hyperlink w:anchor="_Toc244072882" w:history="1">
         <w:r>
           <w:rPr>
             <w:rStyle w:val="aff8"/>
@@ -5309,7 +5309,7 @@
             <w:noProof/>
             <w:webHidden/>
           </w:rPr>
-          <w:instrText xml:space="preserve"> PAGEREF _Toc244072358 \h </w:instrText>
+          <w:instrText xml:space="preserve"> PAGEREF _Toc244072882 \h </w:instrText>
         </w:r>
         <w:r>
           <w:rPr>
@@ -5356,7 +5356,7 @@
           <w14:ligatures w14:val="standardContextual"/>
         </w:rPr>
       </w:pPr>
-      <w:hyperlink w:anchor="_Toc244072359" w:history="1">
+      <w:hyperlink w:anchor="_Toc244072883" w:history="1">
         <w:r>
           <w:rPr>
             <w:rStyle w:val="aff8"/>
@@ -5383,7 +5383,7 @@
             <w:noProof/>
             <w:webHidden/>
           </w:rPr>
-          <w:instrText xml:space="preserve"> PAGEREF _Toc244072359 \h </w:instrText>
+          <w:instrText xml:space="preserve"> PAGEREF _Toc244072883 \h </w:instrText>
         </w:r>
         <w:r>
           <w:rPr>
@@ -5430,7 +5430,7 @@
           <w14:ligatures w14:val="standardContextual"/>
         </w:rPr>
       </w:pPr>
-      <w:hyperlink w:anchor="_Toc244072360" w:history="1">
+      <w:hyperlink w:anchor="_Toc244072884" w:history="1">
         <w:r>
           <w:rPr>
             <w:rStyle w:val="aff8"/>
@@ -5457,7 +5457,7 @@
             <w:noProof/>
             <w:webHidden/>
           </w:rPr>
-          <w:instrText xml:space="preserve"> PAGEREF _Toc244072360 \h </w:instrText>
+          <w:instrText xml:space="preserve"> PAGEREF _Toc244072884 \h </w:instrText>
         </w:r>
         <w:r>
           <w:rPr>
@@ -5505,7 +5505,7 @@
       <w:pPr>
         <w:pStyle w:val="1"/>
       </w:pPr>
-      <w:bookmarkStart w:id="2" w:name="_Toc244072296"/>
+      <w:bookmarkStart w:id="2" w:name="_Toc244072820"/>
       <w:r>
         <w:lastRenderedPageBreak/>
         <w:t>1. Введение и постановка задачи</w:t>
@@ -5516,7 +5516,7 @@
       <w:pPr>
         <w:pStyle w:val="21"/>
       </w:pPr>
-      <w:bookmarkStart w:id="3" w:name="_Toc244072297"/>
+      <w:bookmarkStart w:id="3" w:name="_Toc244072821"/>
       <w:r>
         <w:t>1.1. Кейс</w:t>
       </w:r>
@@ -5581,7 +5581,7 @@
       <w:pPr>
         <w:pStyle w:val="21"/>
       </w:pPr>
-      <w:bookmarkStart w:id="4" w:name="_Toc244072298"/>
+      <w:bookmarkStart w:id="4" w:name="_Toc244072822"/>
       <w:r>
         <w:t>1.2. Ценность для фермера и для банка</w:t>
       </w:r>
@@ -5619,7 +5619,7 @@
       <w:pPr>
         <w:pStyle w:val="21"/>
       </w:pPr>
-      <w:bookmarkStart w:id="5" w:name="_Toc244072299"/>
+      <w:bookmarkStart w:id="5" w:name="_Toc244072823"/>
       <w:r>
         <w:t>1.3. Что сделано</w:t>
       </w:r>
@@ -5689,7 +5689,7 @@
       <w:pPr>
         <w:pStyle w:val="21"/>
       </w:pPr>
-      <w:bookmarkStart w:id="6" w:name="_Toc244072300"/>
+      <w:bookmarkStart w:id="6" w:name="_Toc244072824"/>
       <w:r>
         <w:t>1.4. Уровень детализации</w:t>
       </w:r>
@@ -5716,7 +5716,7 @@
       <w:pPr>
         <w:pStyle w:val="1"/>
       </w:pPr>
-      <w:bookmarkStart w:id="7" w:name="_Toc244072301"/>
+      <w:bookmarkStart w:id="7" w:name="_Toc244072825"/>
       <w:r>
         <w:t>2. Обзор методов агропрогноза</w:t>
       </w:r>
@@ -5734,7 +5734,7 @@
       <w:pPr>
         <w:pStyle w:val="21"/>
       </w:pPr>
-      <w:bookmarkStart w:id="8" w:name="_Toc244072302"/>
+      <w:bookmarkStart w:id="8" w:name="_Toc244072826"/>
       <w:r>
         <w:t>2.1. Трендовые и статистические модели</w:t>
       </w:r>
@@ -5755,7 +5755,7 @@
       <w:pPr>
         <w:pStyle w:val="21"/>
       </w:pPr>
-      <w:bookmarkStart w:id="9" w:name="_Toc244072303"/>
+      <w:bookmarkStart w:id="9" w:name="_Toc244072827"/>
       <w:r>
         <w:t>2.2. Агрометеорологические методы Росгидромета</w:t>
       </w:r>
@@ -5776,7 +5776,7 @@
       <w:pPr>
         <w:pStyle w:val="21"/>
       </w:pPr>
-      <w:bookmarkStart w:id="10" w:name="_Toc244072304"/>
+      <w:bookmarkStart w:id="10" w:name="_Toc244072828"/>
       <w:r>
         <w:t>2.3. Процессные модели роста культур</w:t>
       </w:r>
@@ -5797,7 +5797,7 @@
       <w:pPr>
         <w:pStyle w:val="21"/>
       </w:pPr>
-      <w:bookmarkStart w:id="11" w:name="_Toc244072305"/>
+      <w:bookmarkStart w:id="11" w:name="_Toc244072829"/>
       <w:r>
         <w:lastRenderedPageBreak/>
         <w:t>2.4. Спутниковые методы</w:t>
@@ -5819,7 +5819,7 @@
       <w:pPr>
         <w:pStyle w:val="21"/>
       </w:pPr>
-      <w:bookmarkStart w:id="12" w:name="_Toc244072306"/>
+      <w:bookmarkStart w:id="12" w:name="_Toc244072830"/>
       <w:r>
         <w:t>2.5. Машинное обучение и гибридные схемы</w:t>
       </w:r>
@@ -5840,7 +5840,7 @@
       <w:pPr>
         <w:pStyle w:val="21"/>
       </w:pPr>
-      <w:bookmarkStart w:id="13" w:name="_Toc244072307"/>
+      <w:bookmarkStart w:id="13" w:name="_Toc244072831"/>
       <w:r>
         <w:t>2.6. Что из этого следует для решения</w:t>
       </w:r>
@@ -6648,7 +6648,7 @@
       <w:pPr>
         <w:pStyle w:val="1"/>
       </w:pPr>
-      <w:bookmarkStart w:id="14" w:name="_Toc244072308"/>
+      <w:bookmarkStart w:id="14" w:name="_Toc244072832"/>
       <w:r>
         <w:lastRenderedPageBreak/>
         <w:t>3. Данные</w:t>
@@ -6659,7 +6659,7 @@
       <w:pPr>
         <w:pStyle w:val="21"/>
       </w:pPr>
-      <w:bookmarkStart w:id="15" w:name="_Toc244072309"/>
+      <w:bookmarkStart w:id="15" w:name="_Toc244072833"/>
       <w:r>
         <w:t>3.1. Источники</w:t>
       </w:r>
@@ -8474,7 +8474,7 @@
         </w:rPr>
         <w:lastRenderedPageBreak/>
         <w:drawing>
-          <wp:inline distT="0" distB="0" distL="0" distR="0" wp14:anchorId="02339209" wp14:editId="0F760B22">
+          <wp:inline distT="0" distB="0" distL="0" distR="0" wp14:anchorId="0A93E58C" wp14:editId="66D9D358">
             <wp:extent cx="5719431" cy="3146518"/>
             <wp:effectExtent l="0" t="0" r="0" b="0"/>
             <wp:docPr id="1" name="Picture 1"/>
@@ -8528,7 +8528,7 @@
       <w:pPr>
         <w:pStyle w:val="21"/>
       </w:pPr>
-      <w:bookmarkStart w:id="16" w:name="_Toc244072310"/>
+      <w:bookmarkStart w:id="16" w:name="_Toc244072834"/>
       <w:r>
         <w:t>3.2. Покрытие</w:t>
       </w:r>
@@ -8553,7 +8553,7 @@
           <w:noProof/>
         </w:rPr>
         <w:drawing>
-          <wp:inline distT="0" distB="0" distL="0" distR="0" wp14:anchorId="3E95E31B" wp14:editId="173665CB">
+          <wp:inline distT="0" distB="0" distL="0" distR="0" wp14:anchorId="4D8DCC9B" wp14:editId="53EF36E4">
             <wp:extent cx="5832000" cy="2359011"/>
             <wp:effectExtent l="0" t="0" r="0" b="0"/>
             <wp:docPr id="2" name="Picture 2"/>
@@ -9595,7 +9595,7 @@
       <w:pPr>
         <w:pStyle w:val="21"/>
       </w:pPr>
-      <w:bookmarkStart w:id="17" w:name="_Toc244072311"/>
+      <w:bookmarkStart w:id="17" w:name="_Toc244072835"/>
       <w:r>
         <w:t>3.3. Архитектура данных</w:t>
       </w:r>
@@ -9620,7 +9620,7 @@
           <w:noProof/>
         </w:rPr>
         <w:drawing>
-          <wp:inline distT="0" distB="0" distL="0" distR="0" wp14:anchorId="1CEBCE34" wp14:editId="1D524FE0">
+          <wp:inline distT="0" distB="0" distL="0" distR="0" wp14:anchorId="1B19A7D7" wp14:editId="4248A2DF">
             <wp:extent cx="4630412" cy="2976099"/>
             <wp:effectExtent l="0" t="0" r="0" b="0"/>
             <wp:docPr id="3" name="Picture 3"/>
@@ -11146,7 +11146,7 @@
       <w:pPr>
         <w:pStyle w:val="1"/>
       </w:pPr>
-      <w:bookmarkStart w:id="18" w:name="_Toc244072312"/>
+      <w:bookmarkStart w:id="18" w:name="_Toc244072836"/>
       <w:r>
         <w:t>4. Предобработка и контроль качества</w:t>
       </w:r>
@@ -11156,7 +11156,7 @@
       <w:pPr>
         <w:pStyle w:val="21"/>
       </w:pPr>
-      <w:bookmarkStart w:id="19" w:name="_Toc244072313"/>
+      <w:bookmarkStart w:id="19" w:name="_Toc244072837"/>
       <w:r>
         <w:t>4.1. Чистка урожайности</w:t>
       </w:r>
@@ -12075,7 +12075,7 @@
       <w:pPr>
         <w:pStyle w:val="21"/>
       </w:pPr>
-      <w:bookmarkStart w:id="20" w:name="_Toc244072314"/>
+      <w:bookmarkStart w:id="20" w:name="_Toc244072838"/>
       <w:r>
         <w:t>4.2. Погода: из часов в признаки</w:t>
       </w:r>
@@ -12101,7 +12101,7 @@
       <w:pPr>
         <w:pStyle w:val="21"/>
       </w:pPr>
-      <w:bookmarkStart w:id="21" w:name="_Toc244072315"/>
+      <w:bookmarkStart w:id="21" w:name="_Toc244072839"/>
       <w:r>
         <w:t>4.3. Защита от утечки будущего</w:t>
       </w:r>
@@ -12199,7 +12199,7 @@
       <w:pPr>
         <w:pStyle w:val="21"/>
       </w:pPr>
-      <w:bookmarkStart w:id="22" w:name="_Toc244072316"/>
+      <w:bookmarkStart w:id="22" w:name="_Toc244072840"/>
       <w:r>
         <w:t>4.4. Автоматические тесты</w:t>
       </w:r>
@@ -12307,7 +12307,7 @@
       <w:pPr>
         <w:pStyle w:val="1"/>
       </w:pPr>
-      <w:bookmarkStart w:id="23" w:name="_Toc244072317"/>
+      <w:bookmarkStart w:id="23" w:name="_Toc244072841"/>
       <w:r>
         <w:t>5. Признаки</w:t>
       </w:r>
@@ -12335,7 +12335,7 @@
       <w:pPr>
         <w:pStyle w:val="21"/>
       </w:pPr>
-      <w:bookmarkStart w:id="24" w:name="_Toc244072318"/>
+      <w:bookmarkStart w:id="24" w:name="_Toc244072842"/>
       <w:r>
         <w:t>5.1. Погода по месяцам</w:t>
       </w:r>
@@ -12424,7 +12424,7 @@
           <w:noProof/>
         </w:rPr>
         <w:drawing>
-          <wp:inline distT="0" distB="0" distL="0" distR="0" wp14:anchorId="79CEF394" wp14:editId="13635F3E">
+          <wp:inline distT="0" distB="0" distL="0" distR="0" wp14:anchorId="779D0E97" wp14:editId="5F459EEE">
             <wp:extent cx="5652926" cy="2751644"/>
             <wp:effectExtent l="0" t="0" r="0" b="0"/>
             <wp:docPr id="4" name="Picture 4"/>
@@ -12487,7 +12487,7 @@
       <w:pPr>
         <w:pStyle w:val="21"/>
       </w:pPr>
-      <w:bookmarkStart w:id="25" w:name="_Toc244072319"/>
+      <w:bookmarkStart w:id="25" w:name="_Toc244072843"/>
       <w:r>
         <w:t>5.2. Окна культуры</w:t>
       </w:r>
@@ -12505,7 +12505,7 @@
       <w:pPr>
         <w:pStyle w:val="21"/>
       </w:pPr>
-      <w:bookmarkStart w:id="26" w:name="_Toc244072320"/>
+      <w:bookmarkStart w:id="26" w:name="_Toc244072844"/>
       <w:r>
         <w:t>5.3. Почвы и рельеф</w:t>
       </w:r>
@@ -12523,7 +12523,7 @@
       <w:pPr>
         <w:pStyle w:val="21"/>
       </w:pPr>
-      <w:bookmarkStart w:id="27" w:name="_Toc244072321"/>
+      <w:bookmarkStart w:id="27" w:name="_Toc244072845"/>
       <w:r>
         <w:t>5.4. Спутник</w:t>
       </w:r>
@@ -12541,7 +12541,7 @@
       <w:pPr>
         <w:pStyle w:val="21"/>
       </w:pPr>
-      <w:bookmarkStart w:id="28" w:name="_Toc244072322"/>
+      <w:bookmarkStart w:id="28" w:name="_Toc244072846"/>
       <w:r>
         <w:t>5.5. Регион и прошлые отклонения</w:t>
       </w:r>
@@ -12559,7 +12559,7 @@
       <w:pPr>
         <w:pStyle w:val="21"/>
       </w:pPr>
-      <w:bookmarkStart w:id="29" w:name="_Toc244072323"/>
+      <w:bookmarkStart w:id="29" w:name="_Toc244072847"/>
       <w:r>
         <w:t>5.6. Наборы признаков в эксперименте</w:t>
       </w:r>
@@ -13251,7 +13251,7 @@
       <w:pPr>
         <w:pStyle w:val="1"/>
       </w:pPr>
-      <w:bookmarkStart w:id="30" w:name="_Toc244072324"/>
+      <w:bookmarkStart w:id="30" w:name="_Toc244072848"/>
       <w:r>
         <w:lastRenderedPageBreak/>
         <w:t>6. Методология моделирования и проверки</w:t>
@@ -13262,7 +13262,7 @@
       <w:pPr>
         <w:pStyle w:val="21"/>
       </w:pPr>
-      <w:bookmarkStart w:id="31" w:name="_Toc244072325"/>
+      <w:bookmarkStart w:id="31" w:name="_Toc244072849"/>
       <w:r>
         <w:t>6.1. Модель «тренд × погода»</w:t>
       </w:r>
@@ -13340,7 +13340,7 @@
       <w:pPr>
         <w:pStyle w:val="21"/>
       </w:pPr>
-      <w:bookmarkStart w:id="32" w:name="_Toc244072326"/>
+      <w:bookmarkStart w:id="32" w:name="_Toc244072850"/>
       <w:r>
         <w:t>6.2. Даты прогноза</w:t>
       </w:r>
@@ -13358,7 +13358,7 @@
       <w:pPr>
         <w:pStyle w:val="21"/>
       </w:pPr>
-      <w:bookmarkStart w:id="33" w:name="_Toc244072327"/>
+      <w:bookmarkStart w:id="33" w:name="_Toc244072851"/>
       <w:r>
         <w:t>6.3. Скользящая проверка</w:t>
       </w:r>
@@ -13419,7 +13419,7 @@
       <w:pPr>
         <w:pStyle w:val="21"/>
       </w:pPr>
-      <w:bookmarkStart w:id="34" w:name="_Toc244072328"/>
+      <w:bookmarkStart w:id="34" w:name="_Toc244072852"/>
       <w:r>
         <w:t>6.4. Метрики и бейзлайны</w:t>
       </w:r>
@@ -13526,7 +13526,7 @@
       <w:pPr>
         <w:pStyle w:val="21"/>
       </w:pPr>
-      <w:bookmarkStart w:id="35" w:name="_Toc244072329"/>
+      <w:bookmarkStart w:id="35" w:name="_Toc244072853"/>
       <w:r>
         <w:t>6.5. Интервалы</w:t>
       </w:r>
@@ -13547,7 +13547,7 @@
       <w:pPr>
         <w:pStyle w:val="21"/>
       </w:pPr>
-      <w:bookmarkStart w:id="36" w:name="_Toc244072330"/>
+      <w:bookmarkStart w:id="36" w:name="_Toc244072854"/>
       <w:r>
         <w:t>6.6. Протокол перебора</w:t>
       </w:r>
@@ -14094,7 +14094,7 @@
       <w:pPr>
         <w:pStyle w:val="1"/>
       </w:pPr>
-      <w:bookmarkStart w:id="37" w:name="_Toc244072331"/>
+      <w:bookmarkStart w:id="37" w:name="_Toc244072855"/>
       <w:r>
         <w:t>7. Эксперименты</w:t>
       </w:r>
@@ -14112,7 +14112,7 @@
       <w:pPr>
         <w:pStyle w:val="21"/>
       </w:pPr>
-      <w:bookmarkStart w:id="38" w:name="_Toc244072332"/>
+      <w:bookmarkStart w:id="38" w:name="_Toc244072856"/>
       <w:r>
         <w:lastRenderedPageBreak/>
         <w:t>7.1. Первая модель</w:t>
@@ -14138,7 +14138,7 @@
           <w:noProof/>
         </w:rPr>
         <w:drawing>
-          <wp:inline distT="0" distB="0" distL="0" distR="0" wp14:anchorId="66498558" wp14:editId="2D8D672C">
+          <wp:inline distT="0" distB="0" distL="0" distR="0" wp14:anchorId="0CEEF5D8" wp14:editId="465A09BA">
             <wp:extent cx="5420159" cy="2826463"/>
             <wp:effectExtent l="0" t="0" r="0" b="0"/>
             <wp:docPr id="5" name="Picture 5"/>
@@ -14200,7 +14200,7 @@
       <w:pPr>
         <w:pStyle w:val="21"/>
       </w:pPr>
-      <w:bookmarkStart w:id="39" w:name="_Toc244072333"/>
+      <w:bookmarkStart w:id="39" w:name="_Toc244072857"/>
       <w:r>
         <w:t>7.2. Тренд и цель важнее модели</w:t>
       </w:r>
@@ -14225,7 +14225,7 @@
           <w:noProof/>
         </w:rPr>
         <w:drawing>
-          <wp:inline distT="0" distB="0" distL="0" distR="0" wp14:anchorId="24BBD389" wp14:editId="54AEEC5C">
+          <wp:inline distT="0" distB="0" distL="0" distR="0" wp14:anchorId="07340F7F" wp14:editId="73433654">
             <wp:extent cx="3666089" cy="2460686"/>
             <wp:effectExtent l="0" t="0" r="0" b="0"/>
             <wp:docPr id="6" name="Picture 6"/>
@@ -14300,7 +14300,7 @@
       <w:pPr>
         <w:pStyle w:val="21"/>
       </w:pPr>
-      <w:bookmarkStart w:id="40" w:name="_Toc244072334"/>
+      <w:bookmarkStart w:id="40" w:name="_Toc244072858"/>
       <w:r>
         <w:t>7.3. Какие признаки работают</w:t>
       </w:r>
@@ -14317,7 +14317,7 @@
           <w:noProof/>
         </w:rPr>
         <w:drawing>
-          <wp:inline distT="0" distB="0" distL="0" distR="0" wp14:anchorId="55AE6B19" wp14:editId="1F4F8A95">
+          <wp:inline distT="0" distB="0" distL="0" distR="0" wp14:anchorId="74882162" wp14:editId="2575A9F5">
             <wp:extent cx="5374437" cy="2664357"/>
             <wp:effectExtent l="0" t="0" r="0" b="0"/>
             <wp:docPr id="7" name="Picture 7"/>
@@ -14379,7 +14379,7 @@
       <w:pPr>
         <w:pStyle w:val="21"/>
       </w:pPr>
-      <w:bookmarkStart w:id="41" w:name="_Toc244072335"/>
+      <w:bookmarkStart w:id="41" w:name="_Toc244072859"/>
       <w:r>
         <w:t>7.4. Спутник: v1 против v2</w:t>
       </w:r>
@@ -14404,7 +14404,7 @@
           <w:noProof/>
         </w:rPr>
         <w:drawing>
-          <wp:inline distT="0" distB="0" distL="0" distR="0" wp14:anchorId="49842A34" wp14:editId="6E53EFF1">
+          <wp:inline distT="0" distB="0" distL="0" distR="0" wp14:anchorId="2E05F180" wp14:editId="350E78A4">
             <wp:extent cx="5374437" cy="2755802"/>
             <wp:effectExtent l="0" t="0" r="0" b="0"/>
             <wp:docPr id="8" name="Picture 8"/>
@@ -14478,7 +14478,7 @@
       <w:pPr>
         <w:pStyle w:val="21"/>
       </w:pPr>
-      <w:bookmarkStart w:id="42" w:name="_Toc244072336"/>
+      <w:bookmarkStart w:id="42" w:name="_Toc244072860"/>
       <w:r>
         <w:t>7.5. Модели и ансамбли</w:t>
       </w:r>
@@ -14495,7 +14495,7 @@
           <w:noProof/>
         </w:rPr>
         <w:drawing>
-          <wp:inline distT="0" distB="0" distL="0" distR="0" wp14:anchorId="2528F5B3" wp14:editId="2F66A553">
+          <wp:inline distT="0" distB="0" distL="0" distR="0" wp14:anchorId="07370DD0" wp14:editId="66199D0E">
             <wp:extent cx="5615517" cy="2631105"/>
             <wp:effectExtent l="0" t="0" r="0" b="0"/>
             <wp:docPr id="9" name="Picture 9"/>
@@ -15979,7 +15979,7 @@
       <w:pPr>
         <w:pStyle w:val="21"/>
       </w:pPr>
-      <w:bookmarkStart w:id="43" w:name="_Toc244072337"/>
+      <w:bookmarkStart w:id="43" w:name="_Toc244072861"/>
       <w:r>
         <w:t>7.6. Лесенка моделей: от наивной до лучшей</w:t>
       </w:r>
@@ -16094,7 +16094,7 @@
           <w:noProof/>
         </w:rPr>
         <w:drawing>
-          <wp:inline distT="0" distB="0" distL="0" distR="0" wp14:anchorId="0FE13E11" wp14:editId="4F16CEA4">
+          <wp:inline distT="0" distB="0" distL="0" distR="0" wp14:anchorId="7FAB20A3" wp14:editId="63100566">
             <wp:extent cx="4962937" cy="2365084"/>
             <wp:effectExtent l="0" t="0" r="0" b="0"/>
             <wp:docPr id="10" name="Picture 10"/>
@@ -16231,7 +16231,7 @@
         </w:rPr>
         <w:lastRenderedPageBreak/>
         <w:drawing>
-          <wp:inline distT="0" distB="0" distL="0" distR="0" wp14:anchorId="390259D2" wp14:editId="2A3CAAE0">
+          <wp:inline distT="0" distB="0" distL="0" distR="0" wp14:anchorId="78AC0161" wp14:editId="79BDD295">
             <wp:extent cx="5669553" cy="3167302"/>
             <wp:effectExtent l="0" t="0" r="0" b="0"/>
             <wp:docPr id="11" name="Picture 11"/>
@@ -17408,7 +17408,7 @@
           <w:noProof/>
         </w:rPr>
         <w:drawing>
-          <wp:inline distT="0" distB="0" distL="0" distR="0" wp14:anchorId="74742831" wp14:editId="2736D152">
+          <wp:inline distT="0" distB="0" distL="0" distR="0" wp14:anchorId="02449126" wp14:editId="1B810B64">
             <wp:extent cx="5071007" cy="2257014"/>
             <wp:effectExtent l="0" t="0" r="0" b="0"/>
             <wp:docPr id="12" name="Picture 12"/>
@@ -17470,7 +17470,7 @@
       <w:pPr>
         <w:pStyle w:val="21"/>
       </w:pPr>
-      <w:bookmarkStart w:id="44" w:name="_Toc244072338"/>
+      <w:bookmarkStart w:id="44" w:name="_Toc244072862"/>
       <w:r>
         <w:lastRenderedPageBreak/>
         <w:t>7.7. Прогноз по ходу сезона</w:t>
@@ -17488,7 +17488,7 @@
           <w:noProof/>
         </w:rPr>
         <w:drawing>
-          <wp:inline distT="0" distB="0" distL="0" distR="0" wp14:anchorId="7D08F174" wp14:editId="5B23F7F5">
+          <wp:inline distT="0" distB="0" distL="0" distR="0" wp14:anchorId="409EB1BB" wp14:editId="23151878">
             <wp:extent cx="5220644" cy="2489781"/>
             <wp:effectExtent l="0" t="0" r="0" b="0"/>
             <wp:docPr id="13" name="Picture 13"/>
@@ -17550,7 +17550,7 @@
       <w:pPr>
         <w:pStyle w:val="21"/>
       </w:pPr>
-      <w:bookmarkStart w:id="45" w:name="_Toc244072339"/>
+      <w:bookmarkStart w:id="45" w:name="_Toc244072863"/>
       <w:r>
         <w:t>7.8. Итоговые модели</w:t>
       </w:r>
@@ -18684,7 +18684,7 @@
       <w:pPr>
         <w:pStyle w:val="21"/>
       </w:pPr>
-      <w:bookmarkStart w:id="46" w:name="_Toc244072340"/>
+      <w:bookmarkStart w:id="46" w:name="_Toc244072864"/>
       <w:r>
         <w:lastRenderedPageBreak/>
         <w:t>7.9. Ошибка по годам</w:t>
@@ -18702,7 +18702,7 @@
           <w:noProof/>
         </w:rPr>
         <w:drawing>
-          <wp:inline distT="0" distB="0" distL="0" distR="0" wp14:anchorId="0DEC65EC" wp14:editId="410EC223">
+          <wp:inline distT="0" distB="0" distL="0" distR="0" wp14:anchorId="7B587CA5" wp14:editId="0CB2C9F8">
             <wp:extent cx="5374437" cy="2248700"/>
             <wp:effectExtent l="0" t="0" r="0" b="0"/>
             <wp:docPr id="14" name="Picture 14"/>
@@ -18771,7 +18771,7 @@
           <w:noProof/>
         </w:rPr>
         <w:drawing>
-          <wp:inline distT="0" distB="0" distL="0" distR="0" wp14:anchorId="6E3A836A" wp14:editId="55D07D61">
+          <wp:inline distT="0" distB="0" distL="0" distR="0" wp14:anchorId="41FAE4AB" wp14:editId="51234917">
             <wp:extent cx="5582265" cy="3254589"/>
             <wp:effectExtent l="0" t="0" r="0" b="0"/>
             <wp:docPr id="15" name="Picture 15"/>
@@ -18825,7 +18825,7 @@
       <w:pPr>
         <w:pStyle w:val="1"/>
       </w:pPr>
-      <w:bookmarkStart w:id="47" w:name="_Toc244072341"/>
+      <w:bookmarkStart w:id="47" w:name="_Toc244072865"/>
       <w:r>
         <w:t>8. Интерпретация и неопределённость</w:t>
       </w:r>
@@ -18835,7 +18835,7 @@
       <w:pPr>
         <w:pStyle w:val="21"/>
       </w:pPr>
-      <w:bookmarkStart w:id="48" w:name="_Toc244072342"/>
+      <w:bookmarkStart w:id="48" w:name="_Toc244072866"/>
       <w:r>
         <w:t>8.1. Что двигает прогноз: SHAP</w:t>
       </w:r>
@@ -18864,7 +18864,7 @@
           <w:noProof/>
         </w:rPr>
         <w:drawing>
-          <wp:inline distT="0" distB="0" distL="0" distR="0" wp14:anchorId="3A66E674" wp14:editId="18A3BF6B">
+          <wp:inline distT="0" distB="0" distL="0" distR="0" wp14:anchorId="51B7D072" wp14:editId="13C47E22">
             <wp:extent cx="5694492" cy="2938690"/>
             <wp:effectExtent l="0" t="0" r="0" b="0"/>
             <wp:docPr id="16" name="Picture 16"/>
@@ -18933,7 +18933,7 @@
           <w:noProof/>
         </w:rPr>
         <w:drawing>
-          <wp:inline distT="0" distB="0" distL="0" distR="0" wp14:anchorId="5CF32617" wp14:editId="77091F5D">
+          <wp:inline distT="0" distB="0" distL="0" distR="0" wp14:anchorId="74279439" wp14:editId="2D6E3F8D">
             <wp:extent cx="4604727" cy="3312000"/>
             <wp:effectExtent l="0" t="0" r="0" b="0"/>
             <wp:docPr id="17" name="Picture 17"/>
@@ -19060,7 +19060,7 @@
       <w:pPr>
         <w:pStyle w:val="21"/>
       </w:pPr>
-      <w:bookmarkStart w:id="49" w:name="_Toc244072343"/>
+      <w:bookmarkStart w:id="49" w:name="_Toc244072867"/>
       <w:r>
         <w:t>8.2. Насколько можно доверять интервалу</w:t>
       </w:r>
@@ -19077,7 +19077,7 @@
           <w:noProof/>
         </w:rPr>
         <w:drawing>
-          <wp:inline distT="0" distB="0" distL="0" distR="0" wp14:anchorId="340518EA" wp14:editId="429992AA">
+          <wp:inline distT="0" distB="0" distL="0" distR="0" wp14:anchorId="7988CCFA" wp14:editId="102C7AF9">
             <wp:extent cx="5374437" cy="2269483"/>
             <wp:effectExtent l="0" t="0" r="0" b="0"/>
             <wp:docPr id="18" name="Picture 18"/>
@@ -19150,7 +19150,7 @@
       <w:pPr>
         <w:pStyle w:val="21"/>
       </w:pPr>
-      <w:bookmarkStart w:id="50" w:name="_Toc244072344"/>
+      <w:bookmarkStart w:id="50" w:name="_Toc244072868"/>
       <w:r>
         <w:t>8.3. Прогноз на 2026 год</w:t>
       </w:r>
@@ -19176,7 +19176,7 @@
         </w:rPr>
         <w:lastRenderedPageBreak/>
         <w:drawing>
-          <wp:inline distT="0" distB="0" distL="0" distR="0" wp14:anchorId="189C4C71" wp14:editId="3F2D45DF">
+          <wp:inline distT="0" distB="0" distL="0" distR="0" wp14:anchorId="15766885" wp14:editId="7A94636C">
             <wp:extent cx="5827502" cy="2606166"/>
             <wp:effectExtent l="0" t="0" r="0" b="0"/>
             <wp:docPr id="19" name="Picture 19"/>
@@ -19241,7 +19241,7 @@
       <w:pPr>
         <w:pStyle w:val="1"/>
       </w:pPr>
-      <w:bookmarkStart w:id="51" w:name="_Toc244072345"/>
+      <w:bookmarkStart w:id="51" w:name="_Toc244072869"/>
       <w:r>
         <w:t>9. Оптимизация структуры посевов</w:t>
       </w:r>
@@ -19259,7 +19259,7 @@
       <w:pPr>
         <w:pStyle w:val="21"/>
       </w:pPr>
-      <w:bookmarkStart w:id="52" w:name="_Toc244072346"/>
+      <w:bookmarkStart w:id="52" w:name="_Toc244072870"/>
       <w:r>
         <w:t>9.1. Постановка</w:t>
       </w:r>
@@ -19288,7 +19288,10 @@
         <w:t>c</w:t>
       </w:r>
       <w:r>
-        <w:t xml:space="preserve"> = 1. Погодный сценарий s — это сезон с погодой одного из прошлых лет (2005–2024): урожайности всех культур региона в этом сценарии берутся как тренд, умноженный на отклонение этого года. Так сохраняется совместность: засуха бьёт по всем культурам сразу, но по-разному. Прибыль на гектар в сценарии s:</w:t>
+        <w:t xml:space="preserve"> = 1. Погодный сценарий s — это сезон 2026 года при погоде одного из 21</w:t>
+      </w:r>
+      <w:r>
+        <w:t xml:space="preserve"> прошлых сезонов-аналогов (2005–2025): урожайности всех культур региона в этом сценарии даёт итоговая модель «тренд × погода», на вход которой подаётся погода года s. Так сохраняется совместность: засуха бьёт по всем культурам сразу, но по-разному. Прибыль на гектар в сценарии s:</w:t>
       </w:r>
     </w:p>
     <w:p>
@@ -19351,7 +19354,15 @@
           <w:i/>
           <w:sz w:val="23"/>
         </w:rPr>
-        <w:t>maxx  (1 − λ) · E[π(x)] + λ · CVaRα(π(x))</w:t>
+        <w:t>maxx</w:t>
+      </w:r>
+      <w:r>
+        <w:rPr>
+          <w:rFonts w:ascii="Cambria Math" w:hAnsi="Cambria Math"/>
+          <w:i/>
+          <w:sz w:val="23"/>
+        </w:rPr>
+        <w:t xml:space="preserve">  (1 − λ) · E[π(x)] + λ · CVaRα(π(x))</w:t>
       </w:r>
     </w:p>
     <w:p>
@@ -19495,7 +19506,7 @@
       <w:pPr>
         <w:pStyle w:val="21"/>
       </w:pPr>
-      <w:bookmarkStart w:id="53" w:name="_Toc244072347"/>
+      <w:bookmarkStart w:id="53" w:name="_Toc244072871"/>
       <w:r>
         <w:t>9.2. Данные и допущения</w:t>
       </w:r>
@@ -20043,7 +20054,7 @@
       <w:pPr>
         <w:pStyle w:val="21"/>
       </w:pPr>
-      <w:bookmarkStart w:id="54" w:name="_Toc244072348"/>
+      <w:bookmarkStart w:id="54" w:name="_Toc244072872"/>
       <w:r>
         <w:t>9.3. Эффект малых изменений</w:t>
       </w:r>
@@ -20060,7 +20071,7 @@
           <w:noProof/>
         </w:rPr>
         <w:drawing>
-          <wp:inline distT="0" distB="0" distL="0" distR="0" wp14:anchorId="46DE460A" wp14:editId="5831D927">
+          <wp:inline distT="0" distB="0" distL="0" distR="0" wp14:anchorId="29B70D6A" wp14:editId="6E8A53A0">
             <wp:extent cx="5781780" cy="2398337"/>
             <wp:effectExtent l="0" t="0" r="0" b="0"/>
             <wp:docPr id="20" name="Picture 20"/>
@@ -20130,6 +20141,51 @@
         <w:ind w:firstLine="425"/>
       </w:pPr>
       <w:r>
+        <w:t>Эффект широкий, а не держится на нескольких регионах. При δ = 5 п. п. выигрыш есть у 97 % субъектов. Медиана по субъектам — +588 руб./га, верхний квартиль — +1 767 руб./га; в процентах к текущей прибыли (там, где она положительна) медиана +10 %. Каждый перенесённый гектар даёт около 14 100</w:t>
+      </w:r>
+      <w:r>
+        <w:t xml:space="preserve"> руб. в год — больше средней маржи гектара. Это и есть количественный ответ на идею «изменить план немного — получить заметный эффект».</w:t>
+      </w:r>
+    </w:p>
+    <w:p>
+      <w:pPr>
+        <w:ind w:firstLine="425"/>
+      </w:pPr>
+      <w:r>
+        <w:rPr>
+          <w:b/>
+        </w:rPr>
+        <w:t>Что сдерживает эффект.</w:t>
+      </w:r>
+      <w:r>
+        <w:t xml:space="preserve"> Не ошибка модели, а нормы севооборота. Без них прирост при δ = 10 п. п. был бы почти втрое больше — 340 против 119</w:t>
+      </w:r>
+      <w:r>
+        <w:t xml:space="preserve"> млрд руб. в год, — но ценой миллионов гектаров сахарной свёклы и подсолнечника сверх агрономических норм. Такой план был бы выгоден на бумаге и разрушителен для почвы. Обратный пример — Краснодарский край: самые маржинальные культуры там уже на пределе норм, и калькулятор честно отвечает «ваш план близок к лучшему».</w:t>
+      </w:r>
+    </w:p>
+    <w:p>
+      <w:pPr>
+        <w:ind w:firstLine="425"/>
+      </w:pPr>
+      <w:r>
+        <w:rPr>
+          <w:b/>
+        </w:rPr>
+        <w:t>Устойчивость к сценариям.</w:t>
+      </w:r>
+      <w:r>
+        <w:t xml:space="preserve"> Если вместо сценариев модели взять исторические отклонения урожайности, эффект при δ = 5 п. п. на тех же субъектах — 89 млрд руб. против 65</w:t>
+      </w:r>
+      <w:r>
+        <w:t xml:space="preserve"> млрд у модели. Порядок величины тот же. Сценарии модели уже по разбросу: они содержат только погодную часть колебаний, поэтому риск в основном расчёте скорее занижен.</w:t>
+      </w:r>
+    </w:p>
+    <w:p>
+      <w:pPr>
+        <w:ind w:firstLine="425"/>
+      </w:pPr>
+      <w:r>
         <w:t>Кривая вогнутая: первые проценты перестройки дают больше всего. При δ = 5 п. п. получается 27 % эффекта, достижимого при δ = 30 п. п., а при δ = 10 п. п. — 49 %. В сумме по субъектам план 2026 года с δ = 10 п. п. даёт +119 млрд руб. ожидаемой прибыли в год и +115 млрд руб. в худших 20 % сезонов; в среднем переносится 17</w:t>
       </w:r>
       <w:r>
@@ -21442,6 +21498,7 @@
         <w:ind w:firstLine="425"/>
       </w:pPr>
       <w:r>
+        <w:lastRenderedPageBreak/>
         <w:t>Типичная рекомендация — немного сократить озимую и яровую пшеницу в пользу кукурузы, сои и подсолнечника там, где это позволяет севооборот. Это культуры с большей маржой на гектар при текущих ценах. Регионы различаются: на Кубани план, наоборот, сокращает кукурузу и сою в пользу озимой пшеницы. Ограничения не дают уйти в монокультуру, а CVaR штрафует планы, которые проваливаются в засуху.</w:t>
       </w:r>
     </w:p>
@@ -21449,7 +21506,7 @@
       <w:pPr>
         <w:pStyle w:val="21"/>
       </w:pPr>
-      <w:bookmarkStart w:id="55" w:name="_Toc244072349"/>
+      <w:bookmarkStart w:id="55" w:name="_Toc244072873"/>
       <w:r>
         <w:t>9.4. Историческая проверка</w:t>
       </w:r>
@@ -21460,7 +21517,13 @@
         <w:ind w:firstLine="425"/>
       </w:pPr>
       <w:r>
-        <w:t>Главный вопрос к любой оптимизации — работает ли она на данных, которых не видела. Проверка устроена так же, как для прогноза: план на год t выбирается только по информации до t. Сценарии — отклонения прошлых лет, тренд — по годам до t, цены и затраты — года t − 1, текущий план — структура площадей t − 1. Результат считается по фактической урожайности и ценам года t. Всего 913 пар «субъект × год» за 2012–2025 годы.</w:t>
+        <w:t>Главный вопрос к любой оптимизации — работает ли она на данных, которых не видела. Проверка устроена так же, как для прогноза: план на год t выбирается только по информации до t. Прогон итоговой модели по прошлым годам использовал бы будущее (она обучена до 2025 года), поэтому в проверке сценарии строит исторический генератор: отклонения урожайности прошлых лет, тренд — по годам до t, цены и затраты — года t − 1, текущий план — структура площадей t − 1. Результат считается по фактической урожайности и ценам</w:t>
+      </w:r>
+      <w:r>
+        <w:t xml:space="preserve"> года t. Всего </w:t>
+      </w:r>
+      <w:r>
+        <w:t>913 пар «субъект × год» за 2012–2025 годы.</w:t>
       </w:r>
     </w:p>
     <w:p>
@@ -21473,9 +21536,8 @@
         <w:rPr>
           <w:noProof/>
         </w:rPr>
-        <w:lastRenderedPageBreak/>
         <w:drawing>
-          <wp:inline distT="0" distB="0" distL="0" distR="0" wp14:anchorId="0B64A01D" wp14:editId="2E5F1E13">
+          <wp:inline distT="0" distB="0" distL="0" distR="0" wp14:anchorId="4BB72333" wp14:editId="4BCE41F4">
             <wp:extent cx="5832000" cy="2554479"/>
             <wp:effectExtent l="0" t="0" r="0" b="0"/>
             <wp:docPr id="21" name="Picture 21"/>
@@ -22621,10 +22683,10 @@
         <w:pStyle w:val="a0"/>
       </w:pPr>
       <w:r>
-        <w:t>В плохие годы (худшие 20 % лет каждого субъекта) прибыль выросла с 4 669 до 6 288</w:t>
-      </w:r>
-      <w:r>
-        <w:t xml:space="preserve"> руб./га. Оптимизированный план не только зарабатывает больше в среднем, но и меньше теряет, когда погода подводит.</w:t>
+        <w:t>В плохие годы (худшие 20 % лет каждого субъекта) прибыль выросла с 4 669</w:t>
+      </w:r>
+      <w:r>
+        <w:t xml:space="preserve"> до 6 288 руб./га. Оптимизированный план не только зарабатывает больше в среднем, но и меньше теряет, когда погода подводит.</w:t>
       </w:r>
     </w:p>
     <w:p>
@@ -22632,6 +22694,7 @@
         <w:pStyle w:val="a0"/>
       </w:pPr>
       <w:r>
+        <w:lastRenderedPageBreak/>
         <w:t>Обещание систематически завышено примерно на 20 %. Это известное «проклятие оптимизатора»: выбирается план, который по оценке выглядит лучше, чем есть. Поэтому обещанные цифры стоит читать как верхнюю оценку.</w:t>
       </w:r>
     </w:p>
@@ -22663,9 +22726,8 @@
       <w:pPr>
         <w:pStyle w:val="21"/>
       </w:pPr>
-      <w:bookmarkStart w:id="56" w:name="_Toc244072350"/>
-      <w:r>
-        <w:lastRenderedPageBreak/>
+      <w:bookmarkStart w:id="56" w:name="_Toc244072874"/>
+      <w:r>
         <w:t>9.5. Чувствительность</w:t>
       </w:r>
       <w:bookmarkEnd w:id="56"/>
@@ -22681,7 +22743,7 @@
           <w:noProof/>
         </w:rPr>
         <w:drawing>
-          <wp:inline distT="0" distB="0" distL="0" distR="0" wp14:anchorId="121198D2" wp14:editId="48206291">
+          <wp:inline distT="0" distB="0" distL="0" distR="0" wp14:anchorId="42C51318" wp14:editId="1D7A5750">
             <wp:extent cx="5832000" cy="2514148"/>
             <wp:effectExtent l="0" t="0" r="0" b="0"/>
             <wp:docPr id="22" name="Picture 22"/>
@@ -22736,14 +22798,14 @@
         <w:ind w:firstLine="425"/>
       </w:pPr>
       <w:r>
-        <w:t>Сильнее всего эффект зависит от цены и затрат кукурузы — главного и самого хрупкого источника выигрыша: цена ±20 % меняет эффект от 119 до 221 млрд руб. в год. Далее идут цена и затраты озимой пшеницы и цена подсолнечника. Знак эффекта устойчив во всех вариантах. Поэтому в прототипе цены и затраты — параметры, которые пользователь задаёт сам. Рекомендация пересчитывается мгновенно.</w:t>
+        <w:t>Сильнее всего эффект зависит от экономики кукурузы и подсолнечника — культур, в которые переносится площадь: цена кукурузы ±20 % меняет эффект от 95 до 160 млрд руб. в год при базе 119 млрд. Знак эффекта устойчив во всех вариантах: минимум — 95 млрд руб. Вес риска λ почти не меняет результат: выгодные культуры обычно и менее рискованны. Поэтому в прототипе цены и затраты — параметры, которые пользователь задаёт сам, а рекомендация пересчитывается мгновенно.</w:t>
       </w:r>
     </w:p>
     <w:p>
       <w:pPr>
         <w:pStyle w:val="1"/>
       </w:pPr>
-      <w:bookmarkStart w:id="57" w:name="_Toc244072351"/>
+      <w:bookmarkStart w:id="57" w:name="_Toc244072875"/>
       <w:r>
         <w:t>10. Прототип «Агрокаст»</w:t>
       </w:r>
@@ -22765,6 +22827,7 @@
         <w:ind w:firstLine="425"/>
       </w:pPr>
       <w:r>
+        <w:lastRenderedPageBreak/>
         <w:t>Сайт состоит из пяти экранов.</w:t>
       </w:r>
     </w:p>
@@ -22792,9 +22855,8 @@
         <w:rPr>
           <w:noProof/>
         </w:rPr>
-        <w:lastRenderedPageBreak/>
         <w:drawing>
-          <wp:inline distT="0" distB="0" distL="0" distR="0" wp14:anchorId="1D7229F2" wp14:editId="3FBFF784">
+          <wp:inline distT="0" distB="0" distL="0" distR="0" wp14:anchorId="7974587F" wp14:editId="7F74086E">
             <wp:extent cx="4212000" cy="2808000"/>
             <wp:effectExtent l="0" t="0" r="0" b="0"/>
             <wp:docPr id="23" name="Picture 23"/>
@@ -22869,7 +22931,7 @@
           <w:noProof/>
         </w:rPr>
         <w:drawing>
-          <wp:inline distT="0" distB="0" distL="0" distR="0" wp14:anchorId="42874B2F" wp14:editId="5B5C27CF">
+          <wp:inline distT="0" distB="0" distL="0" distR="0" wp14:anchorId="21744D63" wp14:editId="05C99853">
             <wp:extent cx="3610285" cy="2807999"/>
             <wp:effectExtent l="0" t="0" r="0" b="0"/>
             <wp:docPr id="24" name="Picture 24"/>
@@ -22945,7 +23007,7 @@
         </w:rPr>
         <w:lastRenderedPageBreak/>
         <w:drawing>
-          <wp:inline distT="0" distB="0" distL="0" distR="0" wp14:anchorId="797012F4" wp14:editId="5B9403EA">
+          <wp:inline distT="0" distB="0" distL="0" distR="0" wp14:anchorId="21E554F6" wp14:editId="75F92CAB">
             <wp:extent cx="3964235" cy="2808000"/>
             <wp:effectExtent l="0" t="0" r="0" b="0"/>
             <wp:docPr id="25" name="Picture 25"/>
@@ -23020,7 +23082,7 @@
           <w:noProof/>
         </w:rPr>
         <w:drawing>
-          <wp:inline distT="0" distB="0" distL="0" distR="0" wp14:anchorId="586709CA" wp14:editId="03EF65CD">
+          <wp:inline distT="0" distB="0" distL="0" distR="0" wp14:anchorId="73338B03" wp14:editId="1B68EBB3">
             <wp:extent cx="3159000" cy="2808000"/>
             <wp:effectExtent l="0" t="0" r="0" b="0"/>
             <wp:docPr id="26" name="Picture 26"/>
@@ -23096,7 +23158,7 @@
       <w:pPr>
         <w:pStyle w:val="1"/>
       </w:pPr>
-      <w:bookmarkStart w:id="58" w:name="_Toc244072352"/>
+      <w:bookmarkStart w:id="58" w:name="_Toc244072876"/>
       <w:r>
         <w:t>11. Ограничения</w:t>
       </w:r>
@@ -23213,10 +23275,10 @@
         <w:rPr>
           <w:b/>
         </w:rPr>
-        <w:t>Сценарии оптимизации пока исторические.</w:t>
-      </w:r>
-      <w:r>
-        <w:t xml:space="preserve"> Урожайности сценариев — тренд, умноженный на отклонения прошлых лет, а не прогон итоговой модели на погоде годов-аналогов; ошибка модели в сценарии не входит. Код оптимизации принимает таблицу сценариев модели одной командой.</w:t>
+        <w:t>Сценарии оптимизации содержат только погодную часть разброса.</w:t>
+      </w:r>
+      <w:r>
+        <w:t xml:space="preserve"> Итоговая модель на погоде сезонов-аналогов даёт разброс урожайности вдвое меньше исторического: ошибка модели в сценарии не добавлена, поэтому риск в основном расчёте скорее занижен. Историческая проверка рекомендаций идёт на генераторе сценариев из фактических отклонений, а не на модели.</w:t>
       </w:r>
     </w:p>
     <w:p>
@@ -23313,7 +23375,7 @@
       <w:pPr>
         <w:pStyle w:val="1"/>
       </w:pPr>
-      <w:bookmarkStart w:id="59" w:name="_Toc244072353"/>
+      <w:bookmarkStart w:id="59" w:name="_Toc244072877"/>
       <w:r>
         <w:t>12. План развития</w:t>
       </w:r>
@@ -23331,7 +23393,7 @@
       <w:pPr>
         <w:pStyle w:val="21"/>
       </w:pPr>
-      <w:bookmarkStart w:id="60" w:name="_Toc244072354"/>
+      <w:bookmarkStart w:id="60" w:name="_Toc244072878"/>
       <w:r>
         <w:lastRenderedPageBreak/>
         <w:t>12.1. Ближайшие шаги (1–3 месяца)</w:t>
@@ -23398,7 +23460,7 @@
       <w:pPr>
         <w:pStyle w:val="21"/>
       </w:pPr>
-      <w:bookmarkStart w:id="61" w:name="_Toc244072355"/>
+      <w:bookmarkStart w:id="61" w:name="_Toc244072879"/>
       <w:r>
         <w:t>12.2. Развитие продукта (3–12 месяцев)</w:t>
       </w:r>
@@ -23478,7 +23540,7 @@
       <w:pPr>
         <w:pStyle w:val="21"/>
       </w:pPr>
-      <w:bookmarkStart w:id="62" w:name="_Toc244072356"/>
+      <w:bookmarkStart w:id="62" w:name="_Toc244072880"/>
       <w:r>
         <w:t>12.3. Ценность для банка (горизонт 1–2 года)</w:t>
       </w:r>
@@ -23544,7 +23606,7 @@
       <w:pPr>
         <w:pStyle w:val="1"/>
       </w:pPr>
-      <w:bookmarkStart w:id="63" w:name="_Toc244072357"/>
+      <w:bookmarkStart w:id="63" w:name="_Toc244072881"/>
       <w:r>
         <w:t>Заключение</w:t>
       </w:r>
@@ -23687,7 +23749,7 @@
       <w:pPr>
         <w:pStyle w:val="1"/>
       </w:pPr>
-      <w:bookmarkStart w:id="64" w:name="_Toc244072358"/>
+      <w:bookmarkStart w:id="64" w:name="_Toc244072882"/>
       <w:r>
         <w:lastRenderedPageBreak/>
         <w:t>Список источников</w:t>
@@ -23698,7 +23760,7 @@
       <w:pPr>
         <w:pStyle w:val="21"/>
       </w:pPr>
-      <w:bookmarkStart w:id="65" w:name="_Toc244072359"/>
+      <w:bookmarkStart w:id="65" w:name="_Toc244072883"/>
       <w:r>
         <w:t>Литература</w:t>
       </w:r>
@@ -24073,7 +24135,7 @@
       <w:pPr>
         <w:pStyle w:val="21"/>
       </w:pPr>
-      <w:bookmarkStart w:id="66" w:name="_Toc244072360"/>
+      <w:bookmarkStart w:id="66" w:name="_Toc244072884"/>
       <w:r>
         <w:t>Данные</w:t>
       </w:r>
@@ -24472,31 +24534,31 @@
       </w:rPr>
     </w:lvl>
   </w:abstractNum>
-  <w:num w:numId="1" w16cid:durableId="765805870">
+  <w:num w:numId="1" w16cid:durableId="1342733467">
     <w:abstractNumId w:val="8"/>
   </w:num>
-  <w:num w:numId="2" w16cid:durableId="1593972334">
+  <w:num w:numId="2" w16cid:durableId="1566602607">
     <w:abstractNumId w:val="6"/>
   </w:num>
-  <w:num w:numId="3" w16cid:durableId="108621584">
+  <w:num w:numId="3" w16cid:durableId="1626621818">
     <w:abstractNumId w:val="5"/>
   </w:num>
-  <w:num w:numId="4" w16cid:durableId="1547789939">
+  <w:num w:numId="4" w16cid:durableId="1406101130">
     <w:abstractNumId w:val="4"/>
   </w:num>
-  <w:num w:numId="5" w16cid:durableId="510723409">
+  <w:num w:numId="5" w16cid:durableId="24982989">
     <w:abstractNumId w:val="7"/>
   </w:num>
-  <w:num w:numId="6" w16cid:durableId="790124251">
+  <w:num w:numId="6" w16cid:durableId="1870531456">
     <w:abstractNumId w:val="3"/>
   </w:num>
-  <w:num w:numId="7" w16cid:durableId="250547503">
+  <w:num w:numId="7" w16cid:durableId="87238700">
     <w:abstractNumId w:val="2"/>
   </w:num>
-  <w:num w:numId="8" w16cid:durableId="1175026873">
+  <w:num w:numId="8" w16cid:durableId="1813935827">
     <w:abstractNumId w:val="1"/>
   </w:num>
-  <w:num w:numId="9" w16cid:durableId="1705014451">
+  <w:num w:numId="9" w16cid:durableId="1104887975">
     <w:abstractNumId w:val="0"/>
   </w:num>
 </w:numbering>
@@ -35919,7 +35981,7 @@
     <w:autoRedefine/>
     <w:uiPriority w:val="39"/>
     <w:unhideWhenUsed/>
-    <w:rsid w:val="00DF394B"/>
+    <w:rsid w:val="00ED7394"/>
   </w:style>
   <w:style w:type="paragraph" w:styleId="2c">
     <w:name w:val="toc 2"/>
@@ -35928,7 +35990,7 @@
     <w:autoRedefine/>
     <w:uiPriority w:val="39"/>
     <w:unhideWhenUsed/>
-    <w:rsid w:val="00DF394B"/>
+    <w:rsid w:val="00ED7394"/>
     <w:pPr>
       <w:ind w:left="210"/>
     </w:pPr>
@@ -35938,7 +36000,7 @@
     <w:basedOn w:val="a2"/>
     <w:uiPriority w:val="99"/>
     <w:unhideWhenUsed/>
-    <w:rsid w:val="00DF394B"/>
+    <w:rsid w:val="00ED7394"/>
     <w:rPr>
       <w:color w:val="0000FF" w:themeColor="hyperlink"/>
       <w:u w:val="single"/>

</xml_diff>

<commit_message>
Presentation and report: author and links to repository and site
</commit_message>
<xml_diff>
--- a/report/out/rshb_yield_forecast_report.docx
+++ b/report/out/rshb_yield_forecast_report.docx
@@ -83,7 +83,7 @@
           <w:color w:val="0B0B0B"/>
           <w:sz w:val="24"/>
         </w:rPr>
-        <w:t>[ФИО автора]</w:t>
+        <w:t>Соболев Даниил</w:t>
       </w:r>
     </w:p>
     <w:p>
@@ -121,7 +121,7 @@
       <w:pPr>
         <w:pStyle w:val="1"/>
       </w:pPr>
-      <w:bookmarkStart w:id="0" w:name="_Toc244072818"/>
+      <w:bookmarkStart w:id="0" w:name="_Toc244085451"/>
       <w:r>
         <w:lastRenderedPageBreak/>
         <w:t>Аннотация</w:t>
@@ -187,7 +187,7 @@
       <w:pPr>
         <w:pStyle w:val="21"/>
       </w:pPr>
-      <w:bookmarkStart w:id="1" w:name="_Toc244072819"/>
+      <w:bookmarkStart w:id="1" w:name="_Toc244085452"/>
       <w:r>
         <w:t>Ключевые цифры</w:t>
       </w:r>
@@ -546,7 +546,7 @@
       <w:r>
         <w:fldChar w:fldCharType="separate"/>
       </w:r>
-      <w:hyperlink w:anchor="_Toc244072818" w:history="1">
+      <w:hyperlink w:anchor="_Toc244085451" w:history="1">
         <w:r>
           <w:rPr>
             <w:rStyle w:val="aff8"/>
@@ -573,7 +573,7 @@
             <w:noProof/>
             <w:webHidden/>
           </w:rPr>
-          <w:instrText xml:space="preserve"> PAGEREF _Toc244072818 \h </w:instrText>
+          <w:instrText xml:space="preserve"> PAGEREF _Toc244085451 \h </w:instrText>
         </w:r>
         <w:r>
           <w:rPr>
@@ -620,7 +620,7 @@
           <w14:ligatures w14:val="standardContextual"/>
         </w:rPr>
       </w:pPr>
-      <w:hyperlink w:anchor="_Toc244072819" w:history="1">
+      <w:hyperlink w:anchor="_Toc244085452" w:history="1">
         <w:r>
           <w:rPr>
             <w:rStyle w:val="aff8"/>
@@ -647,7 +647,7 @@
             <w:noProof/>
             <w:webHidden/>
           </w:rPr>
-          <w:instrText xml:space="preserve"> PAGEREF _Toc244072819 \h </w:instrText>
+          <w:instrText xml:space="preserve"> PAGEREF _Toc244085452 \h </w:instrText>
         </w:r>
         <w:r>
           <w:rPr>
@@ -694,7 +694,7 @@
           <w14:ligatures w14:val="standardContextual"/>
         </w:rPr>
       </w:pPr>
-      <w:hyperlink w:anchor="_Toc244072820" w:history="1">
+      <w:hyperlink w:anchor="_Toc244085453" w:history="1">
         <w:r>
           <w:rPr>
             <w:rStyle w:val="aff8"/>
@@ -721,7 +721,7 @@
             <w:noProof/>
             <w:webHidden/>
           </w:rPr>
-          <w:instrText xml:space="preserve"> PAGEREF _Toc244072820 \h </w:instrText>
+          <w:instrText xml:space="preserve"> PAGEREF _Toc244085453 \h </w:instrText>
         </w:r>
         <w:r>
           <w:rPr>
@@ -768,7 +768,7 @@
           <w14:ligatures w14:val="standardContextual"/>
         </w:rPr>
       </w:pPr>
-      <w:hyperlink w:anchor="_Toc244072821" w:history="1">
+      <w:hyperlink w:anchor="_Toc244085454" w:history="1">
         <w:r>
           <w:rPr>
             <w:rStyle w:val="aff8"/>
@@ -795,7 +795,7 @@
             <w:noProof/>
             <w:webHidden/>
           </w:rPr>
-          <w:instrText xml:space="preserve"> PAGEREF _Toc244072821 \h </w:instrText>
+          <w:instrText xml:space="preserve"> PAGEREF _Toc244085454 \h </w:instrText>
         </w:r>
         <w:r>
           <w:rPr>
@@ -842,7 +842,7 @@
           <w14:ligatures w14:val="standardContextual"/>
         </w:rPr>
       </w:pPr>
-      <w:hyperlink w:anchor="_Toc244072822" w:history="1">
+      <w:hyperlink w:anchor="_Toc244085455" w:history="1">
         <w:r>
           <w:rPr>
             <w:rStyle w:val="aff8"/>
@@ -869,7 +869,7 @@
             <w:noProof/>
             <w:webHidden/>
           </w:rPr>
-          <w:instrText xml:space="preserve"> PAGEREF _Toc244072822 \h </w:instrText>
+          <w:instrText xml:space="preserve"> PAGEREF _Toc244085455 \h </w:instrText>
         </w:r>
         <w:r>
           <w:rPr>
@@ -916,7 +916,7 @@
           <w14:ligatures w14:val="standardContextual"/>
         </w:rPr>
       </w:pPr>
-      <w:hyperlink w:anchor="_Toc244072823" w:history="1">
+      <w:hyperlink w:anchor="_Toc244085456" w:history="1">
         <w:r>
           <w:rPr>
             <w:rStyle w:val="aff8"/>
@@ -943,7 +943,7 @@
             <w:noProof/>
             <w:webHidden/>
           </w:rPr>
-          <w:instrText xml:space="preserve"> PAGEREF _Toc244072823 \h </w:instrText>
+          <w:instrText xml:space="preserve"> PAGEREF _Toc244085456 \h </w:instrText>
         </w:r>
         <w:r>
           <w:rPr>
@@ -990,7 +990,7 @@
           <w14:ligatures w14:val="standardContextual"/>
         </w:rPr>
       </w:pPr>
-      <w:hyperlink w:anchor="_Toc244072824" w:history="1">
+      <w:hyperlink w:anchor="_Toc244085457" w:history="1">
         <w:r>
           <w:rPr>
             <w:rStyle w:val="aff8"/>
@@ -1017,7 +1017,7 @@
             <w:noProof/>
             <w:webHidden/>
           </w:rPr>
-          <w:instrText xml:space="preserve"> PAGEREF _Toc244072824 \h </w:instrText>
+          <w:instrText xml:space="preserve"> PAGEREF _Toc244085457 \h </w:instrText>
         </w:r>
         <w:r>
           <w:rPr>
@@ -1064,7 +1064,7 @@
           <w14:ligatures w14:val="standardContextual"/>
         </w:rPr>
       </w:pPr>
-      <w:hyperlink w:anchor="_Toc244072825" w:history="1">
+      <w:hyperlink w:anchor="_Toc244085458" w:history="1">
         <w:r>
           <w:rPr>
             <w:rStyle w:val="aff8"/>
@@ -1091,7 +1091,7 @@
             <w:noProof/>
             <w:webHidden/>
           </w:rPr>
-          <w:instrText xml:space="preserve"> PAGEREF _Toc244072825 \h </w:instrText>
+          <w:instrText xml:space="preserve"> PAGEREF _Toc244085458 \h </w:instrText>
         </w:r>
         <w:r>
           <w:rPr>
@@ -1138,7 +1138,7 @@
           <w14:ligatures w14:val="standardContextual"/>
         </w:rPr>
       </w:pPr>
-      <w:hyperlink w:anchor="_Toc244072826" w:history="1">
+      <w:hyperlink w:anchor="_Toc244085459" w:history="1">
         <w:r>
           <w:rPr>
             <w:rStyle w:val="aff8"/>
@@ -1165,7 +1165,7 @@
             <w:noProof/>
             <w:webHidden/>
           </w:rPr>
-          <w:instrText xml:space="preserve"> PAGEREF _Toc244072826 \h </w:instrText>
+          <w:instrText xml:space="preserve"> PAGEREF _Toc244085459 \h </w:instrText>
         </w:r>
         <w:r>
           <w:rPr>
@@ -1212,7 +1212,7 @@
           <w14:ligatures w14:val="standardContextual"/>
         </w:rPr>
       </w:pPr>
-      <w:hyperlink w:anchor="_Toc244072827" w:history="1">
+      <w:hyperlink w:anchor="_Toc244085460" w:history="1">
         <w:r>
           <w:rPr>
             <w:rStyle w:val="aff8"/>
@@ -1239,7 +1239,7 @@
             <w:noProof/>
             <w:webHidden/>
           </w:rPr>
-          <w:instrText xml:space="preserve"> PAGEREF _Toc244072827 \h </w:instrText>
+          <w:instrText xml:space="preserve"> PAGEREF _Toc244085460 \h </w:instrText>
         </w:r>
         <w:r>
           <w:rPr>
@@ -1286,7 +1286,7 @@
           <w14:ligatures w14:val="standardContextual"/>
         </w:rPr>
       </w:pPr>
-      <w:hyperlink w:anchor="_Toc244072828" w:history="1">
+      <w:hyperlink w:anchor="_Toc244085461" w:history="1">
         <w:r>
           <w:rPr>
             <w:rStyle w:val="aff8"/>
@@ -1313,7 +1313,7 @@
             <w:noProof/>
             <w:webHidden/>
           </w:rPr>
-          <w:instrText xml:space="preserve"> PAGEREF _Toc244072828 \h </w:instrText>
+          <w:instrText xml:space="preserve"> PAGEREF _Toc244085461 \h </w:instrText>
         </w:r>
         <w:r>
           <w:rPr>
@@ -1360,7 +1360,7 @@
           <w14:ligatures w14:val="standardContextual"/>
         </w:rPr>
       </w:pPr>
-      <w:hyperlink w:anchor="_Toc244072829" w:history="1">
+      <w:hyperlink w:anchor="_Toc244085462" w:history="1">
         <w:r>
           <w:rPr>
             <w:rStyle w:val="aff8"/>
@@ -1387,7 +1387,7 @@
             <w:noProof/>
             <w:webHidden/>
           </w:rPr>
-          <w:instrText xml:space="preserve"> PAGEREF _Toc244072829 \h </w:instrText>
+          <w:instrText xml:space="preserve"> PAGEREF _Toc244085462 \h </w:instrText>
         </w:r>
         <w:r>
           <w:rPr>
@@ -1434,7 +1434,7 @@
           <w14:ligatures w14:val="standardContextual"/>
         </w:rPr>
       </w:pPr>
-      <w:hyperlink w:anchor="_Toc244072830" w:history="1">
+      <w:hyperlink w:anchor="_Toc244085463" w:history="1">
         <w:r>
           <w:rPr>
             <w:rStyle w:val="aff8"/>
@@ -1461,7 +1461,7 @@
             <w:noProof/>
             <w:webHidden/>
           </w:rPr>
-          <w:instrText xml:space="preserve"> PAGEREF _Toc244072830 \h </w:instrText>
+          <w:instrText xml:space="preserve"> PAGEREF _Toc244085463 \h </w:instrText>
         </w:r>
         <w:r>
           <w:rPr>
@@ -1508,7 +1508,7 @@
           <w14:ligatures w14:val="standardContextual"/>
         </w:rPr>
       </w:pPr>
-      <w:hyperlink w:anchor="_Toc244072831" w:history="1">
+      <w:hyperlink w:anchor="_Toc244085464" w:history="1">
         <w:r>
           <w:rPr>
             <w:rStyle w:val="aff8"/>
@@ -1535,7 +1535,7 @@
             <w:noProof/>
             <w:webHidden/>
           </w:rPr>
-          <w:instrText xml:space="preserve"> PAGEREF _Toc244072831 \h </w:instrText>
+          <w:instrText xml:space="preserve"> PAGEREF _Toc244085464 \h </w:instrText>
         </w:r>
         <w:r>
           <w:rPr>
@@ -1582,7 +1582,7 @@
           <w14:ligatures w14:val="standardContextual"/>
         </w:rPr>
       </w:pPr>
-      <w:hyperlink w:anchor="_Toc244072832" w:history="1">
+      <w:hyperlink w:anchor="_Toc244085465" w:history="1">
         <w:r>
           <w:rPr>
             <w:rStyle w:val="aff8"/>
@@ -1609,7 +1609,7 @@
             <w:noProof/>
             <w:webHidden/>
           </w:rPr>
-          <w:instrText xml:space="preserve"> PAGEREF _Toc244072832 \h </w:instrText>
+          <w:instrText xml:space="preserve"> PAGEREF _Toc244085465 \h </w:instrText>
         </w:r>
         <w:r>
           <w:rPr>
@@ -1656,7 +1656,7 @@
           <w14:ligatures w14:val="standardContextual"/>
         </w:rPr>
       </w:pPr>
-      <w:hyperlink w:anchor="_Toc244072833" w:history="1">
+      <w:hyperlink w:anchor="_Toc244085466" w:history="1">
         <w:r>
           <w:rPr>
             <w:rStyle w:val="aff8"/>
@@ -1683,7 +1683,7 @@
             <w:noProof/>
             <w:webHidden/>
           </w:rPr>
-          <w:instrText xml:space="preserve"> PAGEREF _Toc244072833 \h </w:instrText>
+          <w:instrText xml:space="preserve"> PAGEREF _Toc244085466 \h </w:instrText>
         </w:r>
         <w:r>
           <w:rPr>
@@ -1730,7 +1730,7 @@
           <w14:ligatures w14:val="standardContextual"/>
         </w:rPr>
       </w:pPr>
-      <w:hyperlink w:anchor="_Toc244072834" w:history="1">
+      <w:hyperlink w:anchor="_Toc244085467" w:history="1">
         <w:r>
           <w:rPr>
             <w:rStyle w:val="aff8"/>
@@ -1757,7 +1757,7 @@
             <w:noProof/>
             <w:webHidden/>
           </w:rPr>
-          <w:instrText xml:space="preserve"> PAGEREF _Toc244072834 \h </w:instrText>
+          <w:instrText xml:space="preserve"> PAGEREF _Toc244085467 \h </w:instrText>
         </w:r>
         <w:r>
           <w:rPr>
@@ -1804,7 +1804,7 @@
           <w14:ligatures w14:val="standardContextual"/>
         </w:rPr>
       </w:pPr>
-      <w:hyperlink w:anchor="_Toc244072835" w:history="1">
+      <w:hyperlink w:anchor="_Toc244085468" w:history="1">
         <w:r>
           <w:rPr>
             <w:rStyle w:val="aff8"/>
@@ -1831,7 +1831,7 @@
             <w:noProof/>
             <w:webHidden/>
           </w:rPr>
-          <w:instrText xml:space="preserve"> PAGEREF _Toc244072835 \h </w:instrText>
+          <w:instrText xml:space="preserve"> PAGEREF _Toc244085468 \h </w:instrText>
         </w:r>
         <w:r>
           <w:rPr>
@@ -1878,7 +1878,7 @@
           <w14:ligatures w14:val="standardContextual"/>
         </w:rPr>
       </w:pPr>
-      <w:hyperlink w:anchor="_Toc244072836" w:history="1">
+      <w:hyperlink w:anchor="_Toc244085469" w:history="1">
         <w:r>
           <w:rPr>
             <w:rStyle w:val="aff8"/>
@@ -1905,7 +1905,7 @@
             <w:noProof/>
             <w:webHidden/>
           </w:rPr>
-          <w:instrText xml:space="preserve"> PAGEREF _Toc244072836 \h </w:instrText>
+          <w:instrText xml:space="preserve"> PAGEREF _Toc244085469 \h </w:instrText>
         </w:r>
         <w:r>
           <w:rPr>
@@ -1952,7 +1952,7 @@
           <w14:ligatures w14:val="standardContextual"/>
         </w:rPr>
       </w:pPr>
-      <w:hyperlink w:anchor="_Toc244072837" w:history="1">
+      <w:hyperlink w:anchor="_Toc244085470" w:history="1">
         <w:r>
           <w:rPr>
             <w:rStyle w:val="aff8"/>
@@ -1979,7 +1979,7 @@
             <w:noProof/>
             <w:webHidden/>
           </w:rPr>
-          <w:instrText xml:space="preserve"> PAGEREF _Toc244072837 \h </w:instrText>
+          <w:instrText xml:space="preserve"> PAGEREF _Toc244085470 \h </w:instrText>
         </w:r>
         <w:r>
           <w:rPr>
@@ -2026,7 +2026,7 @@
           <w14:ligatures w14:val="standardContextual"/>
         </w:rPr>
       </w:pPr>
-      <w:hyperlink w:anchor="_Toc244072838" w:history="1">
+      <w:hyperlink w:anchor="_Toc244085471" w:history="1">
         <w:r>
           <w:rPr>
             <w:rStyle w:val="aff8"/>
@@ -2053,7 +2053,7 @@
             <w:noProof/>
             <w:webHidden/>
           </w:rPr>
-          <w:instrText xml:space="preserve"> PAGEREF _Toc244072838 \h </w:instrText>
+          <w:instrText xml:space="preserve"> PAGEREF _Toc244085471 \h </w:instrText>
         </w:r>
         <w:r>
           <w:rPr>
@@ -2100,7 +2100,7 @@
           <w14:ligatures w14:val="standardContextual"/>
         </w:rPr>
       </w:pPr>
-      <w:hyperlink w:anchor="_Toc244072839" w:history="1">
+      <w:hyperlink w:anchor="_Toc244085472" w:history="1">
         <w:r>
           <w:rPr>
             <w:rStyle w:val="aff8"/>
@@ -2127,7 +2127,7 @@
             <w:noProof/>
             <w:webHidden/>
           </w:rPr>
-          <w:instrText xml:space="preserve"> PAGEREF _Toc244072839 \h </w:instrText>
+          <w:instrText xml:space="preserve"> PAGEREF _Toc244085472 \h </w:instrText>
         </w:r>
         <w:r>
           <w:rPr>
@@ -2174,7 +2174,7 @@
           <w14:ligatures w14:val="standardContextual"/>
         </w:rPr>
       </w:pPr>
-      <w:hyperlink w:anchor="_Toc244072840" w:history="1">
+      <w:hyperlink w:anchor="_Toc244085473" w:history="1">
         <w:r>
           <w:rPr>
             <w:rStyle w:val="aff8"/>
@@ -2201,7 +2201,7 @@
             <w:noProof/>
             <w:webHidden/>
           </w:rPr>
-          <w:instrText xml:space="preserve"> PAGEREF _Toc244072840 \h </w:instrText>
+          <w:instrText xml:space="preserve"> PAGEREF _Toc244085473 \h </w:instrText>
         </w:r>
         <w:r>
           <w:rPr>
@@ -2248,7 +2248,7 @@
           <w14:ligatures w14:val="standardContextual"/>
         </w:rPr>
       </w:pPr>
-      <w:hyperlink w:anchor="_Toc244072841" w:history="1">
+      <w:hyperlink w:anchor="_Toc244085474" w:history="1">
         <w:r>
           <w:rPr>
             <w:rStyle w:val="aff8"/>
@@ -2275,7 +2275,7 @@
             <w:noProof/>
             <w:webHidden/>
           </w:rPr>
-          <w:instrText xml:space="preserve"> PAGEREF _Toc244072841 \h </w:instrText>
+          <w:instrText xml:space="preserve"> PAGEREF _Toc244085474 \h </w:instrText>
         </w:r>
         <w:r>
           <w:rPr>
@@ -2322,7 +2322,7 @@
           <w14:ligatures w14:val="standardContextual"/>
         </w:rPr>
       </w:pPr>
-      <w:hyperlink w:anchor="_Toc244072842" w:history="1">
+      <w:hyperlink w:anchor="_Toc244085475" w:history="1">
         <w:r>
           <w:rPr>
             <w:rStyle w:val="aff8"/>
@@ -2349,7 +2349,7 @@
             <w:noProof/>
             <w:webHidden/>
           </w:rPr>
-          <w:instrText xml:space="preserve"> PAGEREF _Toc244072842 \h </w:instrText>
+          <w:instrText xml:space="preserve"> PAGEREF _Toc244085475 \h </w:instrText>
         </w:r>
         <w:r>
           <w:rPr>
@@ -2396,7 +2396,7 @@
           <w14:ligatures w14:val="standardContextual"/>
         </w:rPr>
       </w:pPr>
-      <w:hyperlink w:anchor="_Toc244072843" w:history="1">
+      <w:hyperlink w:anchor="_Toc244085476" w:history="1">
         <w:r>
           <w:rPr>
             <w:rStyle w:val="aff8"/>
@@ -2423,7 +2423,7 @@
             <w:noProof/>
             <w:webHidden/>
           </w:rPr>
-          <w:instrText xml:space="preserve"> PAGEREF _Toc244072843 \h </w:instrText>
+          <w:instrText xml:space="preserve"> PAGEREF _Toc244085476 \h </w:instrText>
         </w:r>
         <w:r>
           <w:rPr>
@@ -2470,7 +2470,7 @@
           <w14:ligatures w14:val="standardContextual"/>
         </w:rPr>
       </w:pPr>
-      <w:hyperlink w:anchor="_Toc244072844" w:history="1">
+      <w:hyperlink w:anchor="_Toc244085477" w:history="1">
         <w:r>
           <w:rPr>
             <w:rStyle w:val="aff8"/>
@@ -2497,7 +2497,7 @@
             <w:noProof/>
             <w:webHidden/>
           </w:rPr>
-          <w:instrText xml:space="preserve"> PAGEREF _Toc244072844 \h </w:instrText>
+          <w:instrText xml:space="preserve"> PAGEREF _Toc244085477 \h </w:instrText>
         </w:r>
         <w:r>
           <w:rPr>
@@ -2544,7 +2544,7 @@
           <w14:ligatures w14:val="standardContextual"/>
         </w:rPr>
       </w:pPr>
-      <w:hyperlink w:anchor="_Toc244072845" w:history="1">
+      <w:hyperlink w:anchor="_Toc244085478" w:history="1">
         <w:r>
           <w:rPr>
             <w:rStyle w:val="aff8"/>
@@ -2571,7 +2571,7 @@
             <w:noProof/>
             <w:webHidden/>
           </w:rPr>
-          <w:instrText xml:space="preserve"> PAGEREF _Toc244072845 \h </w:instrText>
+          <w:instrText xml:space="preserve"> PAGEREF _Toc244085478 \h </w:instrText>
         </w:r>
         <w:r>
           <w:rPr>
@@ -2618,7 +2618,7 @@
           <w14:ligatures w14:val="standardContextual"/>
         </w:rPr>
       </w:pPr>
-      <w:hyperlink w:anchor="_Toc244072846" w:history="1">
+      <w:hyperlink w:anchor="_Toc244085479" w:history="1">
         <w:r>
           <w:rPr>
             <w:rStyle w:val="aff8"/>
@@ -2645,7 +2645,7 @@
             <w:noProof/>
             <w:webHidden/>
           </w:rPr>
-          <w:instrText xml:space="preserve"> PAGEREF _Toc244072846 \h </w:instrText>
+          <w:instrText xml:space="preserve"> PAGEREF _Toc244085479 \h </w:instrText>
         </w:r>
         <w:r>
           <w:rPr>
@@ -2692,7 +2692,7 @@
           <w14:ligatures w14:val="standardContextual"/>
         </w:rPr>
       </w:pPr>
-      <w:hyperlink w:anchor="_Toc244072847" w:history="1">
+      <w:hyperlink w:anchor="_Toc244085480" w:history="1">
         <w:r>
           <w:rPr>
             <w:rStyle w:val="aff8"/>
@@ -2719,7 +2719,7 @@
             <w:noProof/>
             <w:webHidden/>
           </w:rPr>
-          <w:instrText xml:space="preserve"> PAGEREF _Toc244072847 \h </w:instrText>
+          <w:instrText xml:space="preserve"> PAGEREF _Toc244085480 \h </w:instrText>
         </w:r>
         <w:r>
           <w:rPr>
@@ -2766,7 +2766,7 @@
           <w14:ligatures w14:val="standardContextual"/>
         </w:rPr>
       </w:pPr>
-      <w:hyperlink w:anchor="_Toc244072848" w:history="1">
+      <w:hyperlink w:anchor="_Toc244085481" w:history="1">
         <w:r>
           <w:rPr>
             <w:rStyle w:val="aff8"/>
@@ -2793,7 +2793,7 @@
             <w:noProof/>
             <w:webHidden/>
           </w:rPr>
-          <w:instrText xml:space="preserve"> PAGEREF _Toc244072848 \h </w:instrText>
+          <w:instrText xml:space="preserve"> PAGEREF _Toc244085481 \h </w:instrText>
         </w:r>
         <w:r>
           <w:rPr>
@@ -2840,7 +2840,7 @@
           <w14:ligatures w14:val="standardContextual"/>
         </w:rPr>
       </w:pPr>
-      <w:hyperlink w:anchor="_Toc244072849" w:history="1">
+      <w:hyperlink w:anchor="_Toc244085482" w:history="1">
         <w:r>
           <w:rPr>
             <w:rStyle w:val="aff8"/>
@@ -2867,7 +2867,7 @@
             <w:noProof/>
             <w:webHidden/>
           </w:rPr>
-          <w:instrText xml:space="preserve"> PAGEREF _Toc244072849 \h </w:instrText>
+          <w:instrText xml:space="preserve"> PAGEREF _Toc244085482 \h </w:instrText>
         </w:r>
         <w:r>
           <w:rPr>
@@ -2914,7 +2914,7 @@
           <w14:ligatures w14:val="standardContextual"/>
         </w:rPr>
       </w:pPr>
-      <w:hyperlink w:anchor="_Toc244072850" w:history="1">
+      <w:hyperlink w:anchor="_Toc244085483" w:history="1">
         <w:r>
           <w:rPr>
             <w:rStyle w:val="aff8"/>
@@ -2941,7 +2941,7 @@
             <w:noProof/>
             <w:webHidden/>
           </w:rPr>
-          <w:instrText xml:space="preserve"> PAGEREF _Toc244072850 \h </w:instrText>
+          <w:instrText xml:space="preserve"> PAGEREF _Toc244085483 \h </w:instrText>
         </w:r>
         <w:r>
           <w:rPr>
@@ -2988,7 +2988,7 @@
           <w14:ligatures w14:val="standardContextual"/>
         </w:rPr>
       </w:pPr>
-      <w:hyperlink w:anchor="_Toc244072851" w:history="1">
+      <w:hyperlink w:anchor="_Toc244085484" w:history="1">
         <w:r>
           <w:rPr>
             <w:rStyle w:val="aff8"/>
@@ -3015,7 +3015,7 @@
             <w:noProof/>
             <w:webHidden/>
           </w:rPr>
-          <w:instrText xml:space="preserve"> PAGEREF _Toc244072851 \h </w:instrText>
+          <w:instrText xml:space="preserve"> PAGEREF _Toc244085484 \h </w:instrText>
         </w:r>
         <w:r>
           <w:rPr>
@@ -3062,7 +3062,7 @@
           <w14:ligatures w14:val="standardContextual"/>
         </w:rPr>
       </w:pPr>
-      <w:hyperlink w:anchor="_Toc244072852" w:history="1">
+      <w:hyperlink w:anchor="_Toc244085485" w:history="1">
         <w:r>
           <w:rPr>
             <w:rStyle w:val="aff8"/>
@@ -3089,7 +3089,7 @@
             <w:noProof/>
             <w:webHidden/>
           </w:rPr>
-          <w:instrText xml:space="preserve"> PAGEREF _Toc244072852 \h </w:instrText>
+          <w:instrText xml:space="preserve"> PAGEREF _Toc244085485 \h </w:instrText>
         </w:r>
         <w:r>
           <w:rPr>
@@ -3136,7 +3136,7 @@
           <w14:ligatures w14:val="standardContextual"/>
         </w:rPr>
       </w:pPr>
-      <w:hyperlink w:anchor="_Toc244072853" w:history="1">
+      <w:hyperlink w:anchor="_Toc244085486" w:history="1">
         <w:r>
           <w:rPr>
             <w:rStyle w:val="aff8"/>
@@ -3163,7 +3163,7 @@
             <w:noProof/>
             <w:webHidden/>
           </w:rPr>
-          <w:instrText xml:space="preserve"> PAGEREF _Toc244072853 \h </w:instrText>
+          <w:instrText xml:space="preserve"> PAGEREF _Toc244085486 \h </w:instrText>
         </w:r>
         <w:r>
           <w:rPr>
@@ -3210,7 +3210,7 @@
           <w14:ligatures w14:val="standardContextual"/>
         </w:rPr>
       </w:pPr>
-      <w:hyperlink w:anchor="_Toc244072854" w:history="1">
+      <w:hyperlink w:anchor="_Toc244085487" w:history="1">
         <w:r>
           <w:rPr>
             <w:rStyle w:val="aff8"/>
@@ -3237,7 +3237,7 @@
             <w:noProof/>
             <w:webHidden/>
           </w:rPr>
-          <w:instrText xml:space="preserve"> PAGEREF _Toc244072854 \h </w:instrText>
+          <w:instrText xml:space="preserve"> PAGEREF _Toc244085487 \h </w:instrText>
         </w:r>
         <w:r>
           <w:rPr>
@@ -3284,7 +3284,7 @@
           <w14:ligatures w14:val="standardContextual"/>
         </w:rPr>
       </w:pPr>
-      <w:hyperlink w:anchor="_Toc244072855" w:history="1">
+      <w:hyperlink w:anchor="_Toc244085488" w:history="1">
         <w:r>
           <w:rPr>
             <w:rStyle w:val="aff8"/>
@@ -3311,7 +3311,7 @@
             <w:noProof/>
             <w:webHidden/>
           </w:rPr>
-          <w:instrText xml:space="preserve"> PAGEREF _Toc244072855 \h </w:instrText>
+          <w:instrText xml:space="preserve"> PAGEREF _Toc244085488 \h </w:instrText>
         </w:r>
         <w:r>
           <w:rPr>
@@ -3358,7 +3358,7 @@
           <w14:ligatures w14:val="standardContextual"/>
         </w:rPr>
       </w:pPr>
-      <w:hyperlink w:anchor="_Toc244072856" w:history="1">
+      <w:hyperlink w:anchor="_Toc244085489" w:history="1">
         <w:r>
           <w:rPr>
             <w:rStyle w:val="aff8"/>
@@ -3385,7 +3385,7 @@
             <w:noProof/>
             <w:webHidden/>
           </w:rPr>
-          <w:instrText xml:space="preserve"> PAGEREF _Toc244072856 \h </w:instrText>
+          <w:instrText xml:space="preserve"> PAGEREF _Toc244085489 \h </w:instrText>
         </w:r>
         <w:r>
           <w:rPr>
@@ -3432,7 +3432,7 @@
           <w14:ligatures w14:val="standardContextual"/>
         </w:rPr>
       </w:pPr>
-      <w:hyperlink w:anchor="_Toc244072857" w:history="1">
+      <w:hyperlink w:anchor="_Toc244085490" w:history="1">
         <w:r>
           <w:rPr>
             <w:rStyle w:val="aff8"/>
@@ -3459,7 +3459,7 @@
             <w:noProof/>
             <w:webHidden/>
           </w:rPr>
-          <w:instrText xml:space="preserve"> PAGEREF _Toc244072857 \h </w:instrText>
+          <w:instrText xml:space="preserve"> PAGEREF _Toc244085490 \h </w:instrText>
         </w:r>
         <w:r>
           <w:rPr>
@@ -3506,7 +3506,7 @@
           <w14:ligatures w14:val="standardContextual"/>
         </w:rPr>
       </w:pPr>
-      <w:hyperlink w:anchor="_Toc244072858" w:history="1">
+      <w:hyperlink w:anchor="_Toc244085491" w:history="1">
         <w:r>
           <w:rPr>
             <w:rStyle w:val="aff8"/>
@@ -3533,7 +3533,7 @@
             <w:noProof/>
             <w:webHidden/>
           </w:rPr>
-          <w:instrText xml:space="preserve"> PAGEREF _Toc244072858 \h </w:instrText>
+          <w:instrText xml:space="preserve"> PAGEREF _Toc244085491 \h </w:instrText>
         </w:r>
         <w:r>
           <w:rPr>
@@ -3580,7 +3580,7 @@
           <w14:ligatures w14:val="standardContextual"/>
         </w:rPr>
       </w:pPr>
-      <w:hyperlink w:anchor="_Toc244072859" w:history="1">
+      <w:hyperlink w:anchor="_Toc244085492" w:history="1">
         <w:r>
           <w:rPr>
             <w:rStyle w:val="aff8"/>
@@ -3607,7 +3607,7 @@
             <w:noProof/>
             <w:webHidden/>
           </w:rPr>
-          <w:instrText xml:space="preserve"> PAGEREF _Toc244072859 \h </w:instrText>
+          <w:instrText xml:space="preserve"> PAGEREF _Toc244085492 \h </w:instrText>
         </w:r>
         <w:r>
           <w:rPr>
@@ -3654,7 +3654,7 @@
           <w14:ligatures w14:val="standardContextual"/>
         </w:rPr>
       </w:pPr>
-      <w:hyperlink w:anchor="_Toc244072860" w:history="1">
+      <w:hyperlink w:anchor="_Toc244085493" w:history="1">
         <w:r>
           <w:rPr>
             <w:rStyle w:val="aff8"/>
@@ -3681,7 +3681,7 @@
             <w:noProof/>
             <w:webHidden/>
           </w:rPr>
-          <w:instrText xml:space="preserve"> PAGEREF _Toc244072860 \h </w:instrText>
+          <w:instrText xml:space="preserve"> PAGEREF _Toc244085493 \h </w:instrText>
         </w:r>
         <w:r>
           <w:rPr>
@@ -3728,7 +3728,7 @@
           <w14:ligatures w14:val="standardContextual"/>
         </w:rPr>
       </w:pPr>
-      <w:hyperlink w:anchor="_Toc244072861" w:history="1">
+      <w:hyperlink w:anchor="_Toc244085494" w:history="1">
         <w:r>
           <w:rPr>
             <w:rStyle w:val="aff8"/>
@@ -3755,7 +3755,7 @@
             <w:noProof/>
             <w:webHidden/>
           </w:rPr>
-          <w:instrText xml:space="preserve"> PAGEREF _Toc244072861 \h </w:instrText>
+          <w:instrText xml:space="preserve"> PAGEREF _Toc244085494 \h </w:instrText>
         </w:r>
         <w:r>
           <w:rPr>
@@ -3802,7 +3802,7 @@
           <w14:ligatures w14:val="standardContextual"/>
         </w:rPr>
       </w:pPr>
-      <w:hyperlink w:anchor="_Toc244072862" w:history="1">
+      <w:hyperlink w:anchor="_Toc244085495" w:history="1">
         <w:r>
           <w:rPr>
             <w:rStyle w:val="aff8"/>
@@ -3829,7 +3829,7 @@
             <w:noProof/>
             <w:webHidden/>
           </w:rPr>
-          <w:instrText xml:space="preserve"> PAGEREF _Toc244072862 \h </w:instrText>
+          <w:instrText xml:space="preserve"> PAGEREF _Toc244085495 \h </w:instrText>
         </w:r>
         <w:r>
           <w:rPr>
@@ -3876,7 +3876,7 @@
           <w14:ligatures w14:val="standardContextual"/>
         </w:rPr>
       </w:pPr>
-      <w:hyperlink w:anchor="_Toc244072863" w:history="1">
+      <w:hyperlink w:anchor="_Toc244085496" w:history="1">
         <w:r>
           <w:rPr>
             <w:rStyle w:val="aff8"/>
@@ -3903,7 +3903,7 @@
             <w:noProof/>
             <w:webHidden/>
           </w:rPr>
-          <w:instrText xml:space="preserve"> PAGEREF _Toc244072863 \h </w:instrText>
+          <w:instrText xml:space="preserve"> PAGEREF _Toc244085496 \h </w:instrText>
         </w:r>
         <w:r>
           <w:rPr>
@@ -3950,7 +3950,7 @@
           <w14:ligatures w14:val="standardContextual"/>
         </w:rPr>
       </w:pPr>
-      <w:hyperlink w:anchor="_Toc244072864" w:history="1">
+      <w:hyperlink w:anchor="_Toc244085497" w:history="1">
         <w:r>
           <w:rPr>
             <w:rStyle w:val="aff8"/>
@@ -3977,7 +3977,7 @@
             <w:noProof/>
             <w:webHidden/>
           </w:rPr>
-          <w:instrText xml:space="preserve"> PAGEREF _Toc244072864 \h </w:instrText>
+          <w:instrText xml:space="preserve"> PAGEREF _Toc244085497 \h </w:instrText>
         </w:r>
         <w:r>
           <w:rPr>
@@ -4024,7 +4024,7 @@
           <w14:ligatures w14:val="standardContextual"/>
         </w:rPr>
       </w:pPr>
-      <w:hyperlink w:anchor="_Toc244072865" w:history="1">
+      <w:hyperlink w:anchor="_Toc244085498" w:history="1">
         <w:r>
           <w:rPr>
             <w:rStyle w:val="aff8"/>
@@ -4051,7 +4051,7 @@
             <w:noProof/>
             <w:webHidden/>
           </w:rPr>
-          <w:instrText xml:space="preserve"> PAGEREF _Toc244072865 \h </w:instrText>
+          <w:instrText xml:space="preserve"> PAGEREF _Toc244085498 \h </w:instrText>
         </w:r>
         <w:r>
           <w:rPr>
@@ -4098,7 +4098,7 @@
           <w14:ligatures w14:val="standardContextual"/>
         </w:rPr>
       </w:pPr>
-      <w:hyperlink w:anchor="_Toc244072866" w:history="1">
+      <w:hyperlink w:anchor="_Toc244085499" w:history="1">
         <w:r>
           <w:rPr>
             <w:rStyle w:val="aff8"/>
@@ -4125,7 +4125,7 @@
             <w:noProof/>
             <w:webHidden/>
           </w:rPr>
-          <w:instrText xml:space="preserve"> PAGEREF _Toc244072866 \h </w:instrText>
+          <w:instrText xml:space="preserve"> PAGEREF _Toc244085499 \h </w:instrText>
         </w:r>
         <w:r>
           <w:rPr>
@@ -4172,7 +4172,7 @@
           <w14:ligatures w14:val="standardContextual"/>
         </w:rPr>
       </w:pPr>
-      <w:hyperlink w:anchor="_Toc244072867" w:history="1">
+      <w:hyperlink w:anchor="_Toc244085500" w:history="1">
         <w:r>
           <w:rPr>
             <w:rStyle w:val="aff8"/>
@@ -4199,7 +4199,7 @@
             <w:noProof/>
             <w:webHidden/>
           </w:rPr>
-          <w:instrText xml:space="preserve"> PAGEREF _Toc244072867 \h </w:instrText>
+          <w:instrText xml:space="preserve"> PAGEREF _Toc244085500 \h </w:instrText>
         </w:r>
         <w:r>
           <w:rPr>
@@ -4246,7 +4246,7 @@
           <w14:ligatures w14:val="standardContextual"/>
         </w:rPr>
       </w:pPr>
-      <w:hyperlink w:anchor="_Toc244072868" w:history="1">
+      <w:hyperlink w:anchor="_Toc244085501" w:history="1">
         <w:r>
           <w:rPr>
             <w:rStyle w:val="aff8"/>
@@ -4273,7 +4273,7 @@
             <w:noProof/>
             <w:webHidden/>
           </w:rPr>
-          <w:instrText xml:space="preserve"> PAGEREF _Toc244072868 \h </w:instrText>
+          <w:instrText xml:space="preserve"> PAGEREF _Toc244085501 \h </w:instrText>
         </w:r>
         <w:r>
           <w:rPr>
@@ -4320,7 +4320,7 @@
           <w14:ligatures w14:val="standardContextual"/>
         </w:rPr>
       </w:pPr>
-      <w:hyperlink w:anchor="_Toc244072869" w:history="1">
+      <w:hyperlink w:anchor="_Toc244085502" w:history="1">
         <w:r>
           <w:rPr>
             <w:rStyle w:val="aff8"/>
@@ -4347,7 +4347,7 @@
             <w:noProof/>
             <w:webHidden/>
           </w:rPr>
-          <w:instrText xml:space="preserve"> PAGEREF _Toc244072869 \h </w:instrText>
+          <w:instrText xml:space="preserve"> PAGEREF _Toc244085502 \h </w:instrText>
         </w:r>
         <w:r>
           <w:rPr>
@@ -4394,7 +4394,7 @@
           <w14:ligatures w14:val="standardContextual"/>
         </w:rPr>
       </w:pPr>
-      <w:hyperlink w:anchor="_Toc244072870" w:history="1">
+      <w:hyperlink w:anchor="_Toc244085503" w:history="1">
         <w:r>
           <w:rPr>
             <w:rStyle w:val="aff8"/>
@@ -4421,7 +4421,7 @@
             <w:noProof/>
             <w:webHidden/>
           </w:rPr>
-          <w:instrText xml:space="preserve"> PAGEREF _Toc244072870 \h </w:instrText>
+          <w:instrText xml:space="preserve"> PAGEREF _Toc244085503 \h </w:instrText>
         </w:r>
         <w:r>
           <w:rPr>
@@ -4468,7 +4468,7 @@
           <w14:ligatures w14:val="standardContextual"/>
         </w:rPr>
       </w:pPr>
-      <w:hyperlink w:anchor="_Toc244072871" w:history="1">
+      <w:hyperlink w:anchor="_Toc244085504" w:history="1">
         <w:r>
           <w:rPr>
             <w:rStyle w:val="aff8"/>
@@ -4495,7 +4495,7 @@
             <w:noProof/>
             <w:webHidden/>
           </w:rPr>
-          <w:instrText xml:space="preserve"> PAGEREF _Toc244072871 \h </w:instrText>
+          <w:instrText xml:space="preserve"> PAGEREF _Toc244085504 \h </w:instrText>
         </w:r>
         <w:r>
           <w:rPr>
@@ -4542,7 +4542,7 @@
           <w14:ligatures w14:val="standardContextual"/>
         </w:rPr>
       </w:pPr>
-      <w:hyperlink w:anchor="_Toc244072872" w:history="1">
+      <w:hyperlink w:anchor="_Toc244085505" w:history="1">
         <w:r>
           <w:rPr>
             <w:rStyle w:val="aff8"/>
@@ -4569,7 +4569,7 @@
             <w:noProof/>
             <w:webHidden/>
           </w:rPr>
-          <w:instrText xml:space="preserve"> PAGEREF _Toc244072872 \h </w:instrText>
+          <w:instrText xml:space="preserve"> PAGEREF _Toc244085505 \h </w:instrText>
         </w:r>
         <w:r>
           <w:rPr>
@@ -4616,7 +4616,7 @@
           <w14:ligatures w14:val="standardContextual"/>
         </w:rPr>
       </w:pPr>
-      <w:hyperlink w:anchor="_Toc244072873" w:history="1">
+      <w:hyperlink w:anchor="_Toc244085506" w:history="1">
         <w:r>
           <w:rPr>
             <w:rStyle w:val="aff8"/>
@@ -4643,7 +4643,7 @@
             <w:noProof/>
             <w:webHidden/>
           </w:rPr>
-          <w:instrText xml:space="preserve"> PAGEREF _Toc244072873 \h </w:instrText>
+          <w:instrText xml:space="preserve"> PAGEREF _Toc244085506 \h </w:instrText>
         </w:r>
         <w:r>
           <w:rPr>
@@ -4690,7 +4690,7 @@
           <w14:ligatures w14:val="standardContextual"/>
         </w:rPr>
       </w:pPr>
-      <w:hyperlink w:anchor="_Toc244072874" w:history="1">
+      <w:hyperlink w:anchor="_Toc244085507" w:history="1">
         <w:r>
           <w:rPr>
             <w:rStyle w:val="aff8"/>
@@ -4717,7 +4717,7 @@
             <w:noProof/>
             <w:webHidden/>
           </w:rPr>
-          <w:instrText xml:space="preserve"> PAGEREF _Toc244072874 \h </w:instrText>
+          <w:instrText xml:space="preserve"> PAGEREF _Toc244085507 \h </w:instrText>
         </w:r>
         <w:r>
           <w:rPr>
@@ -4764,7 +4764,7 @@
           <w14:ligatures w14:val="standardContextual"/>
         </w:rPr>
       </w:pPr>
-      <w:hyperlink w:anchor="_Toc244072875" w:history="1">
+      <w:hyperlink w:anchor="_Toc244085508" w:history="1">
         <w:r>
           <w:rPr>
             <w:rStyle w:val="aff8"/>
@@ -4791,7 +4791,7 @@
             <w:noProof/>
             <w:webHidden/>
           </w:rPr>
-          <w:instrText xml:space="preserve"> PAGEREF _Toc244072875 \h </w:instrText>
+          <w:instrText xml:space="preserve"> PAGEREF _Toc244085508 \h </w:instrText>
         </w:r>
         <w:r>
           <w:rPr>
@@ -4838,7 +4838,7 @@
           <w14:ligatures w14:val="standardContextual"/>
         </w:rPr>
       </w:pPr>
-      <w:hyperlink w:anchor="_Toc244072876" w:history="1">
+      <w:hyperlink w:anchor="_Toc244085509" w:history="1">
         <w:r>
           <w:rPr>
             <w:rStyle w:val="aff8"/>
@@ -4865,7 +4865,7 @@
             <w:noProof/>
             <w:webHidden/>
           </w:rPr>
-          <w:instrText xml:space="preserve"> PAGEREF _Toc244072876 \h </w:instrText>
+          <w:instrText xml:space="preserve"> PAGEREF _Toc244085509 \h </w:instrText>
         </w:r>
         <w:r>
           <w:rPr>
@@ -4912,7 +4912,7 @@
           <w14:ligatures w14:val="standardContextual"/>
         </w:rPr>
       </w:pPr>
-      <w:hyperlink w:anchor="_Toc244072877" w:history="1">
+      <w:hyperlink w:anchor="_Toc244085510" w:history="1">
         <w:r>
           <w:rPr>
             <w:rStyle w:val="aff8"/>
@@ -4939,7 +4939,7 @@
             <w:noProof/>
             <w:webHidden/>
           </w:rPr>
-          <w:instrText xml:space="preserve"> PAGEREF _Toc244072877 \h </w:instrText>
+          <w:instrText xml:space="preserve"> PAGEREF _Toc244085510 \h </w:instrText>
         </w:r>
         <w:r>
           <w:rPr>
@@ -4986,7 +4986,7 @@
           <w14:ligatures w14:val="standardContextual"/>
         </w:rPr>
       </w:pPr>
-      <w:hyperlink w:anchor="_Toc244072878" w:history="1">
+      <w:hyperlink w:anchor="_Toc244085511" w:history="1">
         <w:r>
           <w:rPr>
             <w:rStyle w:val="aff8"/>
@@ -5013,7 +5013,7 @@
             <w:noProof/>
             <w:webHidden/>
           </w:rPr>
-          <w:instrText xml:space="preserve"> PAGEREF _Toc244072878 \h </w:instrText>
+          <w:instrText xml:space="preserve"> PAGEREF _Toc244085511 \h </w:instrText>
         </w:r>
         <w:r>
           <w:rPr>
@@ -5060,7 +5060,7 @@
           <w14:ligatures w14:val="standardContextual"/>
         </w:rPr>
       </w:pPr>
-      <w:hyperlink w:anchor="_Toc244072879" w:history="1">
+      <w:hyperlink w:anchor="_Toc244085512" w:history="1">
         <w:r>
           <w:rPr>
             <w:rStyle w:val="aff8"/>
@@ -5087,7 +5087,7 @@
             <w:noProof/>
             <w:webHidden/>
           </w:rPr>
-          <w:instrText xml:space="preserve"> PAGEREF _Toc244072879 \h </w:instrText>
+          <w:instrText xml:space="preserve"> PAGEREF _Toc244085512 \h </w:instrText>
         </w:r>
         <w:r>
           <w:rPr>
@@ -5134,7 +5134,7 @@
           <w14:ligatures w14:val="standardContextual"/>
         </w:rPr>
       </w:pPr>
-      <w:hyperlink w:anchor="_Toc244072880" w:history="1">
+      <w:hyperlink w:anchor="_Toc244085513" w:history="1">
         <w:r>
           <w:rPr>
             <w:rStyle w:val="aff8"/>
@@ -5161,7 +5161,7 @@
             <w:noProof/>
             <w:webHidden/>
           </w:rPr>
-          <w:instrText xml:space="preserve"> PAGEREF _Toc244072880 \h </w:instrText>
+          <w:instrText xml:space="preserve"> PAGEREF _Toc244085513 \h </w:instrText>
         </w:r>
         <w:r>
           <w:rPr>
@@ -5208,7 +5208,7 @@
           <w14:ligatures w14:val="standardContextual"/>
         </w:rPr>
       </w:pPr>
-      <w:hyperlink w:anchor="_Toc244072881" w:history="1">
+      <w:hyperlink w:anchor="_Toc244085514" w:history="1">
         <w:r>
           <w:rPr>
             <w:rStyle w:val="aff8"/>
@@ -5235,7 +5235,7 @@
             <w:noProof/>
             <w:webHidden/>
           </w:rPr>
-          <w:instrText xml:space="preserve"> PAGEREF _Toc244072881 \h </w:instrText>
+          <w:instrText xml:space="preserve"> PAGEREF _Toc244085514 \h </w:instrText>
         </w:r>
         <w:r>
           <w:rPr>
@@ -5282,7 +5282,7 @@
           <w14:ligatures w14:val="standardContextual"/>
         </w:rPr>
       </w:pPr>
-      <w:hyperlink w:anchor="_Toc244072882" w:history="1">
+      <w:hyperlink w:anchor="_Toc244085515" w:history="1">
         <w:r>
           <w:rPr>
             <w:rStyle w:val="aff8"/>
@@ -5309,7 +5309,7 @@
             <w:noProof/>
             <w:webHidden/>
           </w:rPr>
-          <w:instrText xml:space="preserve"> PAGEREF _Toc244072882 \h </w:instrText>
+          <w:instrText xml:space="preserve"> PAGEREF _Toc244085515 \h </w:instrText>
         </w:r>
         <w:r>
           <w:rPr>
@@ -5356,7 +5356,7 @@
           <w14:ligatures w14:val="standardContextual"/>
         </w:rPr>
       </w:pPr>
-      <w:hyperlink w:anchor="_Toc244072883" w:history="1">
+      <w:hyperlink w:anchor="_Toc244085516" w:history="1">
         <w:r>
           <w:rPr>
             <w:rStyle w:val="aff8"/>
@@ -5383,7 +5383,7 @@
             <w:noProof/>
             <w:webHidden/>
           </w:rPr>
-          <w:instrText xml:space="preserve"> PAGEREF _Toc244072883 \h </w:instrText>
+          <w:instrText xml:space="preserve"> PAGEREF _Toc244085516 \h </w:instrText>
         </w:r>
         <w:r>
           <w:rPr>
@@ -5430,7 +5430,7 @@
           <w14:ligatures w14:val="standardContextual"/>
         </w:rPr>
       </w:pPr>
-      <w:hyperlink w:anchor="_Toc244072884" w:history="1">
+      <w:hyperlink w:anchor="_Toc244085517" w:history="1">
         <w:r>
           <w:rPr>
             <w:rStyle w:val="aff8"/>
@@ -5457,7 +5457,7 @@
             <w:noProof/>
             <w:webHidden/>
           </w:rPr>
-          <w:instrText xml:space="preserve"> PAGEREF _Toc244072884 \h </w:instrText>
+          <w:instrText xml:space="preserve"> PAGEREF _Toc244085517 \h </w:instrText>
         </w:r>
         <w:r>
           <w:rPr>
@@ -5505,7 +5505,7 @@
       <w:pPr>
         <w:pStyle w:val="1"/>
       </w:pPr>
-      <w:bookmarkStart w:id="2" w:name="_Toc244072820"/>
+      <w:bookmarkStart w:id="2" w:name="_Toc244085453"/>
       <w:r>
         <w:lastRenderedPageBreak/>
         <w:t>1. Введение и постановка задачи</w:t>
@@ -5516,7 +5516,7 @@
       <w:pPr>
         <w:pStyle w:val="21"/>
       </w:pPr>
-      <w:bookmarkStart w:id="3" w:name="_Toc244072821"/>
+      <w:bookmarkStart w:id="3" w:name="_Toc244085454"/>
       <w:r>
         <w:t>1.1. Кейс</w:t>
       </w:r>
@@ -5581,7 +5581,7 @@
       <w:pPr>
         <w:pStyle w:val="21"/>
       </w:pPr>
-      <w:bookmarkStart w:id="4" w:name="_Toc244072822"/>
+      <w:bookmarkStart w:id="4" w:name="_Toc244085455"/>
       <w:r>
         <w:t>1.2. Ценность для фермера и для банка</w:t>
       </w:r>
@@ -5619,7 +5619,7 @@
       <w:pPr>
         <w:pStyle w:val="21"/>
       </w:pPr>
-      <w:bookmarkStart w:id="5" w:name="_Toc244072823"/>
+      <w:bookmarkStart w:id="5" w:name="_Toc244085456"/>
       <w:r>
         <w:t>1.3. Что сделано</w:t>
       </w:r>
@@ -5689,7 +5689,7 @@
       <w:pPr>
         <w:pStyle w:val="21"/>
       </w:pPr>
-      <w:bookmarkStart w:id="6" w:name="_Toc244072824"/>
+      <w:bookmarkStart w:id="6" w:name="_Toc244085457"/>
       <w:r>
         <w:t>1.4. Уровень детализации</w:t>
       </w:r>
@@ -5716,7 +5716,7 @@
       <w:pPr>
         <w:pStyle w:val="1"/>
       </w:pPr>
-      <w:bookmarkStart w:id="7" w:name="_Toc244072825"/>
+      <w:bookmarkStart w:id="7" w:name="_Toc244085458"/>
       <w:r>
         <w:t>2. Обзор методов агропрогноза</w:t>
       </w:r>
@@ -5734,7 +5734,7 @@
       <w:pPr>
         <w:pStyle w:val="21"/>
       </w:pPr>
-      <w:bookmarkStart w:id="8" w:name="_Toc244072826"/>
+      <w:bookmarkStart w:id="8" w:name="_Toc244085459"/>
       <w:r>
         <w:t>2.1. Трендовые и статистические модели</w:t>
       </w:r>
@@ -5755,7 +5755,7 @@
       <w:pPr>
         <w:pStyle w:val="21"/>
       </w:pPr>
-      <w:bookmarkStart w:id="9" w:name="_Toc244072827"/>
+      <w:bookmarkStart w:id="9" w:name="_Toc244085460"/>
       <w:r>
         <w:t>2.2. Агрометеорологические методы Росгидромета</w:t>
       </w:r>
@@ -5776,7 +5776,7 @@
       <w:pPr>
         <w:pStyle w:val="21"/>
       </w:pPr>
-      <w:bookmarkStart w:id="10" w:name="_Toc244072828"/>
+      <w:bookmarkStart w:id="10" w:name="_Toc244085461"/>
       <w:r>
         <w:t>2.3. Процессные модели роста культур</w:t>
       </w:r>
@@ -5797,7 +5797,7 @@
       <w:pPr>
         <w:pStyle w:val="21"/>
       </w:pPr>
-      <w:bookmarkStart w:id="11" w:name="_Toc244072829"/>
+      <w:bookmarkStart w:id="11" w:name="_Toc244085462"/>
       <w:r>
         <w:lastRenderedPageBreak/>
         <w:t>2.4. Спутниковые методы</w:t>
@@ -5819,7 +5819,7 @@
       <w:pPr>
         <w:pStyle w:val="21"/>
       </w:pPr>
-      <w:bookmarkStart w:id="12" w:name="_Toc244072830"/>
+      <w:bookmarkStart w:id="12" w:name="_Toc244085463"/>
       <w:r>
         <w:t>2.5. Машинное обучение и гибридные схемы</w:t>
       </w:r>
@@ -5840,7 +5840,7 @@
       <w:pPr>
         <w:pStyle w:val="21"/>
       </w:pPr>
-      <w:bookmarkStart w:id="13" w:name="_Toc244072831"/>
+      <w:bookmarkStart w:id="13" w:name="_Toc244085464"/>
       <w:r>
         <w:t>2.6. Что из этого следует для решения</w:t>
       </w:r>
@@ -6648,7 +6648,7 @@
       <w:pPr>
         <w:pStyle w:val="1"/>
       </w:pPr>
-      <w:bookmarkStart w:id="14" w:name="_Toc244072832"/>
+      <w:bookmarkStart w:id="14" w:name="_Toc244085465"/>
       <w:r>
         <w:lastRenderedPageBreak/>
         <w:t>3. Данные</w:t>
@@ -6659,7 +6659,7 @@
       <w:pPr>
         <w:pStyle w:val="21"/>
       </w:pPr>
-      <w:bookmarkStart w:id="15" w:name="_Toc244072833"/>
+      <w:bookmarkStart w:id="15" w:name="_Toc244085466"/>
       <w:r>
         <w:t>3.1. Источники</w:t>
       </w:r>
@@ -8474,7 +8474,7 @@
         </w:rPr>
         <w:lastRenderedPageBreak/>
         <w:drawing>
-          <wp:inline distT="0" distB="0" distL="0" distR="0" wp14:anchorId="0A93E58C" wp14:editId="66D9D358">
+          <wp:inline distT="0" distB="0" distL="0" distR="0" wp14:anchorId="281B77C8" wp14:editId="40CF09F9">
             <wp:extent cx="5719431" cy="3146518"/>
             <wp:effectExtent l="0" t="0" r="0" b="0"/>
             <wp:docPr id="1" name="Picture 1"/>
@@ -8528,7 +8528,7 @@
       <w:pPr>
         <w:pStyle w:val="21"/>
       </w:pPr>
-      <w:bookmarkStart w:id="16" w:name="_Toc244072834"/>
+      <w:bookmarkStart w:id="16" w:name="_Toc244085467"/>
       <w:r>
         <w:t>3.2. Покрытие</w:t>
       </w:r>
@@ -8553,7 +8553,7 @@
           <w:noProof/>
         </w:rPr>
         <w:drawing>
-          <wp:inline distT="0" distB="0" distL="0" distR="0" wp14:anchorId="4D8DCC9B" wp14:editId="53EF36E4">
+          <wp:inline distT="0" distB="0" distL="0" distR="0" wp14:anchorId="61BE78E3" wp14:editId="633077BA">
             <wp:extent cx="5832000" cy="2359011"/>
             <wp:effectExtent l="0" t="0" r="0" b="0"/>
             <wp:docPr id="2" name="Picture 2"/>
@@ -9595,7 +9595,7 @@
       <w:pPr>
         <w:pStyle w:val="21"/>
       </w:pPr>
-      <w:bookmarkStart w:id="17" w:name="_Toc244072835"/>
+      <w:bookmarkStart w:id="17" w:name="_Toc244085468"/>
       <w:r>
         <w:t>3.3. Архитектура данных</w:t>
       </w:r>
@@ -9620,7 +9620,7 @@
           <w:noProof/>
         </w:rPr>
         <w:drawing>
-          <wp:inline distT="0" distB="0" distL="0" distR="0" wp14:anchorId="1B19A7D7" wp14:editId="4248A2DF">
+          <wp:inline distT="0" distB="0" distL="0" distR="0" wp14:anchorId="556DFD8D" wp14:editId="77A4E209">
             <wp:extent cx="4630412" cy="2976099"/>
             <wp:effectExtent l="0" t="0" r="0" b="0"/>
             <wp:docPr id="3" name="Picture 3"/>
@@ -11146,7 +11146,7 @@
       <w:pPr>
         <w:pStyle w:val="1"/>
       </w:pPr>
-      <w:bookmarkStart w:id="18" w:name="_Toc244072836"/>
+      <w:bookmarkStart w:id="18" w:name="_Toc244085469"/>
       <w:r>
         <w:t>4. Предобработка и контроль качества</w:t>
       </w:r>
@@ -11156,7 +11156,7 @@
       <w:pPr>
         <w:pStyle w:val="21"/>
       </w:pPr>
-      <w:bookmarkStart w:id="19" w:name="_Toc244072837"/>
+      <w:bookmarkStart w:id="19" w:name="_Toc244085470"/>
       <w:r>
         <w:t>4.1. Чистка урожайности</w:t>
       </w:r>
@@ -12075,7 +12075,7 @@
       <w:pPr>
         <w:pStyle w:val="21"/>
       </w:pPr>
-      <w:bookmarkStart w:id="20" w:name="_Toc244072838"/>
+      <w:bookmarkStart w:id="20" w:name="_Toc244085471"/>
       <w:r>
         <w:t>4.2. Погода: из часов в признаки</w:t>
       </w:r>
@@ -12101,7 +12101,7 @@
       <w:pPr>
         <w:pStyle w:val="21"/>
       </w:pPr>
-      <w:bookmarkStart w:id="21" w:name="_Toc244072839"/>
+      <w:bookmarkStart w:id="21" w:name="_Toc244085472"/>
       <w:r>
         <w:t>4.3. Защита от утечки будущего</w:t>
       </w:r>
@@ -12199,7 +12199,7 @@
       <w:pPr>
         <w:pStyle w:val="21"/>
       </w:pPr>
-      <w:bookmarkStart w:id="22" w:name="_Toc244072840"/>
+      <w:bookmarkStart w:id="22" w:name="_Toc244085473"/>
       <w:r>
         <w:t>4.4. Автоматические тесты</w:t>
       </w:r>
@@ -12307,7 +12307,7 @@
       <w:pPr>
         <w:pStyle w:val="1"/>
       </w:pPr>
-      <w:bookmarkStart w:id="23" w:name="_Toc244072841"/>
+      <w:bookmarkStart w:id="23" w:name="_Toc244085474"/>
       <w:r>
         <w:t>5. Признаки</w:t>
       </w:r>
@@ -12335,7 +12335,7 @@
       <w:pPr>
         <w:pStyle w:val="21"/>
       </w:pPr>
-      <w:bookmarkStart w:id="24" w:name="_Toc244072842"/>
+      <w:bookmarkStart w:id="24" w:name="_Toc244085475"/>
       <w:r>
         <w:t>5.1. Погода по месяцам</w:t>
       </w:r>
@@ -12424,7 +12424,7 @@
           <w:noProof/>
         </w:rPr>
         <w:drawing>
-          <wp:inline distT="0" distB="0" distL="0" distR="0" wp14:anchorId="779D0E97" wp14:editId="5F459EEE">
+          <wp:inline distT="0" distB="0" distL="0" distR="0" wp14:anchorId="0B806EFB" wp14:editId="592E4276">
             <wp:extent cx="5652926" cy="2751644"/>
             <wp:effectExtent l="0" t="0" r="0" b="0"/>
             <wp:docPr id="4" name="Picture 4"/>
@@ -12487,7 +12487,7 @@
       <w:pPr>
         <w:pStyle w:val="21"/>
       </w:pPr>
-      <w:bookmarkStart w:id="25" w:name="_Toc244072843"/>
+      <w:bookmarkStart w:id="25" w:name="_Toc244085476"/>
       <w:r>
         <w:t>5.2. Окна культуры</w:t>
       </w:r>
@@ -12505,7 +12505,7 @@
       <w:pPr>
         <w:pStyle w:val="21"/>
       </w:pPr>
-      <w:bookmarkStart w:id="26" w:name="_Toc244072844"/>
+      <w:bookmarkStart w:id="26" w:name="_Toc244085477"/>
       <w:r>
         <w:t>5.3. Почвы и рельеф</w:t>
       </w:r>
@@ -12523,7 +12523,7 @@
       <w:pPr>
         <w:pStyle w:val="21"/>
       </w:pPr>
-      <w:bookmarkStart w:id="27" w:name="_Toc244072845"/>
+      <w:bookmarkStart w:id="27" w:name="_Toc244085478"/>
       <w:r>
         <w:t>5.4. Спутник</w:t>
       </w:r>
@@ -12541,7 +12541,7 @@
       <w:pPr>
         <w:pStyle w:val="21"/>
       </w:pPr>
-      <w:bookmarkStart w:id="28" w:name="_Toc244072846"/>
+      <w:bookmarkStart w:id="28" w:name="_Toc244085479"/>
       <w:r>
         <w:t>5.5. Регион и прошлые отклонения</w:t>
       </w:r>
@@ -12559,7 +12559,7 @@
       <w:pPr>
         <w:pStyle w:val="21"/>
       </w:pPr>
-      <w:bookmarkStart w:id="29" w:name="_Toc244072847"/>
+      <w:bookmarkStart w:id="29" w:name="_Toc244085480"/>
       <w:r>
         <w:t>5.6. Наборы признаков в эксперименте</w:t>
       </w:r>
@@ -13251,7 +13251,7 @@
       <w:pPr>
         <w:pStyle w:val="1"/>
       </w:pPr>
-      <w:bookmarkStart w:id="30" w:name="_Toc244072848"/>
+      <w:bookmarkStart w:id="30" w:name="_Toc244085481"/>
       <w:r>
         <w:lastRenderedPageBreak/>
         <w:t>6. Методология моделирования и проверки</w:t>
@@ -13262,7 +13262,7 @@
       <w:pPr>
         <w:pStyle w:val="21"/>
       </w:pPr>
-      <w:bookmarkStart w:id="31" w:name="_Toc244072849"/>
+      <w:bookmarkStart w:id="31" w:name="_Toc244085482"/>
       <w:r>
         <w:t>6.1. Модель «тренд × погода»</w:t>
       </w:r>
@@ -13340,7 +13340,7 @@
       <w:pPr>
         <w:pStyle w:val="21"/>
       </w:pPr>
-      <w:bookmarkStart w:id="32" w:name="_Toc244072850"/>
+      <w:bookmarkStart w:id="32" w:name="_Toc244085483"/>
       <w:r>
         <w:t>6.2. Даты прогноза</w:t>
       </w:r>
@@ -13358,7 +13358,7 @@
       <w:pPr>
         <w:pStyle w:val="21"/>
       </w:pPr>
-      <w:bookmarkStart w:id="33" w:name="_Toc244072851"/>
+      <w:bookmarkStart w:id="33" w:name="_Toc244085484"/>
       <w:r>
         <w:t>6.3. Скользящая проверка</w:t>
       </w:r>
@@ -13419,7 +13419,7 @@
       <w:pPr>
         <w:pStyle w:val="21"/>
       </w:pPr>
-      <w:bookmarkStart w:id="34" w:name="_Toc244072852"/>
+      <w:bookmarkStart w:id="34" w:name="_Toc244085485"/>
       <w:r>
         <w:t>6.4. Метрики и бейзлайны</w:t>
       </w:r>
@@ -13526,7 +13526,7 @@
       <w:pPr>
         <w:pStyle w:val="21"/>
       </w:pPr>
-      <w:bookmarkStart w:id="35" w:name="_Toc244072853"/>
+      <w:bookmarkStart w:id="35" w:name="_Toc244085486"/>
       <w:r>
         <w:t>6.5. Интервалы</w:t>
       </w:r>
@@ -13547,7 +13547,7 @@
       <w:pPr>
         <w:pStyle w:val="21"/>
       </w:pPr>
-      <w:bookmarkStart w:id="36" w:name="_Toc244072854"/>
+      <w:bookmarkStart w:id="36" w:name="_Toc244085487"/>
       <w:r>
         <w:t>6.6. Протокол перебора</w:t>
       </w:r>
@@ -14094,7 +14094,7 @@
       <w:pPr>
         <w:pStyle w:val="1"/>
       </w:pPr>
-      <w:bookmarkStart w:id="37" w:name="_Toc244072855"/>
+      <w:bookmarkStart w:id="37" w:name="_Toc244085488"/>
       <w:r>
         <w:t>7. Эксперименты</w:t>
       </w:r>
@@ -14112,7 +14112,7 @@
       <w:pPr>
         <w:pStyle w:val="21"/>
       </w:pPr>
-      <w:bookmarkStart w:id="38" w:name="_Toc244072856"/>
+      <w:bookmarkStart w:id="38" w:name="_Toc244085489"/>
       <w:r>
         <w:lastRenderedPageBreak/>
         <w:t>7.1. Первая модель</w:t>
@@ -14138,7 +14138,7 @@
           <w:noProof/>
         </w:rPr>
         <w:drawing>
-          <wp:inline distT="0" distB="0" distL="0" distR="0" wp14:anchorId="0CEEF5D8" wp14:editId="465A09BA">
+          <wp:inline distT="0" distB="0" distL="0" distR="0" wp14:anchorId="5EB89A4F" wp14:editId="6B04A2B0">
             <wp:extent cx="5420159" cy="2826463"/>
             <wp:effectExtent l="0" t="0" r="0" b="0"/>
             <wp:docPr id="5" name="Picture 5"/>
@@ -14200,7 +14200,7 @@
       <w:pPr>
         <w:pStyle w:val="21"/>
       </w:pPr>
-      <w:bookmarkStart w:id="39" w:name="_Toc244072857"/>
+      <w:bookmarkStart w:id="39" w:name="_Toc244085490"/>
       <w:r>
         <w:t>7.2. Тренд и цель важнее модели</w:t>
       </w:r>
@@ -14225,7 +14225,7 @@
           <w:noProof/>
         </w:rPr>
         <w:drawing>
-          <wp:inline distT="0" distB="0" distL="0" distR="0" wp14:anchorId="07340F7F" wp14:editId="73433654">
+          <wp:inline distT="0" distB="0" distL="0" distR="0" wp14:anchorId="2BE2198C" wp14:editId="1BFAE102">
             <wp:extent cx="3666089" cy="2460686"/>
             <wp:effectExtent l="0" t="0" r="0" b="0"/>
             <wp:docPr id="6" name="Picture 6"/>
@@ -14300,7 +14300,7 @@
       <w:pPr>
         <w:pStyle w:val="21"/>
       </w:pPr>
-      <w:bookmarkStart w:id="40" w:name="_Toc244072858"/>
+      <w:bookmarkStart w:id="40" w:name="_Toc244085491"/>
       <w:r>
         <w:t>7.3. Какие признаки работают</w:t>
       </w:r>
@@ -14317,7 +14317,7 @@
           <w:noProof/>
         </w:rPr>
         <w:drawing>
-          <wp:inline distT="0" distB="0" distL="0" distR="0" wp14:anchorId="74882162" wp14:editId="2575A9F5">
+          <wp:inline distT="0" distB="0" distL="0" distR="0" wp14:anchorId="0296D8B4" wp14:editId="70043619">
             <wp:extent cx="5374437" cy="2664357"/>
             <wp:effectExtent l="0" t="0" r="0" b="0"/>
             <wp:docPr id="7" name="Picture 7"/>
@@ -14379,7 +14379,7 @@
       <w:pPr>
         <w:pStyle w:val="21"/>
       </w:pPr>
-      <w:bookmarkStart w:id="41" w:name="_Toc244072859"/>
+      <w:bookmarkStart w:id="41" w:name="_Toc244085492"/>
       <w:r>
         <w:t>7.4. Спутник: v1 против v2</w:t>
       </w:r>
@@ -14404,7 +14404,7 @@
           <w:noProof/>
         </w:rPr>
         <w:drawing>
-          <wp:inline distT="0" distB="0" distL="0" distR="0" wp14:anchorId="2E05F180" wp14:editId="350E78A4">
+          <wp:inline distT="0" distB="0" distL="0" distR="0" wp14:anchorId="6C9C4C93" wp14:editId="43329F1C">
             <wp:extent cx="5374437" cy="2755802"/>
             <wp:effectExtent l="0" t="0" r="0" b="0"/>
             <wp:docPr id="8" name="Picture 8"/>
@@ -14478,7 +14478,7 @@
       <w:pPr>
         <w:pStyle w:val="21"/>
       </w:pPr>
-      <w:bookmarkStart w:id="42" w:name="_Toc244072860"/>
+      <w:bookmarkStart w:id="42" w:name="_Toc244085493"/>
       <w:r>
         <w:t>7.5. Модели и ансамбли</w:t>
       </w:r>
@@ -14495,7 +14495,7 @@
           <w:noProof/>
         </w:rPr>
         <w:drawing>
-          <wp:inline distT="0" distB="0" distL="0" distR="0" wp14:anchorId="07370DD0" wp14:editId="66199D0E">
+          <wp:inline distT="0" distB="0" distL="0" distR="0" wp14:anchorId="080ECAD2" wp14:editId="3A877F01">
             <wp:extent cx="5615517" cy="2631105"/>
             <wp:effectExtent l="0" t="0" r="0" b="0"/>
             <wp:docPr id="9" name="Picture 9"/>
@@ -15979,7 +15979,7 @@
       <w:pPr>
         <w:pStyle w:val="21"/>
       </w:pPr>
-      <w:bookmarkStart w:id="43" w:name="_Toc244072861"/>
+      <w:bookmarkStart w:id="43" w:name="_Toc244085494"/>
       <w:r>
         <w:t>7.6. Лесенка моделей: от наивной до лучшей</w:t>
       </w:r>
@@ -16094,7 +16094,7 @@
           <w:noProof/>
         </w:rPr>
         <w:drawing>
-          <wp:inline distT="0" distB="0" distL="0" distR="0" wp14:anchorId="7FAB20A3" wp14:editId="63100566">
+          <wp:inline distT="0" distB="0" distL="0" distR="0" wp14:anchorId="7B202359" wp14:editId="1AF9134E">
             <wp:extent cx="4962937" cy="2365084"/>
             <wp:effectExtent l="0" t="0" r="0" b="0"/>
             <wp:docPr id="10" name="Picture 10"/>
@@ -16231,7 +16231,7 @@
         </w:rPr>
         <w:lastRenderedPageBreak/>
         <w:drawing>
-          <wp:inline distT="0" distB="0" distL="0" distR="0" wp14:anchorId="78AC0161" wp14:editId="79BDD295">
+          <wp:inline distT="0" distB="0" distL="0" distR="0" wp14:anchorId="6066687B" wp14:editId="53C32C05">
             <wp:extent cx="5669553" cy="3167302"/>
             <wp:effectExtent l="0" t="0" r="0" b="0"/>
             <wp:docPr id="11" name="Picture 11"/>
@@ -17408,7 +17408,7 @@
           <w:noProof/>
         </w:rPr>
         <w:drawing>
-          <wp:inline distT="0" distB="0" distL="0" distR="0" wp14:anchorId="02449126" wp14:editId="1B810B64">
+          <wp:inline distT="0" distB="0" distL="0" distR="0" wp14:anchorId="017CA6E5" wp14:editId="261B41F6">
             <wp:extent cx="5071007" cy="2257014"/>
             <wp:effectExtent l="0" t="0" r="0" b="0"/>
             <wp:docPr id="12" name="Picture 12"/>
@@ -17470,7 +17470,7 @@
       <w:pPr>
         <w:pStyle w:val="21"/>
       </w:pPr>
-      <w:bookmarkStart w:id="44" w:name="_Toc244072862"/>
+      <w:bookmarkStart w:id="44" w:name="_Toc244085495"/>
       <w:r>
         <w:lastRenderedPageBreak/>
         <w:t>7.7. Прогноз по ходу сезона</w:t>
@@ -17488,7 +17488,7 @@
           <w:noProof/>
         </w:rPr>
         <w:drawing>
-          <wp:inline distT="0" distB="0" distL="0" distR="0" wp14:anchorId="409EB1BB" wp14:editId="23151878">
+          <wp:inline distT="0" distB="0" distL="0" distR="0" wp14:anchorId="7EBE38A1" wp14:editId="628F8204">
             <wp:extent cx="5220644" cy="2489781"/>
             <wp:effectExtent l="0" t="0" r="0" b="0"/>
             <wp:docPr id="13" name="Picture 13"/>
@@ -17550,7 +17550,7 @@
       <w:pPr>
         <w:pStyle w:val="21"/>
       </w:pPr>
-      <w:bookmarkStart w:id="45" w:name="_Toc244072863"/>
+      <w:bookmarkStart w:id="45" w:name="_Toc244085496"/>
       <w:r>
         <w:t>7.8. Итоговые модели</w:t>
       </w:r>
@@ -18684,7 +18684,7 @@
       <w:pPr>
         <w:pStyle w:val="21"/>
       </w:pPr>
-      <w:bookmarkStart w:id="46" w:name="_Toc244072864"/>
+      <w:bookmarkStart w:id="46" w:name="_Toc244085497"/>
       <w:r>
         <w:lastRenderedPageBreak/>
         <w:t>7.9. Ошибка по годам</w:t>
@@ -18702,7 +18702,7 @@
           <w:noProof/>
         </w:rPr>
         <w:drawing>
-          <wp:inline distT="0" distB="0" distL="0" distR="0" wp14:anchorId="7B587CA5" wp14:editId="0CB2C9F8">
+          <wp:inline distT="0" distB="0" distL="0" distR="0" wp14:anchorId="367BCFE9" wp14:editId="46E3EC2B">
             <wp:extent cx="5374437" cy="2248700"/>
             <wp:effectExtent l="0" t="0" r="0" b="0"/>
             <wp:docPr id="14" name="Picture 14"/>
@@ -18771,7 +18771,7 @@
           <w:noProof/>
         </w:rPr>
         <w:drawing>
-          <wp:inline distT="0" distB="0" distL="0" distR="0" wp14:anchorId="41FAE4AB" wp14:editId="51234917">
+          <wp:inline distT="0" distB="0" distL="0" distR="0" wp14:anchorId="30E81540" wp14:editId="5283F3BE">
             <wp:extent cx="5582265" cy="3254589"/>
             <wp:effectExtent l="0" t="0" r="0" b="0"/>
             <wp:docPr id="15" name="Picture 15"/>
@@ -18825,7 +18825,7 @@
       <w:pPr>
         <w:pStyle w:val="1"/>
       </w:pPr>
-      <w:bookmarkStart w:id="47" w:name="_Toc244072865"/>
+      <w:bookmarkStart w:id="47" w:name="_Toc244085498"/>
       <w:r>
         <w:t>8. Интерпретация и неопределённость</w:t>
       </w:r>
@@ -18835,7 +18835,7 @@
       <w:pPr>
         <w:pStyle w:val="21"/>
       </w:pPr>
-      <w:bookmarkStart w:id="48" w:name="_Toc244072866"/>
+      <w:bookmarkStart w:id="48" w:name="_Toc244085499"/>
       <w:r>
         <w:t>8.1. Что двигает прогноз: SHAP</w:t>
       </w:r>
@@ -18864,7 +18864,7 @@
           <w:noProof/>
         </w:rPr>
         <w:drawing>
-          <wp:inline distT="0" distB="0" distL="0" distR="0" wp14:anchorId="51B7D072" wp14:editId="13C47E22">
+          <wp:inline distT="0" distB="0" distL="0" distR="0" wp14:anchorId="2B2AA268" wp14:editId="1DA53637">
             <wp:extent cx="5694492" cy="2938690"/>
             <wp:effectExtent l="0" t="0" r="0" b="0"/>
             <wp:docPr id="16" name="Picture 16"/>
@@ -18933,7 +18933,7 @@
           <w:noProof/>
         </w:rPr>
         <w:drawing>
-          <wp:inline distT="0" distB="0" distL="0" distR="0" wp14:anchorId="74279439" wp14:editId="2D6E3F8D">
+          <wp:inline distT="0" distB="0" distL="0" distR="0" wp14:anchorId="661DABED" wp14:editId="1B599C09">
             <wp:extent cx="4604727" cy="3312000"/>
             <wp:effectExtent l="0" t="0" r="0" b="0"/>
             <wp:docPr id="17" name="Picture 17"/>
@@ -19060,7 +19060,7 @@
       <w:pPr>
         <w:pStyle w:val="21"/>
       </w:pPr>
-      <w:bookmarkStart w:id="49" w:name="_Toc244072867"/>
+      <w:bookmarkStart w:id="49" w:name="_Toc244085500"/>
       <w:r>
         <w:t>8.2. Насколько можно доверять интервалу</w:t>
       </w:r>
@@ -19077,7 +19077,7 @@
           <w:noProof/>
         </w:rPr>
         <w:drawing>
-          <wp:inline distT="0" distB="0" distL="0" distR="0" wp14:anchorId="7988CCFA" wp14:editId="102C7AF9">
+          <wp:inline distT="0" distB="0" distL="0" distR="0" wp14:anchorId="57C3BF30" wp14:editId="0B8A7DF1">
             <wp:extent cx="5374437" cy="2269483"/>
             <wp:effectExtent l="0" t="0" r="0" b="0"/>
             <wp:docPr id="18" name="Picture 18"/>
@@ -19150,7 +19150,7 @@
       <w:pPr>
         <w:pStyle w:val="21"/>
       </w:pPr>
-      <w:bookmarkStart w:id="50" w:name="_Toc244072868"/>
+      <w:bookmarkStart w:id="50" w:name="_Toc244085501"/>
       <w:r>
         <w:t>8.3. Прогноз на 2026 год</w:t>
       </w:r>
@@ -19176,7 +19176,7 @@
         </w:rPr>
         <w:lastRenderedPageBreak/>
         <w:drawing>
-          <wp:inline distT="0" distB="0" distL="0" distR="0" wp14:anchorId="15766885" wp14:editId="7A94636C">
+          <wp:inline distT="0" distB="0" distL="0" distR="0" wp14:anchorId="5B0E306F" wp14:editId="4A6500C5">
             <wp:extent cx="5827502" cy="2606166"/>
             <wp:effectExtent l="0" t="0" r="0" b="0"/>
             <wp:docPr id="19" name="Picture 19"/>
@@ -19241,7 +19241,7 @@
       <w:pPr>
         <w:pStyle w:val="1"/>
       </w:pPr>
-      <w:bookmarkStart w:id="51" w:name="_Toc244072869"/>
+      <w:bookmarkStart w:id="51" w:name="_Toc244085502"/>
       <w:r>
         <w:t>9. Оптимизация структуры посевов</w:t>
       </w:r>
@@ -19259,7 +19259,7 @@
       <w:pPr>
         <w:pStyle w:val="21"/>
       </w:pPr>
-      <w:bookmarkStart w:id="52" w:name="_Toc244072870"/>
+      <w:bookmarkStart w:id="52" w:name="_Toc244085503"/>
       <w:r>
         <w:t>9.1. Постановка</w:t>
       </w:r>
@@ -19506,7 +19506,7 @@
       <w:pPr>
         <w:pStyle w:val="21"/>
       </w:pPr>
-      <w:bookmarkStart w:id="53" w:name="_Toc244072871"/>
+      <w:bookmarkStart w:id="53" w:name="_Toc244085504"/>
       <w:r>
         <w:t>9.2. Данные и допущения</w:t>
       </w:r>
@@ -20054,7 +20054,7 @@
       <w:pPr>
         <w:pStyle w:val="21"/>
       </w:pPr>
-      <w:bookmarkStart w:id="54" w:name="_Toc244072872"/>
+      <w:bookmarkStart w:id="54" w:name="_Toc244085505"/>
       <w:r>
         <w:t>9.3. Эффект малых изменений</w:t>
       </w:r>
@@ -20071,7 +20071,7 @@
           <w:noProof/>
         </w:rPr>
         <w:drawing>
-          <wp:inline distT="0" distB="0" distL="0" distR="0" wp14:anchorId="29B70D6A" wp14:editId="6E8A53A0">
+          <wp:inline distT="0" distB="0" distL="0" distR="0" wp14:anchorId="1FDB555E" wp14:editId="3C66BBC9">
             <wp:extent cx="5781780" cy="2398337"/>
             <wp:effectExtent l="0" t="0" r="0" b="0"/>
             <wp:docPr id="20" name="Picture 20"/>
@@ -21506,7 +21506,7 @@
       <w:pPr>
         <w:pStyle w:val="21"/>
       </w:pPr>
-      <w:bookmarkStart w:id="55" w:name="_Toc244072873"/>
+      <w:bookmarkStart w:id="55" w:name="_Toc244085506"/>
       <w:r>
         <w:t>9.4. Историческая проверка</w:t>
       </w:r>
@@ -21537,7 +21537,7 @@
           <w:noProof/>
         </w:rPr>
         <w:drawing>
-          <wp:inline distT="0" distB="0" distL="0" distR="0" wp14:anchorId="4BB72333" wp14:editId="4BCE41F4">
+          <wp:inline distT="0" distB="0" distL="0" distR="0" wp14:anchorId="4C3ED02E" wp14:editId="20C55D77">
             <wp:extent cx="5832000" cy="2554479"/>
             <wp:effectExtent l="0" t="0" r="0" b="0"/>
             <wp:docPr id="21" name="Picture 21"/>
@@ -22726,7 +22726,7 @@
       <w:pPr>
         <w:pStyle w:val="21"/>
       </w:pPr>
-      <w:bookmarkStart w:id="56" w:name="_Toc244072874"/>
+      <w:bookmarkStart w:id="56" w:name="_Toc244085507"/>
       <w:r>
         <w:t>9.5. Чувствительность</w:t>
       </w:r>
@@ -22743,7 +22743,7 @@
           <w:noProof/>
         </w:rPr>
         <w:drawing>
-          <wp:inline distT="0" distB="0" distL="0" distR="0" wp14:anchorId="42C51318" wp14:editId="1D7A5750">
+          <wp:inline distT="0" distB="0" distL="0" distR="0" wp14:anchorId="4E9F4F28" wp14:editId="50ACA2D2">
             <wp:extent cx="5832000" cy="2514148"/>
             <wp:effectExtent l="0" t="0" r="0" b="0"/>
             <wp:docPr id="22" name="Picture 22"/>
@@ -22805,7 +22805,7 @@
       <w:pPr>
         <w:pStyle w:val="1"/>
       </w:pPr>
-      <w:bookmarkStart w:id="57" w:name="_Toc244072875"/>
+      <w:bookmarkStart w:id="57" w:name="_Toc244085508"/>
       <w:r>
         <w:t>10. Прототип «Агрокаст»</w:t>
       </w:r>
@@ -22856,7 +22856,7 @@
           <w:noProof/>
         </w:rPr>
         <w:drawing>
-          <wp:inline distT="0" distB="0" distL="0" distR="0" wp14:anchorId="7974587F" wp14:editId="7F74086E">
+          <wp:inline distT="0" distB="0" distL="0" distR="0" wp14:anchorId="09EF44B5" wp14:editId="3B2B953E">
             <wp:extent cx="4212000" cy="2808000"/>
             <wp:effectExtent l="0" t="0" r="0" b="0"/>
             <wp:docPr id="23" name="Picture 23"/>
@@ -22931,7 +22931,7 @@
           <w:noProof/>
         </w:rPr>
         <w:drawing>
-          <wp:inline distT="0" distB="0" distL="0" distR="0" wp14:anchorId="21744D63" wp14:editId="05C99853">
+          <wp:inline distT="0" distB="0" distL="0" distR="0" wp14:anchorId="12093BED" wp14:editId="074CA2C1">
             <wp:extent cx="3610285" cy="2807999"/>
             <wp:effectExtent l="0" t="0" r="0" b="0"/>
             <wp:docPr id="24" name="Picture 24"/>
@@ -23007,7 +23007,7 @@
         </w:rPr>
         <w:lastRenderedPageBreak/>
         <w:drawing>
-          <wp:inline distT="0" distB="0" distL="0" distR="0" wp14:anchorId="21E554F6" wp14:editId="75F92CAB">
+          <wp:inline distT="0" distB="0" distL="0" distR="0" wp14:anchorId="220C8DAC" wp14:editId="56A3C4DE">
             <wp:extent cx="3964235" cy="2808000"/>
             <wp:effectExtent l="0" t="0" r="0" b="0"/>
             <wp:docPr id="25" name="Picture 25"/>
@@ -23082,7 +23082,7 @@
           <w:noProof/>
         </w:rPr>
         <w:drawing>
-          <wp:inline distT="0" distB="0" distL="0" distR="0" wp14:anchorId="73338B03" wp14:editId="1B68EBB3">
+          <wp:inline distT="0" distB="0" distL="0" distR="0" wp14:anchorId="63C45A21" wp14:editId="7EC289E3">
             <wp:extent cx="3159000" cy="2808000"/>
             <wp:effectExtent l="0" t="0" r="0" b="0"/>
             <wp:docPr id="26" name="Picture 26"/>
@@ -23158,7 +23158,7 @@
       <w:pPr>
         <w:pStyle w:val="1"/>
       </w:pPr>
-      <w:bookmarkStart w:id="58" w:name="_Toc244072876"/>
+      <w:bookmarkStart w:id="58" w:name="_Toc244085509"/>
       <w:r>
         <w:t>11. Ограничения</w:t>
       </w:r>
@@ -23375,7 +23375,7 @@
       <w:pPr>
         <w:pStyle w:val="1"/>
       </w:pPr>
-      <w:bookmarkStart w:id="59" w:name="_Toc244072877"/>
+      <w:bookmarkStart w:id="59" w:name="_Toc244085510"/>
       <w:r>
         <w:t>12. План развития</w:t>
       </w:r>
@@ -23393,7 +23393,7 @@
       <w:pPr>
         <w:pStyle w:val="21"/>
       </w:pPr>
-      <w:bookmarkStart w:id="60" w:name="_Toc244072878"/>
+      <w:bookmarkStart w:id="60" w:name="_Toc244085511"/>
       <w:r>
         <w:lastRenderedPageBreak/>
         <w:t>12.1. Ближайшие шаги (1–3 месяца)</w:t>
@@ -23460,7 +23460,7 @@
       <w:pPr>
         <w:pStyle w:val="21"/>
       </w:pPr>
-      <w:bookmarkStart w:id="61" w:name="_Toc244072879"/>
+      <w:bookmarkStart w:id="61" w:name="_Toc244085512"/>
       <w:r>
         <w:t>12.2. Развитие продукта (3–12 месяцев)</w:t>
       </w:r>
@@ -23540,7 +23540,7 @@
       <w:pPr>
         <w:pStyle w:val="21"/>
       </w:pPr>
-      <w:bookmarkStart w:id="62" w:name="_Toc244072880"/>
+      <w:bookmarkStart w:id="62" w:name="_Toc244085513"/>
       <w:r>
         <w:t>12.3. Ценность для банка (горизонт 1–2 года)</w:t>
       </w:r>
@@ -23606,7 +23606,7 @@
       <w:pPr>
         <w:pStyle w:val="1"/>
       </w:pPr>
-      <w:bookmarkStart w:id="63" w:name="_Toc244072881"/>
+      <w:bookmarkStart w:id="63" w:name="_Toc244085514"/>
       <w:r>
         <w:t>Заключение</w:t>
       </w:r>
@@ -23749,7 +23749,7 @@
       <w:pPr>
         <w:pStyle w:val="1"/>
       </w:pPr>
-      <w:bookmarkStart w:id="64" w:name="_Toc244072882"/>
+      <w:bookmarkStart w:id="64" w:name="_Toc244085515"/>
       <w:r>
         <w:lastRenderedPageBreak/>
         <w:t>Список источников</w:t>
@@ -23760,7 +23760,7 @@
       <w:pPr>
         <w:pStyle w:val="21"/>
       </w:pPr>
-      <w:bookmarkStart w:id="65" w:name="_Toc244072883"/>
+      <w:bookmarkStart w:id="65" w:name="_Toc244085516"/>
       <w:r>
         <w:t>Литература</w:t>
       </w:r>
@@ -24135,7 +24135,7 @@
       <w:pPr>
         <w:pStyle w:val="21"/>
       </w:pPr>
-      <w:bookmarkStart w:id="66" w:name="_Toc244072884"/>
+      <w:bookmarkStart w:id="66" w:name="_Toc244085517"/>
       <w:r>
         <w:t>Данные</w:t>
       </w:r>
@@ -24534,31 +24534,31 @@
       </w:rPr>
     </w:lvl>
   </w:abstractNum>
-  <w:num w:numId="1" w16cid:durableId="1342733467">
+  <w:num w:numId="1" w16cid:durableId="2131391892">
     <w:abstractNumId w:val="8"/>
   </w:num>
-  <w:num w:numId="2" w16cid:durableId="1566602607">
+  <w:num w:numId="2" w16cid:durableId="776681317">
     <w:abstractNumId w:val="6"/>
   </w:num>
-  <w:num w:numId="3" w16cid:durableId="1626621818">
+  <w:num w:numId="3" w16cid:durableId="19354350">
     <w:abstractNumId w:val="5"/>
   </w:num>
-  <w:num w:numId="4" w16cid:durableId="1406101130">
+  <w:num w:numId="4" w16cid:durableId="1758670961">
     <w:abstractNumId w:val="4"/>
   </w:num>
-  <w:num w:numId="5" w16cid:durableId="24982989">
+  <w:num w:numId="5" w16cid:durableId="1007487531">
     <w:abstractNumId w:val="7"/>
   </w:num>
-  <w:num w:numId="6" w16cid:durableId="1870531456">
+  <w:num w:numId="6" w16cid:durableId="1681196045">
     <w:abstractNumId w:val="3"/>
   </w:num>
-  <w:num w:numId="7" w16cid:durableId="87238700">
+  <w:num w:numId="7" w16cid:durableId="1216967473">
     <w:abstractNumId w:val="2"/>
   </w:num>
-  <w:num w:numId="8" w16cid:durableId="1813935827">
+  <w:num w:numId="8" w16cid:durableId="509637171">
     <w:abstractNumId w:val="1"/>
   </w:num>
-  <w:num w:numId="9" w16cid:durableId="1104887975">
+  <w:num w:numId="9" w16cid:durableId="1729063842">
     <w:abstractNumId w:val="0"/>
   </w:num>
 </w:numbering>
@@ -35981,7 +35981,7 @@
     <w:autoRedefine/>
     <w:uiPriority w:val="39"/>
     <w:unhideWhenUsed/>
-    <w:rsid w:val="00ED7394"/>
+    <w:rsid w:val="000057EE"/>
   </w:style>
   <w:style w:type="paragraph" w:styleId="2c">
     <w:name w:val="toc 2"/>
@@ -35990,7 +35990,7 @@
     <w:autoRedefine/>
     <w:uiPriority w:val="39"/>
     <w:unhideWhenUsed/>
-    <w:rsid w:val="00ED7394"/>
+    <w:rsid w:val="000057EE"/>
     <w:pPr>
       <w:ind w:left="210"/>
     </w:pPr>
@@ -36000,7 +36000,7 @@
     <w:basedOn w:val="a2"/>
     <w:uiPriority w:val="99"/>
     <w:unhideWhenUsed/>
-    <w:rsid w:val="00ED7394"/>
+    <w:rsid w:val="000057EE"/>
     <w:rPr>
       <w:color w:val="0000FF" w:themeColor="hyperlink"/>
       <w:u w:val="single"/>

</xml_diff>

<commit_message>
Report: plot calculator framing on top of the regional forecast, soil/variety/agrotechnique assumptions, fresh screenshots, links
</commit_message>
<xml_diff>
--- a/report/out/rshb_yield_forecast_report.docx
+++ b/report/out/rshb_yield_forecast_report.docx
@@ -113,6 +113,19 @@
       </w:r>
     </w:p>
     <w:p>
+      <w:pPr>
+        <w:spacing w:after="120"/>
+        <w:jc w:val="left"/>
+      </w:pPr>
+      <w:r>
+        <w:rPr>
+          <w:color w:val="2A78D6"/>
+          <w:sz w:val="19"/>
+        </w:rPr>
+        <w:t>Код: https://github.com/Parampaika/AgroCast · Сайт: https://parampaika.github.io/AgroCast/</w:t>
+      </w:r>
+    </w:p>
+    <w:p>
       <w:r>
         <w:br w:type="page"/>
       </w:r>
@@ -121,7 +134,7 @@
       <w:pPr>
         <w:pStyle w:val="1"/>
       </w:pPr>
-      <w:bookmarkStart w:id="0" w:name="_Toc244085451"/>
+      <w:bookmarkStart w:id="0" w:name="_Toc244090944"/>
       <w:r>
         <w:lastRenderedPageBreak/>
         <w:t>Аннотация</w:t>
@@ -133,10 +146,31 @@
         <w:ind w:firstLine="425"/>
       </w:pPr>
       <w:r>
-        <w:t>Кейс «Своё Фермерство → Задача 5» просит калькулятор урожайности: оценить урожай культуры в тоннах на гектар и в общем объёме и показать, как прогноз помогает планировать затраты и доходы. Мы решали задачу как исследование, а не как форму с формулой. Собрали открытые данные по всем субъектам России за 2000–2026 годы из 17 источников, построили воспроизводимый конвейер из четырёх слоёв данных с автоматическими проверками и сравнили на одной честной схеме проверки 4 069</w:t>
-      </w:r>
-      <w:r>
-        <w:t xml:space="preserve"> конфигураций моделей — от «урожай как в прошлом году» до настроенных градиентных бустингов и их ансамблей.</w:t>
+        <w:t xml:space="preserve">Кейс «Своё Фермерство → Задача 5» просит калькулятор урожайности: оценить урожай культуры по площади, почве, климату, сорту и агротехнике в тоннах на гектар и в общем объёме и показать, как прогноз помогает планировать затраты и доходы. Мы решили задачу как </w:t>
+      </w:r>
+      <w:r>
+        <w:rPr>
+          <w:b/>
+        </w:rPr>
+        <w:t>калькулятор участка</w:t>
+      </w:r>
+      <w:r>
+        <w:t xml:space="preserve">, основа которого — </w:t>
+      </w:r>
+      <w:r>
+        <w:rPr>
+          <w:b/>
+        </w:rPr>
+        <w:t>региональный прогноз</w:t>
+      </w:r>
+      <w:r>
+        <w:t xml:space="preserve"> по открытым данным: его мы строили как полноценное исследование. Региональная модель обучена на статистике «субъект РФ × культура × год» и даёт базовый прогноз для региона по погоде и данным сезона; участок хозяйства получает этот прогноз, пересчитанный на его площадь, с поправками на почву, сорт и агротехнику. Эти поправки — множители-допущения, а не результат обучения: открытых данных об урожайности по сортам и агротехнике хозяйств нет. Собрали открытые данные по всем субъектам России за 2000–2026 годы и</w:t>
+      </w:r>
+      <w:r>
+        <w:t xml:space="preserve">з </w:t>
+      </w:r>
+      <w:r>
+        <w:t>17 источников, построили воспроизводимый конвейер из четырёх слоёв данных с автоматическими проверками и сравнили на одной честной схеме проверки 4 069 конфигураций моделей — от «урожай как в прошлом году» до настроенных градиентных бустингов и их ансамблей.</w:t>
       </w:r>
     </w:p>
     <w:p>
@@ -166,7 +200,7 @@
         <w:t>Сверх кейса решена задача оптимизации структуры посевов. Итоговая модель прогоняется на погоде прошлых сезонов, и для любого плана строится распределение прибыли, и линейная программа с мерой риска CVaR ищет план с лучшим сочетанием средней прибыли и прибыли в плохие годы при ограничениях севооборота. На сезон 2026 года сдвиг не более 5 п. п. на культуру поднимает ожидаемую прибыль в среднем на 15 % и даёт выигрыш у 97</w:t>
       </w:r>
       <w:r>
-        <w:t xml:space="preserve"> % субъектов, причём прибыль в плохие годы растёт почти так же. На исторической проверке 2012–2025 годов небольшая перестройка плана (не более 10 п. п. на культуру) дала по факту 1 788 руб. на гектар дополнительной прибыли и оказалась выгоднее текущего плана в 74 % случаев. Результаты доступны в прототипе — статическом сайте «Агрокаст».</w:t>
+        <w:t xml:space="preserve"> % субъектов, причём прибыль в плохие годы растёт почти так же. На исторической проверке 2012–2025 годов небольшая перестройка плана (не более 10 п. п. на культуру) дала по факту 1 788 руб. на гектар дополнительной прибыли и оказалась выгоднее текущего плана в 74 % случаев. Результаты доступны в прототипе — статическом сайте «Агрокаст» (&lt;https://parampaika.github.io/AgroCast/&gt;), код — &lt;https://github.com/Parampaika/AgroCast&gt;.</w:t>
       </w:r>
     </w:p>
     <w:p>
@@ -187,7 +221,7 @@
       <w:pPr>
         <w:pStyle w:val="21"/>
       </w:pPr>
-      <w:bookmarkStart w:id="1" w:name="_Toc244085452"/>
+      <w:bookmarkStart w:id="1" w:name="_Toc244090945"/>
       <w:r>
         <w:t>Ключевые цифры</w:t>
       </w:r>
@@ -370,6 +404,7 @@
                 <w:color w:val="2A78D6"/>
                 <w:sz w:val="38"/>
               </w:rPr>
+              <w:lastRenderedPageBreak/>
               <w:t>−</w:t>
             </w:r>
             <w:r>
@@ -546,7 +581,7 @@
       <w:r>
         <w:fldChar w:fldCharType="separate"/>
       </w:r>
-      <w:hyperlink w:anchor="_Toc244085451" w:history="1">
+      <w:hyperlink w:anchor="_Toc244090944" w:history="1">
         <w:r>
           <w:rPr>
             <w:rStyle w:val="aff8"/>
@@ -573,7 +608,7 @@
             <w:noProof/>
             <w:webHidden/>
           </w:rPr>
-          <w:instrText xml:space="preserve"> PAGEREF _Toc244085451 \h </w:instrText>
+          <w:instrText xml:space="preserve"> PAGEREF _Toc244090944 \h </w:instrText>
         </w:r>
         <w:r>
           <w:rPr>
@@ -620,7 +655,7 @@
           <w14:ligatures w14:val="standardContextual"/>
         </w:rPr>
       </w:pPr>
-      <w:hyperlink w:anchor="_Toc244085452" w:history="1">
+      <w:hyperlink w:anchor="_Toc244090945" w:history="1">
         <w:r>
           <w:rPr>
             <w:rStyle w:val="aff8"/>
@@ -647,7 +682,7 @@
             <w:noProof/>
             <w:webHidden/>
           </w:rPr>
-          <w:instrText xml:space="preserve"> PAGEREF _Toc244085452 \h </w:instrText>
+          <w:instrText xml:space="preserve"> PAGEREF _Toc244090945 \h </w:instrText>
         </w:r>
         <w:r>
           <w:rPr>
@@ -694,7 +729,7 @@
           <w14:ligatures w14:val="standardContextual"/>
         </w:rPr>
       </w:pPr>
-      <w:hyperlink w:anchor="_Toc244085453" w:history="1">
+      <w:hyperlink w:anchor="_Toc244090946" w:history="1">
         <w:r>
           <w:rPr>
             <w:rStyle w:val="aff8"/>
@@ -721,7 +756,7 @@
             <w:noProof/>
             <w:webHidden/>
           </w:rPr>
-          <w:instrText xml:space="preserve"> PAGEREF _Toc244085453 \h </w:instrText>
+          <w:instrText xml:space="preserve"> PAGEREF _Toc244090946 \h </w:instrText>
         </w:r>
         <w:r>
           <w:rPr>
@@ -741,7 +776,7 @@
             <w:noProof/>
             <w:webHidden/>
           </w:rPr>
-          <w:t>5</w:t>
+          <w:t>6</w:t>
         </w:r>
         <w:r>
           <w:rPr>
@@ -768,7 +803,7 @@
           <w14:ligatures w14:val="standardContextual"/>
         </w:rPr>
       </w:pPr>
-      <w:hyperlink w:anchor="_Toc244085454" w:history="1">
+      <w:hyperlink w:anchor="_Toc244090947" w:history="1">
         <w:r>
           <w:rPr>
             <w:rStyle w:val="aff8"/>
@@ -795,7 +830,7 @@
             <w:noProof/>
             <w:webHidden/>
           </w:rPr>
-          <w:instrText xml:space="preserve"> PAGEREF _Toc244085454 \h </w:instrText>
+          <w:instrText xml:space="preserve"> PAGEREF _Toc244090947 \h </w:instrText>
         </w:r>
         <w:r>
           <w:rPr>
@@ -815,7 +850,7 @@
             <w:noProof/>
             <w:webHidden/>
           </w:rPr>
-          <w:t>5</w:t>
+          <w:t>6</w:t>
         </w:r>
         <w:r>
           <w:rPr>
@@ -842,7 +877,7 @@
           <w14:ligatures w14:val="standardContextual"/>
         </w:rPr>
       </w:pPr>
-      <w:hyperlink w:anchor="_Toc244085455" w:history="1">
+      <w:hyperlink w:anchor="_Toc244090948" w:history="1">
         <w:r>
           <w:rPr>
             <w:rStyle w:val="aff8"/>
@@ -869,7 +904,7 @@
             <w:noProof/>
             <w:webHidden/>
           </w:rPr>
-          <w:instrText xml:space="preserve"> PAGEREF _Toc244085455 \h </w:instrText>
+          <w:instrText xml:space="preserve"> PAGEREF _Toc244090948 \h </w:instrText>
         </w:r>
         <w:r>
           <w:rPr>
@@ -889,7 +924,7 @@
             <w:noProof/>
             <w:webHidden/>
           </w:rPr>
-          <w:t>5</w:t>
+          <w:t>6</w:t>
         </w:r>
         <w:r>
           <w:rPr>
@@ -916,7 +951,7 @@
           <w14:ligatures w14:val="standardContextual"/>
         </w:rPr>
       </w:pPr>
-      <w:hyperlink w:anchor="_Toc244085456" w:history="1">
+      <w:hyperlink w:anchor="_Toc244090949" w:history="1">
         <w:r>
           <w:rPr>
             <w:rStyle w:val="aff8"/>
@@ -943,7 +978,7 @@
             <w:noProof/>
             <w:webHidden/>
           </w:rPr>
-          <w:instrText xml:space="preserve"> PAGEREF _Toc244085456 \h </w:instrText>
+          <w:instrText xml:space="preserve"> PAGEREF _Toc244090949 \h </w:instrText>
         </w:r>
         <w:r>
           <w:rPr>
@@ -963,7 +998,7 @@
             <w:noProof/>
             <w:webHidden/>
           </w:rPr>
-          <w:t>5</w:t>
+          <w:t>6</w:t>
         </w:r>
         <w:r>
           <w:rPr>
@@ -990,7 +1025,7 @@
           <w14:ligatures w14:val="standardContextual"/>
         </w:rPr>
       </w:pPr>
-      <w:hyperlink w:anchor="_Toc244085457" w:history="1">
+      <w:hyperlink w:anchor="_Toc244090950" w:history="1">
         <w:r>
           <w:rPr>
             <w:rStyle w:val="aff8"/>
@@ -1017,7 +1052,7 @@
             <w:noProof/>
             <w:webHidden/>
           </w:rPr>
-          <w:instrText xml:space="preserve"> PAGEREF _Toc244085457 \h </w:instrText>
+          <w:instrText xml:space="preserve"> PAGEREF _Toc244090950 \h </w:instrText>
         </w:r>
         <w:r>
           <w:rPr>
@@ -1037,7 +1072,7 @@
             <w:noProof/>
             <w:webHidden/>
           </w:rPr>
-          <w:t>6</w:t>
+          <w:t>7</w:t>
         </w:r>
         <w:r>
           <w:rPr>
@@ -1064,7 +1099,7 @@
           <w14:ligatures w14:val="standardContextual"/>
         </w:rPr>
       </w:pPr>
-      <w:hyperlink w:anchor="_Toc244085458" w:history="1">
+      <w:hyperlink w:anchor="_Toc244090951" w:history="1">
         <w:r>
           <w:rPr>
             <w:rStyle w:val="aff8"/>
@@ -1091,7 +1126,7 @@
             <w:noProof/>
             <w:webHidden/>
           </w:rPr>
-          <w:instrText xml:space="preserve"> PAGEREF _Toc244085458 \h </w:instrText>
+          <w:instrText xml:space="preserve"> PAGEREF _Toc244090951 \h </w:instrText>
         </w:r>
         <w:r>
           <w:rPr>
@@ -1111,7 +1146,7 @@
             <w:noProof/>
             <w:webHidden/>
           </w:rPr>
-          <w:t>6</w:t>
+          <w:t>7</w:t>
         </w:r>
         <w:r>
           <w:rPr>
@@ -1138,7 +1173,7 @@
           <w14:ligatures w14:val="standardContextual"/>
         </w:rPr>
       </w:pPr>
-      <w:hyperlink w:anchor="_Toc244085459" w:history="1">
+      <w:hyperlink w:anchor="_Toc244090952" w:history="1">
         <w:r>
           <w:rPr>
             <w:rStyle w:val="aff8"/>
@@ -1165,7 +1200,7 @@
             <w:noProof/>
             <w:webHidden/>
           </w:rPr>
-          <w:instrText xml:space="preserve"> PAGEREF _Toc244085459 \h </w:instrText>
+          <w:instrText xml:space="preserve"> PAGEREF _Toc244090952 \h </w:instrText>
         </w:r>
         <w:r>
           <w:rPr>
@@ -1185,7 +1220,7 @@
             <w:noProof/>
             <w:webHidden/>
           </w:rPr>
-          <w:t>6</w:t>
+          <w:t>7</w:t>
         </w:r>
         <w:r>
           <w:rPr>
@@ -1212,7 +1247,7 @@
           <w14:ligatures w14:val="standardContextual"/>
         </w:rPr>
       </w:pPr>
-      <w:hyperlink w:anchor="_Toc244085460" w:history="1">
+      <w:hyperlink w:anchor="_Toc244090953" w:history="1">
         <w:r>
           <w:rPr>
             <w:rStyle w:val="aff8"/>
@@ -1239,7 +1274,7 @@
             <w:noProof/>
             <w:webHidden/>
           </w:rPr>
-          <w:instrText xml:space="preserve"> PAGEREF _Toc244085460 \h </w:instrText>
+          <w:instrText xml:space="preserve"> PAGEREF _Toc244090953 \h </w:instrText>
         </w:r>
         <w:r>
           <w:rPr>
@@ -1259,7 +1294,7 @@
             <w:noProof/>
             <w:webHidden/>
           </w:rPr>
-          <w:t>6</w:t>
+          <w:t>7</w:t>
         </w:r>
         <w:r>
           <w:rPr>
@@ -1286,7 +1321,7 @@
           <w14:ligatures w14:val="standardContextual"/>
         </w:rPr>
       </w:pPr>
-      <w:hyperlink w:anchor="_Toc244085461" w:history="1">
+      <w:hyperlink w:anchor="_Toc244090954" w:history="1">
         <w:r>
           <w:rPr>
             <w:rStyle w:val="aff8"/>
@@ -1313,7 +1348,7 @@
             <w:noProof/>
             <w:webHidden/>
           </w:rPr>
-          <w:instrText xml:space="preserve"> PAGEREF _Toc244085461 \h </w:instrText>
+          <w:instrText xml:space="preserve"> PAGEREF _Toc244090954 \h </w:instrText>
         </w:r>
         <w:r>
           <w:rPr>
@@ -1333,7 +1368,7 @@
             <w:noProof/>
             <w:webHidden/>
           </w:rPr>
-          <w:t>6</w:t>
+          <w:t>8</w:t>
         </w:r>
         <w:r>
           <w:rPr>
@@ -1360,7 +1395,7 @@
           <w14:ligatures w14:val="standardContextual"/>
         </w:rPr>
       </w:pPr>
-      <w:hyperlink w:anchor="_Toc244085462" w:history="1">
+      <w:hyperlink w:anchor="_Toc244090955" w:history="1">
         <w:r>
           <w:rPr>
             <w:rStyle w:val="aff8"/>
@@ -1387,7 +1422,7 @@
             <w:noProof/>
             <w:webHidden/>
           </w:rPr>
-          <w:instrText xml:space="preserve"> PAGEREF _Toc244085462 \h </w:instrText>
+          <w:instrText xml:space="preserve"> PAGEREF _Toc244090955 \h </w:instrText>
         </w:r>
         <w:r>
           <w:rPr>
@@ -1407,7 +1442,7 @@
             <w:noProof/>
             <w:webHidden/>
           </w:rPr>
-          <w:t>7</w:t>
+          <w:t>8</w:t>
         </w:r>
         <w:r>
           <w:rPr>
@@ -1434,7 +1469,7 @@
           <w14:ligatures w14:val="standardContextual"/>
         </w:rPr>
       </w:pPr>
-      <w:hyperlink w:anchor="_Toc244085463" w:history="1">
+      <w:hyperlink w:anchor="_Toc244090956" w:history="1">
         <w:r>
           <w:rPr>
             <w:rStyle w:val="aff8"/>
@@ -1461,7 +1496,7 @@
             <w:noProof/>
             <w:webHidden/>
           </w:rPr>
-          <w:instrText xml:space="preserve"> PAGEREF _Toc244085463 \h </w:instrText>
+          <w:instrText xml:space="preserve"> PAGEREF _Toc244090956 \h </w:instrText>
         </w:r>
         <w:r>
           <w:rPr>
@@ -1481,7 +1516,7 @@
             <w:noProof/>
             <w:webHidden/>
           </w:rPr>
-          <w:t>7</w:t>
+          <w:t>8</w:t>
         </w:r>
         <w:r>
           <w:rPr>
@@ -1508,7 +1543,7 @@
           <w14:ligatures w14:val="standardContextual"/>
         </w:rPr>
       </w:pPr>
-      <w:hyperlink w:anchor="_Toc244085464" w:history="1">
+      <w:hyperlink w:anchor="_Toc244090957" w:history="1">
         <w:r>
           <w:rPr>
             <w:rStyle w:val="aff8"/>
@@ -1535,7 +1570,7 @@
             <w:noProof/>
             <w:webHidden/>
           </w:rPr>
-          <w:instrText xml:space="preserve"> PAGEREF _Toc244085464 \h </w:instrText>
+          <w:instrText xml:space="preserve"> PAGEREF _Toc244090957 \h </w:instrText>
         </w:r>
         <w:r>
           <w:rPr>
@@ -1555,7 +1590,7 @@
             <w:noProof/>
             <w:webHidden/>
           </w:rPr>
-          <w:t>7</w:t>
+          <w:t>8</w:t>
         </w:r>
         <w:r>
           <w:rPr>
@@ -1582,7 +1617,7 @@
           <w14:ligatures w14:val="standardContextual"/>
         </w:rPr>
       </w:pPr>
-      <w:hyperlink w:anchor="_Toc244085465" w:history="1">
+      <w:hyperlink w:anchor="_Toc244090958" w:history="1">
         <w:r>
           <w:rPr>
             <w:rStyle w:val="aff8"/>
@@ -1609,7 +1644,7 @@
             <w:noProof/>
             <w:webHidden/>
           </w:rPr>
-          <w:instrText xml:space="preserve"> PAGEREF _Toc244085465 \h </w:instrText>
+          <w:instrText xml:space="preserve"> PAGEREF _Toc244090958 \h </w:instrText>
         </w:r>
         <w:r>
           <w:rPr>
@@ -1629,7 +1664,7 @@
             <w:noProof/>
             <w:webHidden/>
           </w:rPr>
-          <w:t>8</w:t>
+          <w:t>9</w:t>
         </w:r>
         <w:r>
           <w:rPr>
@@ -1656,7 +1691,7 @@
           <w14:ligatures w14:val="standardContextual"/>
         </w:rPr>
       </w:pPr>
-      <w:hyperlink w:anchor="_Toc244085466" w:history="1">
+      <w:hyperlink w:anchor="_Toc244090959" w:history="1">
         <w:r>
           <w:rPr>
             <w:rStyle w:val="aff8"/>
@@ -1683,7 +1718,7 @@
             <w:noProof/>
             <w:webHidden/>
           </w:rPr>
-          <w:instrText xml:space="preserve"> PAGEREF _Toc244085466 \h </w:instrText>
+          <w:instrText xml:space="preserve"> PAGEREF _Toc244090959 \h </w:instrText>
         </w:r>
         <w:r>
           <w:rPr>
@@ -1703,7 +1738,7 @@
             <w:noProof/>
             <w:webHidden/>
           </w:rPr>
-          <w:t>8</w:t>
+          <w:t>9</w:t>
         </w:r>
         <w:r>
           <w:rPr>
@@ -1730,7 +1765,7 @@
           <w14:ligatures w14:val="standardContextual"/>
         </w:rPr>
       </w:pPr>
-      <w:hyperlink w:anchor="_Toc244085467" w:history="1">
+      <w:hyperlink w:anchor="_Toc244090960" w:history="1">
         <w:r>
           <w:rPr>
             <w:rStyle w:val="aff8"/>
@@ -1757,7 +1792,7 @@
             <w:noProof/>
             <w:webHidden/>
           </w:rPr>
-          <w:instrText xml:space="preserve"> PAGEREF _Toc244085467 \h </w:instrText>
+          <w:instrText xml:space="preserve"> PAGEREF _Toc244090960 \h </w:instrText>
         </w:r>
         <w:r>
           <w:rPr>
@@ -1777,7 +1812,7 @@
             <w:noProof/>
             <w:webHidden/>
           </w:rPr>
-          <w:t>9</w:t>
+          <w:t>10</w:t>
         </w:r>
         <w:r>
           <w:rPr>
@@ -1804,7 +1839,7 @@
           <w14:ligatures w14:val="standardContextual"/>
         </w:rPr>
       </w:pPr>
-      <w:hyperlink w:anchor="_Toc244085468" w:history="1">
+      <w:hyperlink w:anchor="_Toc244090961" w:history="1">
         <w:r>
           <w:rPr>
             <w:rStyle w:val="aff8"/>
@@ -1831,7 +1866,7 @@
             <w:noProof/>
             <w:webHidden/>
           </w:rPr>
-          <w:instrText xml:space="preserve"> PAGEREF _Toc244085468 \h </w:instrText>
+          <w:instrText xml:space="preserve"> PAGEREF _Toc244090961 \h </w:instrText>
         </w:r>
         <w:r>
           <w:rPr>
@@ -1851,7 +1886,7 @@
             <w:noProof/>
             <w:webHidden/>
           </w:rPr>
-          <w:t>10</w:t>
+          <w:t>11</w:t>
         </w:r>
         <w:r>
           <w:rPr>
@@ -1878,7 +1913,7 @@
           <w14:ligatures w14:val="standardContextual"/>
         </w:rPr>
       </w:pPr>
-      <w:hyperlink w:anchor="_Toc244085469" w:history="1">
+      <w:hyperlink w:anchor="_Toc244090962" w:history="1">
         <w:r>
           <w:rPr>
             <w:rStyle w:val="aff8"/>
@@ -1905,7 +1940,7 @@
             <w:noProof/>
             <w:webHidden/>
           </w:rPr>
-          <w:instrText xml:space="preserve"> PAGEREF _Toc244085469 \h </w:instrText>
+          <w:instrText xml:space="preserve"> PAGEREF _Toc244090962 \h </w:instrText>
         </w:r>
         <w:r>
           <w:rPr>
@@ -1925,7 +1960,7 @@
             <w:noProof/>
             <w:webHidden/>
           </w:rPr>
-          <w:t>11</w:t>
+          <w:t>12</w:t>
         </w:r>
         <w:r>
           <w:rPr>
@@ -1952,7 +1987,7 @@
           <w14:ligatures w14:val="standardContextual"/>
         </w:rPr>
       </w:pPr>
-      <w:hyperlink w:anchor="_Toc244085470" w:history="1">
+      <w:hyperlink w:anchor="_Toc244090963" w:history="1">
         <w:r>
           <w:rPr>
             <w:rStyle w:val="aff8"/>
@@ -1979,7 +2014,7 @@
             <w:noProof/>
             <w:webHidden/>
           </w:rPr>
-          <w:instrText xml:space="preserve"> PAGEREF _Toc244085470 \h </w:instrText>
+          <w:instrText xml:space="preserve"> PAGEREF _Toc244090963 \h </w:instrText>
         </w:r>
         <w:r>
           <w:rPr>
@@ -1999,7 +2034,7 @@
             <w:noProof/>
             <w:webHidden/>
           </w:rPr>
-          <w:t>11</w:t>
+          <w:t>12</w:t>
         </w:r>
         <w:r>
           <w:rPr>
@@ -2026,7 +2061,7 @@
           <w14:ligatures w14:val="standardContextual"/>
         </w:rPr>
       </w:pPr>
-      <w:hyperlink w:anchor="_Toc244085471" w:history="1">
+      <w:hyperlink w:anchor="_Toc244090964" w:history="1">
         <w:r>
           <w:rPr>
             <w:rStyle w:val="aff8"/>
@@ -2053,7 +2088,7 @@
             <w:noProof/>
             <w:webHidden/>
           </w:rPr>
-          <w:instrText xml:space="preserve"> PAGEREF _Toc244085471 \h </w:instrText>
+          <w:instrText xml:space="preserve"> PAGEREF _Toc244090964 \h </w:instrText>
         </w:r>
         <w:r>
           <w:rPr>
@@ -2073,7 +2108,7 @@
             <w:noProof/>
             <w:webHidden/>
           </w:rPr>
-          <w:t>12</w:t>
+          <w:t>13</w:t>
         </w:r>
         <w:r>
           <w:rPr>
@@ -2100,7 +2135,7 @@
           <w14:ligatures w14:val="standardContextual"/>
         </w:rPr>
       </w:pPr>
-      <w:hyperlink w:anchor="_Toc244085472" w:history="1">
+      <w:hyperlink w:anchor="_Toc244090965" w:history="1">
         <w:r>
           <w:rPr>
             <w:rStyle w:val="aff8"/>
@@ -2127,7 +2162,7 @@
             <w:noProof/>
             <w:webHidden/>
           </w:rPr>
-          <w:instrText xml:space="preserve"> PAGEREF _Toc244085472 \h </w:instrText>
+          <w:instrText xml:space="preserve"> PAGEREF _Toc244090965 \h </w:instrText>
         </w:r>
         <w:r>
           <w:rPr>
@@ -2147,7 +2182,7 @@
             <w:noProof/>
             <w:webHidden/>
           </w:rPr>
-          <w:t>12</w:t>
+          <w:t>13</w:t>
         </w:r>
         <w:r>
           <w:rPr>
@@ -2174,7 +2209,7 @@
           <w14:ligatures w14:val="standardContextual"/>
         </w:rPr>
       </w:pPr>
-      <w:hyperlink w:anchor="_Toc244085473" w:history="1">
+      <w:hyperlink w:anchor="_Toc244090966" w:history="1">
         <w:r>
           <w:rPr>
             <w:rStyle w:val="aff8"/>
@@ -2201,7 +2236,7 @@
             <w:noProof/>
             <w:webHidden/>
           </w:rPr>
-          <w:instrText xml:space="preserve"> PAGEREF _Toc244085473 \h </w:instrText>
+          <w:instrText xml:space="preserve"> PAGEREF _Toc244090966 \h </w:instrText>
         </w:r>
         <w:r>
           <w:rPr>
@@ -2221,7 +2256,7 @@
             <w:noProof/>
             <w:webHidden/>
           </w:rPr>
-          <w:t>12</w:t>
+          <w:t>13</w:t>
         </w:r>
         <w:r>
           <w:rPr>
@@ -2248,7 +2283,7 @@
           <w14:ligatures w14:val="standardContextual"/>
         </w:rPr>
       </w:pPr>
-      <w:hyperlink w:anchor="_Toc244085474" w:history="1">
+      <w:hyperlink w:anchor="_Toc244090967" w:history="1">
         <w:r>
           <w:rPr>
             <w:rStyle w:val="aff8"/>
@@ -2275,7 +2310,7 @@
             <w:noProof/>
             <w:webHidden/>
           </w:rPr>
-          <w:instrText xml:space="preserve"> PAGEREF _Toc244085474 \h </w:instrText>
+          <w:instrText xml:space="preserve"> PAGEREF _Toc244090967 \h </w:instrText>
         </w:r>
         <w:r>
           <w:rPr>
@@ -2295,7 +2330,7 @@
             <w:noProof/>
             <w:webHidden/>
           </w:rPr>
-          <w:t>13</w:t>
+          <w:t>14</w:t>
         </w:r>
         <w:r>
           <w:rPr>
@@ -2322,7 +2357,7 @@
           <w14:ligatures w14:val="standardContextual"/>
         </w:rPr>
       </w:pPr>
-      <w:hyperlink w:anchor="_Toc244085475" w:history="1">
+      <w:hyperlink w:anchor="_Toc244090968" w:history="1">
         <w:r>
           <w:rPr>
             <w:rStyle w:val="aff8"/>
@@ -2349,7 +2384,7 @@
             <w:noProof/>
             <w:webHidden/>
           </w:rPr>
-          <w:instrText xml:space="preserve"> PAGEREF _Toc244085475 \h </w:instrText>
+          <w:instrText xml:space="preserve"> PAGEREF _Toc244090968 \h </w:instrText>
         </w:r>
         <w:r>
           <w:rPr>
@@ -2369,7 +2404,7 @@
             <w:noProof/>
             <w:webHidden/>
           </w:rPr>
-          <w:t>13</w:t>
+          <w:t>14</w:t>
         </w:r>
         <w:r>
           <w:rPr>
@@ -2396,7 +2431,7 @@
           <w14:ligatures w14:val="standardContextual"/>
         </w:rPr>
       </w:pPr>
-      <w:hyperlink w:anchor="_Toc244085476" w:history="1">
+      <w:hyperlink w:anchor="_Toc244090969" w:history="1">
         <w:r>
           <w:rPr>
             <w:rStyle w:val="aff8"/>
@@ -2423,7 +2458,7 @@
             <w:noProof/>
             <w:webHidden/>
           </w:rPr>
-          <w:instrText xml:space="preserve"> PAGEREF _Toc244085476 \h </w:instrText>
+          <w:instrText xml:space="preserve"> PAGEREF _Toc244090969 \h </w:instrText>
         </w:r>
         <w:r>
           <w:rPr>
@@ -2443,7 +2478,7 @@
             <w:noProof/>
             <w:webHidden/>
           </w:rPr>
-          <w:t>14</w:t>
+          <w:t>15</w:t>
         </w:r>
         <w:r>
           <w:rPr>
@@ -2470,7 +2505,7 @@
           <w14:ligatures w14:val="standardContextual"/>
         </w:rPr>
       </w:pPr>
-      <w:hyperlink w:anchor="_Toc244085477" w:history="1">
+      <w:hyperlink w:anchor="_Toc244090970" w:history="1">
         <w:r>
           <w:rPr>
             <w:rStyle w:val="aff8"/>
@@ -2497,7 +2532,7 @@
             <w:noProof/>
             <w:webHidden/>
           </w:rPr>
-          <w:instrText xml:space="preserve"> PAGEREF _Toc244085477 \h </w:instrText>
+          <w:instrText xml:space="preserve"> PAGEREF _Toc244090970 \h </w:instrText>
         </w:r>
         <w:r>
           <w:rPr>
@@ -2517,7 +2552,7 @@
             <w:noProof/>
             <w:webHidden/>
           </w:rPr>
-          <w:t>14</w:t>
+          <w:t>15</w:t>
         </w:r>
         <w:r>
           <w:rPr>
@@ -2544,7 +2579,7 @@
           <w14:ligatures w14:val="standardContextual"/>
         </w:rPr>
       </w:pPr>
-      <w:hyperlink w:anchor="_Toc244085478" w:history="1">
+      <w:hyperlink w:anchor="_Toc244090971" w:history="1">
         <w:r>
           <w:rPr>
             <w:rStyle w:val="aff8"/>
@@ -2571,7 +2606,7 @@
             <w:noProof/>
             <w:webHidden/>
           </w:rPr>
-          <w:instrText xml:space="preserve"> PAGEREF _Toc244085478 \h </w:instrText>
+          <w:instrText xml:space="preserve"> PAGEREF _Toc244090971 \h </w:instrText>
         </w:r>
         <w:r>
           <w:rPr>
@@ -2591,7 +2626,7 @@
             <w:noProof/>
             <w:webHidden/>
           </w:rPr>
-          <w:t>14</w:t>
+          <w:t>15</w:t>
         </w:r>
         <w:r>
           <w:rPr>
@@ -2618,7 +2653,7 @@
           <w14:ligatures w14:val="standardContextual"/>
         </w:rPr>
       </w:pPr>
-      <w:hyperlink w:anchor="_Toc244085479" w:history="1">
+      <w:hyperlink w:anchor="_Toc244090972" w:history="1">
         <w:r>
           <w:rPr>
             <w:rStyle w:val="aff8"/>
@@ -2645,7 +2680,7 @@
             <w:noProof/>
             <w:webHidden/>
           </w:rPr>
-          <w:instrText xml:space="preserve"> PAGEREF _Toc244085479 \h </w:instrText>
+          <w:instrText xml:space="preserve"> PAGEREF _Toc244090972 \h </w:instrText>
         </w:r>
         <w:r>
           <w:rPr>
@@ -2665,7 +2700,7 @@
             <w:noProof/>
             <w:webHidden/>
           </w:rPr>
-          <w:t>14</w:t>
+          <w:t>15</w:t>
         </w:r>
         <w:r>
           <w:rPr>
@@ -2692,7 +2727,7 @@
           <w14:ligatures w14:val="standardContextual"/>
         </w:rPr>
       </w:pPr>
-      <w:hyperlink w:anchor="_Toc244085480" w:history="1">
+      <w:hyperlink w:anchor="_Toc244090973" w:history="1">
         <w:r>
           <w:rPr>
             <w:rStyle w:val="aff8"/>
@@ -2719,7 +2754,7 @@
             <w:noProof/>
             <w:webHidden/>
           </w:rPr>
-          <w:instrText xml:space="preserve"> PAGEREF _Toc244085480 \h </w:instrText>
+          <w:instrText xml:space="preserve"> PAGEREF _Toc244090973 \h </w:instrText>
         </w:r>
         <w:r>
           <w:rPr>
@@ -2739,7 +2774,7 @@
             <w:noProof/>
             <w:webHidden/>
           </w:rPr>
-          <w:t>14</w:t>
+          <w:t>15</w:t>
         </w:r>
         <w:r>
           <w:rPr>
@@ -2766,7 +2801,7 @@
           <w14:ligatures w14:val="standardContextual"/>
         </w:rPr>
       </w:pPr>
-      <w:hyperlink w:anchor="_Toc244085481" w:history="1">
+      <w:hyperlink w:anchor="_Toc244090974" w:history="1">
         <w:r>
           <w:rPr>
             <w:rStyle w:val="aff8"/>
@@ -2793,7 +2828,7 @@
             <w:noProof/>
             <w:webHidden/>
           </w:rPr>
-          <w:instrText xml:space="preserve"> PAGEREF _Toc244085481 \h </w:instrText>
+          <w:instrText xml:space="preserve"> PAGEREF _Toc244090974 \h </w:instrText>
         </w:r>
         <w:r>
           <w:rPr>
@@ -2813,7 +2848,7 @@
             <w:noProof/>
             <w:webHidden/>
           </w:rPr>
-          <w:t>15</w:t>
+          <w:t>16</w:t>
         </w:r>
         <w:r>
           <w:rPr>
@@ -2840,7 +2875,7 @@
           <w14:ligatures w14:val="standardContextual"/>
         </w:rPr>
       </w:pPr>
-      <w:hyperlink w:anchor="_Toc244085482" w:history="1">
+      <w:hyperlink w:anchor="_Toc244090975" w:history="1">
         <w:r>
           <w:rPr>
             <w:rStyle w:val="aff8"/>
@@ -2867,7 +2902,7 @@
             <w:noProof/>
             <w:webHidden/>
           </w:rPr>
-          <w:instrText xml:space="preserve"> PAGEREF _Toc244085482 \h </w:instrText>
+          <w:instrText xml:space="preserve"> PAGEREF _Toc244090975 \h </w:instrText>
         </w:r>
         <w:r>
           <w:rPr>
@@ -2887,7 +2922,7 @@
             <w:noProof/>
             <w:webHidden/>
           </w:rPr>
-          <w:t>15</w:t>
+          <w:t>16</w:t>
         </w:r>
         <w:r>
           <w:rPr>
@@ -2914,7 +2949,7 @@
           <w14:ligatures w14:val="standardContextual"/>
         </w:rPr>
       </w:pPr>
-      <w:hyperlink w:anchor="_Toc244085483" w:history="1">
+      <w:hyperlink w:anchor="_Toc244090976" w:history="1">
         <w:r>
           <w:rPr>
             <w:rStyle w:val="aff8"/>
@@ -2941,7 +2976,7 @@
             <w:noProof/>
             <w:webHidden/>
           </w:rPr>
-          <w:instrText xml:space="preserve"> PAGEREF _Toc244085483 \h </w:instrText>
+          <w:instrText xml:space="preserve"> PAGEREF _Toc244090976 \h </w:instrText>
         </w:r>
         <w:r>
           <w:rPr>
@@ -2961,7 +2996,7 @@
             <w:noProof/>
             <w:webHidden/>
           </w:rPr>
-          <w:t>15</w:t>
+          <w:t>16</w:t>
         </w:r>
         <w:r>
           <w:rPr>
@@ -2988,7 +3023,7 @@
           <w14:ligatures w14:val="standardContextual"/>
         </w:rPr>
       </w:pPr>
-      <w:hyperlink w:anchor="_Toc244085484" w:history="1">
+      <w:hyperlink w:anchor="_Toc244090977" w:history="1">
         <w:r>
           <w:rPr>
             <w:rStyle w:val="aff8"/>
@@ -3015,7 +3050,7 @@
             <w:noProof/>
             <w:webHidden/>
           </w:rPr>
-          <w:instrText xml:space="preserve"> PAGEREF _Toc244085484 \h </w:instrText>
+          <w:instrText xml:space="preserve"> PAGEREF _Toc244090977 \h </w:instrText>
         </w:r>
         <w:r>
           <w:rPr>
@@ -3035,7 +3070,7 @@
             <w:noProof/>
             <w:webHidden/>
           </w:rPr>
-          <w:t>15</w:t>
+          <w:t>16</w:t>
         </w:r>
         <w:r>
           <w:rPr>
@@ -3062,7 +3097,7 @@
           <w14:ligatures w14:val="standardContextual"/>
         </w:rPr>
       </w:pPr>
-      <w:hyperlink w:anchor="_Toc244085485" w:history="1">
+      <w:hyperlink w:anchor="_Toc244090978" w:history="1">
         <w:r>
           <w:rPr>
             <w:rStyle w:val="aff8"/>
@@ -3089,7 +3124,7 @@
             <w:noProof/>
             <w:webHidden/>
           </w:rPr>
-          <w:instrText xml:space="preserve"> PAGEREF _Toc244085485 \h </w:instrText>
+          <w:instrText xml:space="preserve"> PAGEREF _Toc244090978 \h </w:instrText>
         </w:r>
         <w:r>
           <w:rPr>
@@ -3109,7 +3144,7 @@
             <w:noProof/>
             <w:webHidden/>
           </w:rPr>
-          <w:t>15</w:t>
+          <w:t>16</w:t>
         </w:r>
         <w:r>
           <w:rPr>
@@ -3136,7 +3171,7 @@
           <w14:ligatures w14:val="standardContextual"/>
         </w:rPr>
       </w:pPr>
-      <w:hyperlink w:anchor="_Toc244085486" w:history="1">
+      <w:hyperlink w:anchor="_Toc244090979" w:history="1">
         <w:r>
           <w:rPr>
             <w:rStyle w:val="aff8"/>
@@ -3163,7 +3198,7 @@
             <w:noProof/>
             <w:webHidden/>
           </w:rPr>
-          <w:instrText xml:space="preserve"> PAGEREF _Toc244085486 \h </w:instrText>
+          <w:instrText xml:space="preserve"> PAGEREF _Toc244090979 \h </w:instrText>
         </w:r>
         <w:r>
           <w:rPr>
@@ -3183,7 +3218,7 @@
             <w:noProof/>
             <w:webHidden/>
           </w:rPr>
-          <w:t>16</w:t>
+          <w:t>17</w:t>
         </w:r>
         <w:r>
           <w:rPr>
@@ -3210,7 +3245,7 @@
           <w14:ligatures w14:val="standardContextual"/>
         </w:rPr>
       </w:pPr>
-      <w:hyperlink w:anchor="_Toc244085487" w:history="1">
+      <w:hyperlink w:anchor="_Toc244090980" w:history="1">
         <w:r>
           <w:rPr>
             <w:rStyle w:val="aff8"/>
@@ -3237,7 +3272,7 @@
             <w:noProof/>
             <w:webHidden/>
           </w:rPr>
-          <w:instrText xml:space="preserve"> PAGEREF _Toc244085487 \h </w:instrText>
+          <w:instrText xml:space="preserve"> PAGEREF _Toc244090980 \h </w:instrText>
         </w:r>
         <w:r>
           <w:rPr>
@@ -3257,7 +3292,7 @@
             <w:noProof/>
             <w:webHidden/>
           </w:rPr>
-          <w:t>16</w:t>
+          <w:t>17</w:t>
         </w:r>
         <w:r>
           <w:rPr>
@@ -3284,7 +3319,7 @@
           <w14:ligatures w14:val="standardContextual"/>
         </w:rPr>
       </w:pPr>
-      <w:hyperlink w:anchor="_Toc244085488" w:history="1">
+      <w:hyperlink w:anchor="_Toc244090981" w:history="1">
         <w:r>
           <w:rPr>
             <w:rStyle w:val="aff8"/>
@@ -3311,7 +3346,7 @@
             <w:noProof/>
             <w:webHidden/>
           </w:rPr>
-          <w:instrText xml:space="preserve"> PAGEREF _Toc244085488 \h </w:instrText>
+          <w:instrText xml:space="preserve"> PAGEREF _Toc244090981 \h </w:instrText>
         </w:r>
         <w:r>
           <w:rPr>
@@ -3331,7 +3366,7 @@
             <w:noProof/>
             <w:webHidden/>
           </w:rPr>
-          <w:t>16</w:t>
+          <w:t>17</w:t>
         </w:r>
         <w:r>
           <w:rPr>
@@ -3358,7 +3393,7 @@
           <w14:ligatures w14:val="standardContextual"/>
         </w:rPr>
       </w:pPr>
-      <w:hyperlink w:anchor="_Toc244085489" w:history="1">
+      <w:hyperlink w:anchor="_Toc244090982" w:history="1">
         <w:r>
           <w:rPr>
             <w:rStyle w:val="aff8"/>
@@ -3385,7 +3420,7 @@
             <w:noProof/>
             <w:webHidden/>
           </w:rPr>
-          <w:instrText xml:space="preserve"> PAGEREF _Toc244085489 \h </w:instrText>
+          <w:instrText xml:space="preserve"> PAGEREF _Toc244090982 \h </w:instrText>
         </w:r>
         <w:r>
           <w:rPr>
@@ -3405,7 +3440,7 @@
             <w:noProof/>
             <w:webHidden/>
           </w:rPr>
-          <w:t>17</w:t>
+          <w:t>18</w:t>
         </w:r>
         <w:r>
           <w:rPr>
@@ -3432,7 +3467,7 @@
           <w14:ligatures w14:val="standardContextual"/>
         </w:rPr>
       </w:pPr>
-      <w:hyperlink w:anchor="_Toc244085490" w:history="1">
+      <w:hyperlink w:anchor="_Toc244090983" w:history="1">
         <w:r>
           <w:rPr>
             <w:rStyle w:val="aff8"/>
@@ -3459,7 +3494,7 @@
             <w:noProof/>
             <w:webHidden/>
           </w:rPr>
-          <w:instrText xml:space="preserve"> PAGEREF _Toc244085490 \h </w:instrText>
+          <w:instrText xml:space="preserve"> PAGEREF _Toc244090983 \h </w:instrText>
         </w:r>
         <w:r>
           <w:rPr>
@@ -3479,7 +3514,7 @@
             <w:noProof/>
             <w:webHidden/>
           </w:rPr>
-          <w:t>17</w:t>
+          <w:t>18</w:t>
         </w:r>
         <w:r>
           <w:rPr>
@@ -3506,7 +3541,7 @@
           <w14:ligatures w14:val="standardContextual"/>
         </w:rPr>
       </w:pPr>
-      <w:hyperlink w:anchor="_Toc244085491" w:history="1">
+      <w:hyperlink w:anchor="_Toc244090984" w:history="1">
         <w:r>
           <w:rPr>
             <w:rStyle w:val="aff8"/>
@@ -3533,7 +3568,7 @@
             <w:noProof/>
             <w:webHidden/>
           </w:rPr>
-          <w:instrText xml:space="preserve"> PAGEREF _Toc244085491 \h </w:instrText>
+          <w:instrText xml:space="preserve"> PAGEREF _Toc244090984 \h </w:instrText>
         </w:r>
         <w:r>
           <w:rPr>
@@ -3553,7 +3588,7 @@
             <w:noProof/>
             <w:webHidden/>
           </w:rPr>
-          <w:t>18</w:t>
+          <w:t>19</w:t>
         </w:r>
         <w:r>
           <w:rPr>
@@ -3580,7 +3615,7 @@
           <w14:ligatures w14:val="standardContextual"/>
         </w:rPr>
       </w:pPr>
-      <w:hyperlink w:anchor="_Toc244085492" w:history="1">
+      <w:hyperlink w:anchor="_Toc244090985" w:history="1">
         <w:r>
           <w:rPr>
             <w:rStyle w:val="aff8"/>
@@ -3607,7 +3642,7 @@
             <w:noProof/>
             <w:webHidden/>
           </w:rPr>
-          <w:instrText xml:space="preserve"> PAGEREF _Toc244085492 \h </w:instrText>
+          <w:instrText xml:space="preserve"> PAGEREF _Toc244090985 \h </w:instrText>
         </w:r>
         <w:r>
           <w:rPr>
@@ -3627,7 +3662,7 @@
             <w:noProof/>
             <w:webHidden/>
           </w:rPr>
-          <w:t>18</w:t>
+          <w:t>19</w:t>
         </w:r>
         <w:r>
           <w:rPr>
@@ -3654,7 +3689,7 @@
           <w14:ligatures w14:val="standardContextual"/>
         </w:rPr>
       </w:pPr>
-      <w:hyperlink w:anchor="_Toc244085493" w:history="1">
+      <w:hyperlink w:anchor="_Toc244090986" w:history="1">
         <w:r>
           <w:rPr>
             <w:rStyle w:val="aff8"/>
@@ -3681,7 +3716,7 @@
             <w:noProof/>
             <w:webHidden/>
           </w:rPr>
-          <w:instrText xml:space="preserve"> PAGEREF _Toc244085493 \h </w:instrText>
+          <w:instrText xml:space="preserve"> PAGEREF _Toc244090986 \h </w:instrText>
         </w:r>
         <w:r>
           <w:rPr>
@@ -3701,7 +3736,7 @@
             <w:noProof/>
             <w:webHidden/>
           </w:rPr>
-          <w:t>19</w:t>
+          <w:t>20</w:t>
         </w:r>
         <w:r>
           <w:rPr>
@@ -3728,7 +3763,7 @@
           <w14:ligatures w14:val="standardContextual"/>
         </w:rPr>
       </w:pPr>
-      <w:hyperlink w:anchor="_Toc244085494" w:history="1">
+      <w:hyperlink w:anchor="_Toc244090987" w:history="1">
         <w:r>
           <w:rPr>
             <w:rStyle w:val="aff8"/>
@@ -3755,7 +3790,7 @@
             <w:noProof/>
             <w:webHidden/>
           </w:rPr>
-          <w:instrText xml:space="preserve"> PAGEREF _Toc244085494 \h </w:instrText>
+          <w:instrText xml:space="preserve"> PAGEREF _Toc244090987 \h </w:instrText>
         </w:r>
         <w:r>
           <w:rPr>
@@ -3775,7 +3810,7 @@
             <w:noProof/>
             <w:webHidden/>
           </w:rPr>
-          <w:t>20</w:t>
+          <w:t>21</w:t>
         </w:r>
         <w:r>
           <w:rPr>
@@ -3802,7 +3837,7 @@
           <w14:ligatures w14:val="standardContextual"/>
         </w:rPr>
       </w:pPr>
-      <w:hyperlink w:anchor="_Toc244085495" w:history="1">
+      <w:hyperlink w:anchor="_Toc244090988" w:history="1">
         <w:r>
           <w:rPr>
             <w:rStyle w:val="aff8"/>
@@ -3829,7 +3864,7 @@
             <w:noProof/>
             <w:webHidden/>
           </w:rPr>
-          <w:instrText xml:space="preserve"> PAGEREF _Toc244085495 \h </w:instrText>
+          <w:instrText xml:space="preserve"> PAGEREF _Toc244090988 \h </w:instrText>
         </w:r>
         <w:r>
           <w:rPr>
@@ -3849,7 +3884,7 @@
             <w:noProof/>
             <w:webHidden/>
           </w:rPr>
-          <w:t>22</w:t>
+          <w:t>23</w:t>
         </w:r>
         <w:r>
           <w:rPr>
@@ -3876,7 +3911,7 @@
           <w14:ligatures w14:val="standardContextual"/>
         </w:rPr>
       </w:pPr>
-      <w:hyperlink w:anchor="_Toc244085496" w:history="1">
+      <w:hyperlink w:anchor="_Toc244090989" w:history="1">
         <w:r>
           <w:rPr>
             <w:rStyle w:val="aff8"/>
@@ -3903,7 +3938,7 @@
             <w:noProof/>
             <w:webHidden/>
           </w:rPr>
-          <w:instrText xml:space="preserve"> PAGEREF _Toc244085496 \h </w:instrText>
+          <w:instrText xml:space="preserve"> PAGEREF _Toc244090989 \h </w:instrText>
         </w:r>
         <w:r>
           <w:rPr>
@@ -3923,7 +3958,7 @@
             <w:noProof/>
             <w:webHidden/>
           </w:rPr>
-          <w:t>22</w:t>
+          <w:t>23</w:t>
         </w:r>
         <w:r>
           <w:rPr>
@@ -3950,7 +3985,7 @@
           <w14:ligatures w14:val="standardContextual"/>
         </w:rPr>
       </w:pPr>
-      <w:hyperlink w:anchor="_Toc244085497" w:history="1">
+      <w:hyperlink w:anchor="_Toc244090990" w:history="1">
         <w:r>
           <w:rPr>
             <w:rStyle w:val="aff8"/>
@@ -3977,7 +4012,7 @@
             <w:noProof/>
             <w:webHidden/>
           </w:rPr>
-          <w:instrText xml:space="preserve"> PAGEREF _Toc244085497 \h </w:instrText>
+          <w:instrText xml:space="preserve"> PAGEREF _Toc244090990 \h </w:instrText>
         </w:r>
         <w:r>
           <w:rPr>
@@ -3997,7 +4032,7 @@
             <w:noProof/>
             <w:webHidden/>
           </w:rPr>
-          <w:t>23</w:t>
+          <w:t>24</w:t>
         </w:r>
         <w:r>
           <w:rPr>
@@ -4024,7 +4059,7 @@
           <w14:ligatures w14:val="standardContextual"/>
         </w:rPr>
       </w:pPr>
-      <w:hyperlink w:anchor="_Toc244085498" w:history="1">
+      <w:hyperlink w:anchor="_Toc244090991" w:history="1">
         <w:r>
           <w:rPr>
             <w:rStyle w:val="aff8"/>
@@ -4051,7 +4086,7 @@
             <w:noProof/>
             <w:webHidden/>
           </w:rPr>
-          <w:instrText xml:space="preserve"> PAGEREF _Toc244085498 \h </w:instrText>
+          <w:instrText xml:space="preserve"> PAGEREF _Toc244090991 \h </w:instrText>
         </w:r>
         <w:r>
           <w:rPr>
@@ -4071,7 +4106,7 @@
             <w:noProof/>
             <w:webHidden/>
           </w:rPr>
-          <w:t>23</w:t>
+          <w:t>24</w:t>
         </w:r>
         <w:r>
           <w:rPr>
@@ -4098,7 +4133,7 @@
           <w14:ligatures w14:val="standardContextual"/>
         </w:rPr>
       </w:pPr>
-      <w:hyperlink w:anchor="_Toc244085499" w:history="1">
+      <w:hyperlink w:anchor="_Toc244090992" w:history="1">
         <w:r>
           <w:rPr>
             <w:rStyle w:val="aff8"/>
@@ -4125,7 +4160,7 @@
             <w:noProof/>
             <w:webHidden/>
           </w:rPr>
-          <w:instrText xml:space="preserve"> PAGEREF _Toc244085499 \h </w:instrText>
+          <w:instrText xml:space="preserve"> PAGEREF _Toc244090992 \h </w:instrText>
         </w:r>
         <w:r>
           <w:rPr>
@@ -4145,7 +4180,7 @@
             <w:noProof/>
             <w:webHidden/>
           </w:rPr>
-          <w:t>23</w:t>
+          <w:t>24</w:t>
         </w:r>
         <w:r>
           <w:rPr>
@@ -4172,7 +4207,7 @@
           <w14:ligatures w14:val="standardContextual"/>
         </w:rPr>
       </w:pPr>
-      <w:hyperlink w:anchor="_Toc244085500" w:history="1">
+      <w:hyperlink w:anchor="_Toc244090993" w:history="1">
         <w:r>
           <w:rPr>
             <w:rStyle w:val="aff8"/>
@@ -4199,7 +4234,7 @@
             <w:noProof/>
             <w:webHidden/>
           </w:rPr>
-          <w:instrText xml:space="preserve"> PAGEREF _Toc244085500 \h </w:instrText>
+          <w:instrText xml:space="preserve"> PAGEREF _Toc244090993 \h </w:instrText>
         </w:r>
         <w:r>
           <w:rPr>
@@ -4219,7 +4254,7 @@
             <w:noProof/>
             <w:webHidden/>
           </w:rPr>
-          <w:t>25</w:t>
+          <w:t>26</w:t>
         </w:r>
         <w:r>
           <w:rPr>
@@ -4246,13 +4281,13 @@
           <w14:ligatures w14:val="standardContextual"/>
         </w:rPr>
       </w:pPr>
-      <w:hyperlink w:anchor="_Toc244085501" w:history="1">
+      <w:hyperlink w:anchor="_Toc244090994" w:history="1">
         <w:r>
           <w:rPr>
             <w:rStyle w:val="aff8"/>
             <w:noProof/>
           </w:rPr>
-          <w:t>8.3. Прогноз на 2026 год</w:t>
+          <w:t>8.3. Оценка на 2026 год по фактической погоде</w:t>
         </w:r>
         <w:r>
           <w:rPr>
@@ -4273,7 +4308,7 @@
             <w:noProof/>
             <w:webHidden/>
           </w:rPr>
-          <w:instrText xml:space="preserve"> PAGEREF _Toc244085501 \h </w:instrText>
+          <w:instrText xml:space="preserve"> PAGEREF _Toc244090994 \h </w:instrText>
         </w:r>
         <w:r>
           <w:rPr>
@@ -4293,7 +4328,7 @@
             <w:noProof/>
             <w:webHidden/>
           </w:rPr>
-          <w:t>25</w:t>
+          <w:t>26</w:t>
         </w:r>
         <w:r>
           <w:rPr>
@@ -4320,7 +4355,7 @@
           <w14:ligatures w14:val="standardContextual"/>
         </w:rPr>
       </w:pPr>
-      <w:hyperlink w:anchor="_Toc244085502" w:history="1">
+      <w:hyperlink w:anchor="_Toc244090995" w:history="1">
         <w:r>
           <w:rPr>
             <w:rStyle w:val="aff8"/>
@@ -4347,7 +4382,7 @@
             <w:noProof/>
             <w:webHidden/>
           </w:rPr>
-          <w:instrText xml:space="preserve"> PAGEREF _Toc244085502 \h </w:instrText>
+          <w:instrText xml:space="preserve"> PAGEREF _Toc244090995 \h </w:instrText>
         </w:r>
         <w:r>
           <w:rPr>
@@ -4367,7 +4402,7 @@
             <w:noProof/>
             <w:webHidden/>
           </w:rPr>
-          <w:t>26</w:t>
+          <w:t>27</w:t>
         </w:r>
         <w:r>
           <w:rPr>
@@ -4394,7 +4429,7 @@
           <w14:ligatures w14:val="standardContextual"/>
         </w:rPr>
       </w:pPr>
-      <w:hyperlink w:anchor="_Toc244085503" w:history="1">
+      <w:hyperlink w:anchor="_Toc244090996" w:history="1">
         <w:r>
           <w:rPr>
             <w:rStyle w:val="aff8"/>
@@ -4421,7 +4456,7 @@
             <w:noProof/>
             <w:webHidden/>
           </w:rPr>
-          <w:instrText xml:space="preserve"> PAGEREF _Toc244085503 \h </w:instrText>
+          <w:instrText xml:space="preserve"> PAGEREF _Toc244090996 \h </w:instrText>
         </w:r>
         <w:r>
           <w:rPr>
@@ -4441,7 +4476,7 @@
             <w:noProof/>
             <w:webHidden/>
           </w:rPr>
-          <w:t>26</w:t>
+          <w:t>27</w:t>
         </w:r>
         <w:r>
           <w:rPr>
@@ -4468,7 +4503,7 @@
           <w14:ligatures w14:val="standardContextual"/>
         </w:rPr>
       </w:pPr>
-      <w:hyperlink w:anchor="_Toc244085504" w:history="1">
+      <w:hyperlink w:anchor="_Toc244090997" w:history="1">
         <w:r>
           <w:rPr>
             <w:rStyle w:val="aff8"/>
@@ -4495,7 +4530,7 @@
             <w:noProof/>
             <w:webHidden/>
           </w:rPr>
-          <w:instrText xml:space="preserve"> PAGEREF _Toc244085504 \h </w:instrText>
+          <w:instrText xml:space="preserve"> PAGEREF _Toc244090997 \h </w:instrText>
         </w:r>
         <w:r>
           <w:rPr>
@@ -4515,7 +4550,7 @@
             <w:noProof/>
             <w:webHidden/>
           </w:rPr>
-          <w:t>27</w:t>
+          <w:t>28</w:t>
         </w:r>
         <w:r>
           <w:rPr>
@@ -4542,7 +4577,7 @@
           <w14:ligatures w14:val="standardContextual"/>
         </w:rPr>
       </w:pPr>
-      <w:hyperlink w:anchor="_Toc244085505" w:history="1">
+      <w:hyperlink w:anchor="_Toc244090998" w:history="1">
         <w:r>
           <w:rPr>
             <w:rStyle w:val="aff8"/>
@@ -4569,7 +4604,7 @@
             <w:noProof/>
             <w:webHidden/>
           </w:rPr>
-          <w:instrText xml:space="preserve"> PAGEREF _Toc244085505 \h </w:instrText>
+          <w:instrText xml:space="preserve"> PAGEREF _Toc244090998 \h </w:instrText>
         </w:r>
         <w:r>
           <w:rPr>
@@ -4589,7 +4624,7 @@
             <w:noProof/>
             <w:webHidden/>
           </w:rPr>
-          <w:t>27</w:t>
+          <w:t>28</w:t>
         </w:r>
         <w:r>
           <w:rPr>
@@ -4616,7 +4651,7 @@
           <w14:ligatures w14:val="standardContextual"/>
         </w:rPr>
       </w:pPr>
-      <w:hyperlink w:anchor="_Toc244085506" w:history="1">
+      <w:hyperlink w:anchor="_Toc244090999" w:history="1">
         <w:r>
           <w:rPr>
             <w:rStyle w:val="aff8"/>
@@ -4643,7 +4678,7 @@
             <w:noProof/>
             <w:webHidden/>
           </w:rPr>
-          <w:instrText xml:space="preserve"> PAGEREF _Toc244085506 \h </w:instrText>
+          <w:instrText xml:space="preserve"> PAGEREF _Toc244090999 \h </w:instrText>
         </w:r>
         <w:r>
           <w:rPr>
@@ -4663,7 +4698,7 @@
             <w:noProof/>
             <w:webHidden/>
           </w:rPr>
-          <w:t>29</w:t>
+          <w:t>30</w:t>
         </w:r>
         <w:r>
           <w:rPr>
@@ -4690,7 +4725,7 @@
           <w14:ligatures w14:val="standardContextual"/>
         </w:rPr>
       </w:pPr>
-      <w:hyperlink w:anchor="_Toc244085507" w:history="1">
+      <w:hyperlink w:anchor="_Toc244091000" w:history="1">
         <w:r>
           <w:rPr>
             <w:rStyle w:val="aff8"/>
@@ -4717,7 +4752,7 @@
             <w:noProof/>
             <w:webHidden/>
           </w:rPr>
-          <w:instrText xml:space="preserve"> PAGEREF _Toc244085507 \h </w:instrText>
+          <w:instrText xml:space="preserve"> PAGEREF _Toc244091000 \h </w:instrText>
         </w:r>
         <w:r>
           <w:rPr>
@@ -4737,7 +4772,7 @@
             <w:noProof/>
             <w:webHidden/>
           </w:rPr>
-          <w:t>30</w:t>
+          <w:t>31</w:t>
         </w:r>
         <w:r>
           <w:rPr>
@@ -4764,13 +4799,13 @@
           <w14:ligatures w14:val="standardContextual"/>
         </w:rPr>
       </w:pPr>
-      <w:hyperlink w:anchor="_Toc244085508" w:history="1">
+      <w:hyperlink w:anchor="_Toc244091001" w:history="1">
         <w:r>
           <w:rPr>
             <w:rStyle w:val="aff8"/>
             <w:noProof/>
           </w:rPr>
-          <w:t>10. Прототип «Агрокаст»</w:t>
+          <w:t>10. Прототип «Агрокаст»: калькулятор участка</w:t>
         </w:r>
         <w:r>
           <w:rPr>
@@ -4791,7 +4826,7 @@
             <w:noProof/>
             <w:webHidden/>
           </w:rPr>
-          <w:instrText xml:space="preserve"> PAGEREF _Toc244085508 \h </w:instrText>
+          <w:instrText xml:space="preserve"> PAGEREF _Toc244091001 \h </w:instrText>
         </w:r>
         <w:r>
           <w:rPr>
@@ -4811,7 +4846,155 @@
             <w:noProof/>
             <w:webHidden/>
           </w:rPr>
-          <w:t>30</w:t>
+          <w:t>31</w:t>
+        </w:r>
+        <w:r>
+          <w:rPr>
+            <w:noProof/>
+            <w:webHidden/>
+          </w:rPr>
+          <w:fldChar w:fldCharType="end"/>
+        </w:r>
+      </w:hyperlink>
+    </w:p>
+    <w:p>
+      <w:pPr>
+        <w:pStyle w:val="2c"/>
+        <w:tabs>
+          <w:tab w:val="right" w:leader="dot" w:pos="9459"/>
+        </w:tabs>
+        <w:rPr>
+          <w:rFonts w:asciiTheme="minorHAnsi" w:eastAsiaTheme="minorEastAsia" w:hAnsiTheme="minorHAnsi" w:cstheme="minorBidi"/>
+          <w:noProof/>
+          <w:kern w:val="2"/>
+          <w:sz w:val="24"/>
+          <w:szCs w:val="24"/>
+          <w:lang w:val="ru-RU" w:eastAsia="ru-RU"/>
+          <w14:ligatures w14:val="standardContextual"/>
+        </w:rPr>
+      </w:pPr>
+      <w:hyperlink w:anchor="_Toc244091002" w:history="1">
+        <w:r>
+          <w:rPr>
+            <w:rStyle w:val="aff8"/>
+            <w:noProof/>
+          </w:rPr>
+          <w:t>10.1. Что в калькуляторе от модели, а что — допущение</w:t>
+        </w:r>
+        <w:r>
+          <w:rPr>
+            <w:noProof/>
+            <w:webHidden/>
+          </w:rPr>
+          <w:tab/>
+        </w:r>
+        <w:r>
+          <w:rPr>
+            <w:noProof/>
+            <w:webHidden/>
+          </w:rPr>
+          <w:fldChar w:fldCharType="begin"/>
+        </w:r>
+        <w:r>
+          <w:rPr>
+            <w:noProof/>
+            <w:webHidden/>
+          </w:rPr>
+          <w:instrText xml:space="preserve"> PAGEREF _Toc244091002 \h </w:instrText>
+        </w:r>
+        <w:r>
+          <w:rPr>
+            <w:noProof/>
+            <w:webHidden/>
+          </w:rPr>
+        </w:r>
+        <w:r>
+          <w:rPr>
+            <w:noProof/>
+            <w:webHidden/>
+          </w:rPr>
+          <w:fldChar w:fldCharType="separate"/>
+        </w:r>
+        <w:r>
+          <w:rPr>
+            <w:noProof/>
+            <w:webHidden/>
+          </w:rPr>
+          <w:t>32</w:t>
+        </w:r>
+        <w:r>
+          <w:rPr>
+            <w:noProof/>
+            <w:webHidden/>
+          </w:rPr>
+          <w:fldChar w:fldCharType="end"/>
+        </w:r>
+      </w:hyperlink>
+    </w:p>
+    <w:p>
+      <w:pPr>
+        <w:pStyle w:val="2c"/>
+        <w:tabs>
+          <w:tab w:val="right" w:leader="dot" w:pos="9459"/>
+        </w:tabs>
+        <w:rPr>
+          <w:rFonts w:asciiTheme="minorHAnsi" w:eastAsiaTheme="minorEastAsia" w:hAnsiTheme="minorHAnsi" w:cstheme="minorBidi"/>
+          <w:noProof/>
+          <w:kern w:val="2"/>
+          <w:sz w:val="24"/>
+          <w:szCs w:val="24"/>
+          <w:lang w:val="ru-RU" w:eastAsia="ru-RU"/>
+          <w14:ligatures w14:val="standardContextual"/>
+        </w:rPr>
+      </w:pPr>
+      <w:hyperlink w:anchor="_Toc244091003" w:history="1">
+        <w:r>
+          <w:rPr>
+            <w:rStyle w:val="aff8"/>
+            <w:noProof/>
+          </w:rPr>
+          <w:t>10.2. Экраны</w:t>
+        </w:r>
+        <w:r>
+          <w:rPr>
+            <w:noProof/>
+            <w:webHidden/>
+          </w:rPr>
+          <w:tab/>
+        </w:r>
+        <w:r>
+          <w:rPr>
+            <w:noProof/>
+            <w:webHidden/>
+          </w:rPr>
+          <w:fldChar w:fldCharType="begin"/>
+        </w:r>
+        <w:r>
+          <w:rPr>
+            <w:noProof/>
+            <w:webHidden/>
+          </w:rPr>
+          <w:instrText xml:space="preserve"> PAGEREF _Toc244091003 \h </w:instrText>
+        </w:r>
+        <w:r>
+          <w:rPr>
+            <w:noProof/>
+            <w:webHidden/>
+          </w:rPr>
+        </w:r>
+        <w:r>
+          <w:rPr>
+            <w:noProof/>
+            <w:webHidden/>
+          </w:rPr>
+          <w:fldChar w:fldCharType="separate"/>
+        </w:r>
+        <w:r>
+          <w:rPr>
+            <w:noProof/>
+            <w:webHidden/>
+          </w:rPr>
+          <w:t>32</w:t>
         </w:r>
         <w:r>
           <w:rPr>
@@ -4838,7 +5021,7 @@
           <w14:ligatures w14:val="standardContextual"/>
         </w:rPr>
       </w:pPr>
-      <w:hyperlink w:anchor="_Toc244085509" w:history="1">
+      <w:hyperlink w:anchor="_Toc244091004" w:history="1">
         <w:r>
           <w:rPr>
             <w:rStyle w:val="aff8"/>
@@ -4865,7 +5048,7 @@
             <w:noProof/>
             <w:webHidden/>
           </w:rPr>
-          <w:instrText xml:space="preserve"> PAGEREF _Toc244085509 \h </w:instrText>
+          <w:instrText xml:space="preserve"> PAGEREF _Toc244091004 \h </w:instrText>
         </w:r>
         <w:r>
           <w:rPr>
@@ -4885,7 +5068,7 @@
             <w:noProof/>
             <w:webHidden/>
           </w:rPr>
-          <w:t>32</w:t>
+          <w:t>34</w:t>
         </w:r>
         <w:r>
           <w:rPr>
@@ -4912,7 +5095,7 @@
           <w14:ligatures w14:val="standardContextual"/>
         </w:rPr>
       </w:pPr>
-      <w:hyperlink w:anchor="_Toc244085510" w:history="1">
+      <w:hyperlink w:anchor="_Toc244091005" w:history="1">
         <w:r>
           <w:rPr>
             <w:rStyle w:val="aff8"/>
@@ -4939,7 +5122,7 @@
             <w:noProof/>
             <w:webHidden/>
           </w:rPr>
-          <w:instrText xml:space="preserve"> PAGEREF _Toc244085510 \h </w:instrText>
+          <w:instrText xml:space="preserve"> PAGEREF _Toc244091005 \h </w:instrText>
         </w:r>
         <w:r>
           <w:rPr>
@@ -4959,7 +5142,7 @@
             <w:noProof/>
             <w:webHidden/>
           </w:rPr>
-          <w:t>33</w:t>
+          <w:t>35</w:t>
         </w:r>
         <w:r>
           <w:rPr>
@@ -4986,7 +5169,7 @@
           <w14:ligatures w14:val="standardContextual"/>
         </w:rPr>
       </w:pPr>
-      <w:hyperlink w:anchor="_Toc244085511" w:history="1">
+      <w:hyperlink w:anchor="_Toc244091006" w:history="1">
         <w:r>
           <w:rPr>
             <w:rStyle w:val="aff8"/>
@@ -5013,7 +5196,7 @@
             <w:noProof/>
             <w:webHidden/>
           </w:rPr>
-          <w:instrText xml:space="preserve"> PAGEREF _Toc244085511 \h </w:instrText>
+          <w:instrText xml:space="preserve"> PAGEREF _Toc244091006 \h </w:instrText>
         </w:r>
         <w:r>
           <w:rPr>
@@ -5033,7 +5216,7 @@
             <w:noProof/>
             <w:webHidden/>
           </w:rPr>
-          <w:t>34</w:t>
+          <w:t>35</w:t>
         </w:r>
         <w:r>
           <w:rPr>
@@ -5060,7 +5243,7 @@
           <w14:ligatures w14:val="standardContextual"/>
         </w:rPr>
       </w:pPr>
-      <w:hyperlink w:anchor="_Toc244085512" w:history="1">
+      <w:hyperlink w:anchor="_Toc244091007" w:history="1">
         <w:r>
           <w:rPr>
             <w:rStyle w:val="aff8"/>
@@ -5087,7 +5270,7 @@
             <w:noProof/>
             <w:webHidden/>
           </w:rPr>
-          <w:instrText xml:space="preserve"> PAGEREF _Toc244085512 \h </w:instrText>
+          <w:instrText xml:space="preserve"> PAGEREF _Toc244091007 \h </w:instrText>
         </w:r>
         <w:r>
           <w:rPr>
@@ -5107,7 +5290,7 @@
             <w:noProof/>
             <w:webHidden/>
           </w:rPr>
-          <w:t>34</w:t>
+          <w:t>35</w:t>
         </w:r>
         <w:r>
           <w:rPr>
@@ -5134,7 +5317,7 @@
           <w14:ligatures w14:val="standardContextual"/>
         </w:rPr>
       </w:pPr>
-      <w:hyperlink w:anchor="_Toc244085513" w:history="1">
+      <w:hyperlink w:anchor="_Toc244091008" w:history="1">
         <w:r>
           <w:rPr>
             <w:rStyle w:val="aff8"/>
@@ -5161,7 +5344,7 @@
             <w:noProof/>
             <w:webHidden/>
           </w:rPr>
-          <w:instrText xml:space="preserve"> PAGEREF _Toc244085513 \h </w:instrText>
+          <w:instrText xml:space="preserve"> PAGEREF _Toc244091008 \h </w:instrText>
         </w:r>
         <w:r>
           <w:rPr>
@@ -5181,7 +5364,7 @@
             <w:noProof/>
             <w:webHidden/>
           </w:rPr>
-          <w:t>34</w:t>
+          <w:t>36</w:t>
         </w:r>
         <w:r>
           <w:rPr>
@@ -5208,7 +5391,7 @@
           <w14:ligatures w14:val="standardContextual"/>
         </w:rPr>
       </w:pPr>
-      <w:hyperlink w:anchor="_Toc244085514" w:history="1">
+      <w:hyperlink w:anchor="_Toc244091009" w:history="1">
         <w:r>
           <w:rPr>
             <w:rStyle w:val="aff8"/>
@@ -5235,7 +5418,7 @@
             <w:noProof/>
             <w:webHidden/>
           </w:rPr>
-          <w:instrText xml:space="preserve"> PAGEREF _Toc244085514 \h </w:instrText>
+          <w:instrText xml:space="preserve"> PAGEREF _Toc244091009 \h </w:instrText>
         </w:r>
         <w:r>
           <w:rPr>
@@ -5255,7 +5438,7 @@
             <w:noProof/>
             <w:webHidden/>
           </w:rPr>
-          <w:t>34</w:t>
+          <w:t>36</w:t>
         </w:r>
         <w:r>
           <w:rPr>
@@ -5282,7 +5465,7 @@
           <w14:ligatures w14:val="standardContextual"/>
         </w:rPr>
       </w:pPr>
-      <w:hyperlink w:anchor="_Toc244085515" w:history="1">
+      <w:hyperlink w:anchor="_Toc244091010" w:history="1">
         <w:r>
           <w:rPr>
             <w:rStyle w:val="aff8"/>
@@ -5309,7 +5492,7 @@
             <w:noProof/>
             <w:webHidden/>
           </w:rPr>
-          <w:instrText xml:space="preserve"> PAGEREF _Toc244085515 \h </w:instrText>
+          <w:instrText xml:space="preserve"> PAGEREF _Toc244091010 \h </w:instrText>
         </w:r>
         <w:r>
           <w:rPr>
@@ -5329,7 +5512,7 @@
             <w:noProof/>
             <w:webHidden/>
           </w:rPr>
-          <w:t>36</w:t>
+          <w:t>38</w:t>
         </w:r>
         <w:r>
           <w:rPr>
@@ -5356,7 +5539,7 @@
           <w14:ligatures w14:val="standardContextual"/>
         </w:rPr>
       </w:pPr>
-      <w:hyperlink w:anchor="_Toc244085516" w:history="1">
+      <w:hyperlink w:anchor="_Toc244091011" w:history="1">
         <w:r>
           <w:rPr>
             <w:rStyle w:val="aff8"/>
@@ -5383,7 +5566,7 @@
             <w:noProof/>
             <w:webHidden/>
           </w:rPr>
-          <w:instrText xml:space="preserve"> PAGEREF _Toc244085516 \h </w:instrText>
+          <w:instrText xml:space="preserve"> PAGEREF _Toc244091011 \h </w:instrText>
         </w:r>
         <w:r>
           <w:rPr>
@@ -5403,7 +5586,7 @@
             <w:noProof/>
             <w:webHidden/>
           </w:rPr>
-          <w:t>36</w:t>
+          <w:t>38</w:t>
         </w:r>
         <w:r>
           <w:rPr>
@@ -5430,7 +5613,7 @@
           <w14:ligatures w14:val="standardContextual"/>
         </w:rPr>
       </w:pPr>
-      <w:hyperlink w:anchor="_Toc244085517" w:history="1">
+      <w:hyperlink w:anchor="_Toc244091012" w:history="1">
         <w:r>
           <w:rPr>
             <w:rStyle w:val="aff8"/>
@@ -5457,7 +5640,7 @@
             <w:noProof/>
             <w:webHidden/>
           </w:rPr>
-          <w:instrText xml:space="preserve"> PAGEREF _Toc244085517 \h </w:instrText>
+          <w:instrText xml:space="preserve"> PAGEREF _Toc244091012 \h </w:instrText>
         </w:r>
         <w:r>
           <w:rPr>
@@ -5477,7 +5660,7 @@
             <w:noProof/>
             <w:webHidden/>
           </w:rPr>
-          <w:t>37</w:t>
+          <w:t>39</w:t>
         </w:r>
         <w:r>
           <w:rPr>
@@ -5505,7 +5688,7 @@
       <w:pPr>
         <w:pStyle w:val="1"/>
       </w:pPr>
-      <w:bookmarkStart w:id="2" w:name="_Toc244085453"/>
+      <w:bookmarkStart w:id="2" w:name="_Toc244090946"/>
       <w:r>
         <w:lastRenderedPageBreak/>
         <w:t>1. Введение и постановка задачи</w:t>
@@ -5516,7 +5699,7 @@
       <w:pPr>
         <w:pStyle w:val="21"/>
       </w:pPr>
-      <w:bookmarkStart w:id="3" w:name="_Toc244085454"/>
+      <w:bookmarkStart w:id="3" w:name="_Toc244090947"/>
       <w:r>
         <w:t>1.1. Кейс</w:t>
       </w:r>
@@ -5538,25 +5721,43 @@
         <w:ind w:firstLine="425"/>
       </w:pPr>
       <w:r>
-        <w:t>Мы прочитали задачу так: фермеру нужен не один прогноз «5,1 т/га», а ответ на вопрос «что мне делать с этим прогнозом». Поэтому решение состоит из двух частей:</w:t>
-      </w:r>
-    </w:p>
-    <w:p>
-      <w:pPr>
-        <w:spacing w:after="50"/>
-        <w:ind w:left="510" w:hanging="283"/>
-      </w:pPr>
-      <w:r>
-        <w:t xml:space="preserve">1.  </w:t>
+        <w:t xml:space="preserve">Задание описывает </w:t>
       </w:r>
       <w:r>
         <w:rPr>
           <w:b/>
         </w:rPr>
-        <w:t>Прогноз.</w:t>
-      </w:r>
-      <w:r>
-        <w:t xml:space="preserve"> Урожайность культуры в субъекте на текущий сезон в т/га, общий сбор на площади хозяйства и, главное, честный диапазон: какой урожай ждать в хороший, обычный и плохой год.</w:t>
+        <w:t>калькулятор участка</w:t>
+      </w:r>
+      <w:r>
+        <w:t xml:space="preserve">: ввод параметров участка → урожайность в т/га и общий объём → польза для затрат и доходов. Мы прочитали его так: фермеру нужен не один прогноз «5,1 т/га», а ответ на вопрос «что мне делать с этим прогнозом». Основа калькулятора — </w:t>
+      </w:r>
+      <w:r>
+        <w:rPr>
+          <w:b/>
+        </w:rPr>
+        <w:t>региональный прогноз</w:t>
+      </w:r>
+      <w:r>
+        <w:t>: модель, обученная на статистике «субъект РФ × культура × год» (среднее по хозяйствам), которая даёт базовую урожайность региона по погоде и данным сезона. Участок получает прогноз региона, пересчитанный на его площадь, с поправками на почву, сорт и агротехнику. Решение состоит из двух частей:</w:t>
+      </w:r>
+    </w:p>
+    <w:p>
+      <w:pPr>
+        <w:spacing w:after="50"/>
+        <w:ind w:left="510" w:hanging="283"/>
+      </w:pPr>
+      <w:r>
+        <w:t xml:space="preserve">1.  </w:t>
+      </w:r>
+      <w:r>
+        <w:rPr>
+          <w:b/>
+        </w:rPr>
+        <w:t>Прогноз и калькулятор.</w:t>
+      </w:r>
+      <w:r>
+        <w:t xml:space="preserve"> Региональный прогноз урожайности культуры на сезон в т/га; для участка — общий сбор на его площади, выручка, затраты, маржа и, главное, честный диапазон: какой урожай ждать в хороший, обычный и плохой год.</w:t>
       </w:r>
     </w:p>
     <w:p>
@@ -5581,7 +5782,7 @@
       <w:pPr>
         <w:pStyle w:val="21"/>
       </w:pPr>
-      <w:bookmarkStart w:id="4" w:name="_Toc244085455"/>
+      <w:bookmarkStart w:id="4" w:name="_Toc244090948"/>
       <w:r>
         <w:t>1.2. Ценность для фермера и для банка</w:t>
       </w:r>
@@ -5619,7 +5820,7 @@
       <w:pPr>
         <w:pStyle w:val="21"/>
       </w:pPr>
-      <w:bookmarkStart w:id="5" w:name="_Toc244085456"/>
+      <w:bookmarkStart w:id="5" w:name="_Toc244090949"/>
       <w:r>
         <w:t>1.3. Что сделано</w:t>
       </w:r>
@@ -5657,6 +5858,7 @@
         <w:pStyle w:val="a0"/>
       </w:pPr>
       <w:r>
+        <w:lastRenderedPageBreak/>
         <w:t>На семи основных культурах проведён перебор: шесть видов тренда, три формы цели, девять наборов признаков, тринадцать семейств моделей, подбор гиперпараметров Optuna, ансамбли и стекинг. Всего 4 069 конфигураций, 10 244 попыток Optuna.</w:t>
       </w:r>
     </w:p>
@@ -5681,15 +5883,14 @@
         <w:pStyle w:val="a0"/>
       </w:pPr>
       <w:r>
-        <w:lastRenderedPageBreak/>
-        <w:t>Сделан прототип — сайт «Агрокаст» с картой, карточкой региона, калькулятором урожая и модулем плана посевов.</w:t>
+        <w:t>Сделан прототип — сайт «Агрокаст»: калькулятор участка (регион, площадь по культурам, почва, сорт, агротехника → т/га, сбор, выручка, маржа), модуль «Что посеять» и региональный прогноз с картой.</w:t>
       </w:r>
     </w:p>
     <w:p>
       <w:pPr>
         <w:pStyle w:val="21"/>
       </w:pPr>
-      <w:bookmarkStart w:id="6" w:name="_Toc244085457"/>
+      <w:bookmarkStart w:id="6" w:name="_Toc244090950"/>
       <w:r>
         <w:t>1.4. Уровень детализации</w:t>
       </w:r>
@@ -5709,14 +5910,17 @@
         <w:t>субъекта РФ</w:t>
       </w:r>
       <w:r>
-        <w:t>: это самый подробный уровень, на котором открытая статистика урожайности существует как длинный ряд. Для хозяйства прогноз субъекта служит базой. Пользователь уточняет его своими параметрами — площадью, уровнем агротехники, сортом. Как сделать прогноз полевым, обсуждается в разделе о плане развития.</w:t>
+        <w:t>: это самый подробный уровень, на котором открытая статистика урожайности существует как длинный ряд. Для хозяйства региональный прогноз служит базой, которую калькулятор участка уточняет площадью и параметрами пользователя. Важно различать, что в этом уточнении от данных, а что — допущение. Климат и погода региона и сезона, почвы региона и цены — из данных и обученной модели. Влияние почвы участка, сорта семян и агротехники — множители-допущения: открытых данных об урожайности по сортам и агротехнике на ур</w:t>
+      </w:r>
+      <w:r>
+        <w:t>овне хозяйств нет, и обучить на них модель нельзя. Как сделать прогноз полевым, обсуждается в разделе о плане развития.</w:t>
       </w:r>
     </w:p>
     <w:p>
       <w:pPr>
         <w:pStyle w:val="1"/>
       </w:pPr>
-      <w:bookmarkStart w:id="7" w:name="_Toc244085458"/>
+      <w:bookmarkStart w:id="7" w:name="_Toc244090951"/>
       <w:r>
         <w:t>2. Обзор методов агропрогноза</w:t>
       </w:r>
@@ -5734,7 +5938,7 @@
       <w:pPr>
         <w:pStyle w:val="21"/>
       </w:pPr>
-      <w:bookmarkStart w:id="8" w:name="_Toc244085459"/>
+      <w:bookmarkStart w:id="8" w:name="_Toc244090952"/>
       <w:r>
         <w:t>2.1. Трендовые и статистические модели</w:t>
       </w:r>
@@ -5755,7 +5959,7 @@
       <w:pPr>
         <w:pStyle w:val="21"/>
       </w:pPr>
-      <w:bookmarkStart w:id="9" w:name="_Toc244085460"/>
+      <w:bookmarkStart w:id="9" w:name="_Toc244090953"/>
       <w:r>
         <w:t>2.2. Агрометеорологические методы Росгидромета</w:t>
       </w:r>
@@ -5776,8 +5980,9 @@
       <w:pPr>
         <w:pStyle w:val="21"/>
       </w:pPr>
-      <w:bookmarkStart w:id="10" w:name="_Toc244085461"/>
-      <w:r>
+      <w:bookmarkStart w:id="10" w:name="_Toc244090954"/>
+      <w:r>
+        <w:lastRenderedPageBreak/>
         <w:t>2.3. Процессные модели роста культур</w:t>
       </w:r>
       <w:bookmarkEnd w:id="10"/>
@@ -5797,9 +6002,8 @@
       <w:pPr>
         <w:pStyle w:val="21"/>
       </w:pPr>
-      <w:bookmarkStart w:id="11" w:name="_Toc244085462"/>
-      <w:r>
-        <w:lastRenderedPageBreak/>
+      <w:bookmarkStart w:id="11" w:name="_Toc244090955"/>
+      <w:r>
         <w:t>2.4. Спутниковые методы</w:t>
       </w:r>
       <w:bookmarkEnd w:id="11"/>
@@ -5819,7 +6023,7 @@
       <w:pPr>
         <w:pStyle w:val="21"/>
       </w:pPr>
-      <w:bookmarkStart w:id="12" w:name="_Toc244085463"/>
+      <w:bookmarkStart w:id="12" w:name="_Toc244090956"/>
       <w:r>
         <w:t>2.5. Машинное обучение и гибридные схемы</w:t>
       </w:r>
@@ -5840,7 +6044,7 @@
       <w:pPr>
         <w:pStyle w:val="21"/>
       </w:pPr>
-      <w:bookmarkStart w:id="13" w:name="_Toc244085464"/>
+      <w:bookmarkStart w:id="13" w:name="_Toc244090957"/>
       <w:r>
         <w:t>2.6. Что из этого следует для решения</w:t>
       </w:r>
@@ -6610,6 +6814,7 @@
         <w:rPr>
           <w:b/>
         </w:rPr>
+        <w:lastRenderedPageBreak/>
         <w:t>Спутник MODIS добавлен как отдельный блок признаков</w:t>
       </w:r>
       <w:r>
@@ -6648,9 +6853,8 @@
       <w:pPr>
         <w:pStyle w:val="1"/>
       </w:pPr>
-      <w:bookmarkStart w:id="14" w:name="_Toc244085465"/>
-      <w:r>
-        <w:lastRenderedPageBreak/>
+      <w:bookmarkStart w:id="14" w:name="_Toc244090958"/>
+      <w:r>
         <w:t>3. Данные</w:t>
       </w:r>
       <w:bookmarkEnd w:id="14"/>
@@ -6659,7 +6863,7 @@
       <w:pPr>
         <w:pStyle w:val="21"/>
       </w:pPr>
-      <w:bookmarkStart w:id="15" w:name="_Toc244085466"/>
+      <w:bookmarkStart w:id="15" w:name="_Toc244090959"/>
       <w:r>
         <w:t>3.1. Источники</w:t>
       </w:r>
@@ -8428,6 +8632,7 @@
         <w:rPr>
           <w:b/>
         </w:rPr>
+        <w:lastRenderedPageBreak/>
         <w:t>MODIS</w:t>
       </w:r>
       <w:r>
@@ -8472,9 +8677,8 @@
         <w:rPr>
           <w:noProof/>
         </w:rPr>
-        <w:lastRenderedPageBreak/>
         <w:drawing>
-          <wp:inline distT="0" distB="0" distL="0" distR="0" wp14:anchorId="281B77C8" wp14:editId="40CF09F9">
+          <wp:inline distT="0" distB="0" distL="0" distR="0" wp14:anchorId="2CB8321B" wp14:editId="31670D8D">
             <wp:extent cx="5719431" cy="3146518"/>
             <wp:effectExtent l="0" t="0" r="0" b="0"/>
             <wp:docPr id="1" name="Picture 1"/>
@@ -8528,7 +8732,7 @@
       <w:pPr>
         <w:pStyle w:val="21"/>
       </w:pPr>
-      <w:bookmarkStart w:id="16" w:name="_Toc244085467"/>
+      <w:bookmarkStart w:id="16" w:name="_Toc244090960"/>
       <w:r>
         <w:t>3.2. Покрытие</w:t>
       </w:r>
@@ -8553,7 +8757,7 @@
           <w:noProof/>
         </w:rPr>
         <w:drawing>
-          <wp:inline distT="0" distB="0" distL="0" distR="0" wp14:anchorId="61BE78E3" wp14:editId="633077BA">
+          <wp:inline distT="0" distB="0" distL="0" distR="0" wp14:anchorId="597FA899" wp14:editId="1173CF46">
             <wp:extent cx="5832000" cy="2359011"/>
             <wp:effectExtent l="0" t="0" r="0" b="0"/>
             <wp:docPr id="2" name="Picture 2"/>
@@ -9595,7 +9799,7 @@
       <w:pPr>
         <w:pStyle w:val="21"/>
       </w:pPr>
-      <w:bookmarkStart w:id="17" w:name="_Toc244085468"/>
+      <w:bookmarkStart w:id="17" w:name="_Toc244090961"/>
       <w:r>
         <w:t>3.3. Архитектура данных</w:t>
       </w:r>
@@ -9620,7 +9824,7 @@
           <w:noProof/>
         </w:rPr>
         <w:drawing>
-          <wp:inline distT="0" distB="0" distL="0" distR="0" wp14:anchorId="556DFD8D" wp14:editId="77A4E209">
+          <wp:inline distT="0" distB="0" distL="0" distR="0" wp14:anchorId="22E3742B" wp14:editId="0AEC50E5">
             <wp:extent cx="4630412" cy="2976099"/>
             <wp:effectExtent l="0" t="0" r="0" b="0"/>
             <wp:docPr id="3" name="Picture 3"/>
@@ -11146,7 +11350,7 @@
       <w:pPr>
         <w:pStyle w:val="1"/>
       </w:pPr>
-      <w:bookmarkStart w:id="18" w:name="_Toc244085469"/>
+      <w:bookmarkStart w:id="18" w:name="_Toc244090962"/>
       <w:r>
         <w:t>4. Предобработка и контроль качества</w:t>
       </w:r>
@@ -11156,7 +11360,7 @@
       <w:pPr>
         <w:pStyle w:val="21"/>
       </w:pPr>
-      <w:bookmarkStart w:id="19" w:name="_Toc244085470"/>
+      <w:bookmarkStart w:id="19" w:name="_Toc244090963"/>
       <w:r>
         <w:t>4.1. Чистка урожайности</w:t>
       </w:r>
@@ -12075,7 +12279,7 @@
       <w:pPr>
         <w:pStyle w:val="21"/>
       </w:pPr>
-      <w:bookmarkStart w:id="20" w:name="_Toc244085471"/>
+      <w:bookmarkStart w:id="20" w:name="_Toc244090964"/>
       <w:r>
         <w:t>4.2. Погода: из часов в признаки</w:t>
       </w:r>
@@ -12101,7 +12305,7 @@
       <w:pPr>
         <w:pStyle w:val="21"/>
       </w:pPr>
-      <w:bookmarkStart w:id="21" w:name="_Toc244085472"/>
+      <w:bookmarkStart w:id="21" w:name="_Toc244090965"/>
       <w:r>
         <w:t>4.3. Защита от утечки будущего</w:t>
       </w:r>
@@ -12199,7 +12403,7 @@
       <w:pPr>
         <w:pStyle w:val="21"/>
       </w:pPr>
-      <w:bookmarkStart w:id="22" w:name="_Toc244085473"/>
+      <w:bookmarkStart w:id="22" w:name="_Toc244090966"/>
       <w:r>
         <w:t>4.4. Автоматические тесты</w:t>
       </w:r>
@@ -12307,7 +12511,7 @@
       <w:pPr>
         <w:pStyle w:val="1"/>
       </w:pPr>
-      <w:bookmarkStart w:id="23" w:name="_Toc244085474"/>
+      <w:bookmarkStart w:id="23" w:name="_Toc244090967"/>
       <w:r>
         <w:t>5. Признаки</w:t>
       </w:r>
@@ -12335,7 +12539,7 @@
       <w:pPr>
         <w:pStyle w:val="21"/>
       </w:pPr>
-      <w:bookmarkStart w:id="24" w:name="_Toc244085475"/>
+      <w:bookmarkStart w:id="24" w:name="_Toc244090968"/>
       <w:r>
         <w:t>5.1. Погода по месяцам</w:t>
       </w:r>
@@ -12424,7 +12628,7 @@
           <w:noProof/>
         </w:rPr>
         <w:drawing>
-          <wp:inline distT="0" distB="0" distL="0" distR="0" wp14:anchorId="0B806EFB" wp14:editId="592E4276">
+          <wp:inline distT="0" distB="0" distL="0" distR="0" wp14:anchorId="26E8084E" wp14:editId="2E936B22">
             <wp:extent cx="5652926" cy="2751644"/>
             <wp:effectExtent l="0" t="0" r="0" b="0"/>
             <wp:docPr id="4" name="Picture 4"/>
@@ -12487,7 +12691,7 @@
       <w:pPr>
         <w:pStyle w:val="21"/>
       </w:pPr>
-      <w:bookmarkStart w:id="25" w:name="_Toc244085476"/>
+      <w:bookmarkStart w:id="25" w:name="_Toc244090969"/>
       <w:r>
         <w:t>5.2. Окна культуры</w:t>
       </w:r>
@@ -12505,7 +12709,7 @@
       <w:pPr>
         <w:pStyle w:val="21"/>
       </w:pPr>
-      <w:bookmarkStart w:id="26" w:name="_Toc244085477"/>
+      <w:bookmarkStart w:id="26" w:name="_Toc244090970"/>
       <w:r>
         <w:t>5.3. Почвы и рельеф</w:t>
       </w:r>
@@ -12523,7 +12727,7 @@
       <w:pPr>
         <w:pStyle w:val="21"/>
       </w:pPr>
-      <w:bookmarkStart w:id="27" w:name="_Toc244085478"/>
+      <w:bookmarkStart w:id="27" w:name="_Toc244090971"/>
       <w:r>
         <w:t>5.4. Спутник</w:t>
       </w:r>
@@ -12541,7 +12745,7 @@
       <w:pPr>
         <w:pStyle w:val="21"/>
       </w:pPr>
-      <w:bookmarkStart w:id="28" w:name="_Toc244085479"/>
+      <w:bookmarkStart w:id="28" w:name="_Toc244090972"/>
       <w:r>
         <w:t>5.5. Регион и прошлые отклонения</w:t>
       </w:r>
@@ -12559,7 +12763,7 @@
       <w:pPr>
         <w:pStyle w:val="21"/>
       </w:pPr>
-      <w:bookmarkStart w:id="29" w:name="_Toc244085480"/>
+      <w:bookmarkStart w:id="29" w:name="_Toc244090973"/>
       <w:r>
         <w:t>5.6. Наборы признаков в эксперименте</w:t>
       </w:r>
@@ -13251,7 +13455,7 @@
       <w:pPr>
         <w:pStyle w:val="1"/>
       </w:pPr>
-      <w:bookmarkStart w:id="30" w:name="_Toc244085481"/>
+      <w:bookmarkStart w:id="30" w:name="_Toc244090974"/>
       <w:r>
         <w:lastRenderedPageBreak/>
         <w:t>6. Методология моделирования и проверки</w:t>
@@ -13262,7 +13466,7 @@
       <w:pPr>
         <w:pStyle w:val="21"/>
       </w:pPr>
-      <w:bookmarkStart w:id="31" w:name="_Toc244085482"/>
+      <w:bookmarkStart w:id="31" w:name="_Toc244090975"/>
       <w:r>
         <w:t>6.1. Модель «тренд × погода»</w:t>
       </w:r>
@@ -13340,7 +13544,7 @@
       <w:pPr>
         <w:pStyle w:val="21"/>
       </w:pPr>
-      <w:bookmarkStart w:id="32" w:name="_Toc244085483"/>
+      <w:bookmarkStart w:id="32" w:name="_Toc244090976"/>
       <w:r>
         <w:t>6.2. Даты прогноза</w:t>
       </w:r>
@@ -13351,14 +13555,14 @@
         <w:ind w:firstLine="425"/>
       </w:pPr>
       <w:r>
-        <w:t>Калькулятор полезен в разные моменты сезона, поэтому каждая модель обучается и проверяется на пяти датах: 1 мая, 1 июня, 1 июля, 1 августа и в конце сезона. На дату D признаки содержат только закончившиеся месяцы. Для оставшихся месяцев в прототипе подставляются погодные сценарии прошлых лет, и получается распределение прогноза.</w:t>
+        <w:t>Калькулятор участка полезен в разные моменты сезона, поэтому каждая модель обучается и проверяется на пяти датах: 1 мая, 1 июня, 1 июля, 1 августа и в конце сезона. На дату D признаки содержат только закончившиеся месяцы. Для оставшихся месяцев в калькуляторе подставляются погодные сценарии прошлых лет, и получается распределение прогноза.</w:t>
       </w:r>
     </w:p>
     <w:p>
       <w:pPr>
         <w:pStyle w:val="21"/>
       </w:pPr>
-      <w:bookmarkStart w:id="33" w:name="_Toc244085484"/>
+      <w:bookmarkStart w:id="33" w:name="_Toc244090977"/>
       <w:r>
         <w:t>6.3. Скользящая проверка</w:t>
       </w:r>
@@ -13369,7 +13573,7 @@
         <w:ind w:firstLine="425"/>
       </w:pPr>
       <w:r>
-        <w:t>Проверка повторяет то, как калькулятор будет работать в жизни. Для каждого года t = 2012…2025:</w:t>
+        <w:t>Проверка повторяет то, как региональный прогноз будет работать в жизни. Для каждого года t = 2012…2025:</w:t>
       </w:r>
     </w:p>
     <w:p>
@@ -13419,7 +13623,7 @@
       <w:pPr>
         <w:pStyle w:val="21"/>
       </w:pPr>
-      <w:bookmarkStart w:id="34" w:name="_Toc244085485"/>
+      <w:bookmarkStart w:id="34" w:name="_Toc244090978"/>
       <w:r>
         <w:t>6.4. Метрики и бейзлайны</w:t>
       </w:r>
@@ -13526,7 +13730,7 @@
       <w:pPr>
         <w:pStyle w:val="21"/>
       </w:pPr>
-      <w:bookmarkStart w:id="35" w:name="_Toc244085486"/>
+      <w:bookmarkStart w:id="35" w:name="_Toc244090979"/>
       <w:r>
         <w:t>6.5. Интервалы</w:t>
       </w:r>
@@ -13547,7 +13751,7 @@
       <w:pPr>
         <w:pStyle w:val="21"/>
       </w:pPr>
-      <w:bookmarkStart w:id="36" w:name="_Toc244085487"/>
+      <w:bookmarkStart w:id="36" w:name="_Toc244090980"/>
       <w:r>
         <w:t>6.6. Протокол перебора</w:t>
       </w:r>
@@ -14094,7 +14298,7 @@
       <w:pPr>
         <w:pStyle w:val="1"/>
       </w:pPr>
-      <w:bookmarkStart w:id="37" w:name="_Toc244085488"/>
+      <w:bookmarkStart w:id="37" w:name="_Toc244090981"/>
       <w:r>
         <w:t>7. Эксперименты</w:t>
       </w:r>
@@ -14112,7 +14316,7 @@
       <w:pPr>
         <w:pStyle w:val="21"/>
       </w:pPr>
-      <w:bookmarkStart w:id="38" w:name="_Toc244085489"/>
+      <w:bookmarkStart w:id="38" w:name="_Toc244090982"/>
       <w:r>
         <w:lastRenderedPageBreak/>
         <w:t>7.1. Первая модель</w:t>
@@ -14138,7 +14342,7 @@
           <w:noProof/>
         </w:rPr>
         <w:drawing>
-          <wp:inline distT="0" distB="0" distL="0" distR="0" wp14:anchorId="5EB89A4F" wp14:editId="6B04A2B0">
+          <wp:inline distT="0" distB="0" distL="0" distR="0" wp14:anchorId="6881C62D" wp14:editId="559C897C">
             <wp:extent cx="5420159" cy="2826463"/>
             <wp:effectExtent l="0" t="0" r="0" b="0"/>
             <wp:docPr id="5" name="Picture 5"/>
@@ -14200,7 +14404,7 @@
       <w:pPr>
         <w:pStyle w:val="21"/>
       </w:pPr>
-      <w:bookmarkStart w:id="39" w:name="_Toc244085490"/>
+      <w:bookmarkStart w:id="39" w:name="_Toc244090983"/>
       <w:r>
         <w:t>7.2. Тренд и цель важнее модели</w:t>
       </w:r>
@@ -14225,7 +14429,7 @@
           <w:noProof/>
         </w:rPr>
         <w:drawing>
-          <wp:inline distT="0" distB="0" distL="0" distR="0" wp14:anchorId="2BE2198C" wp14:editId="1BFAE102">
+          <wp:inline distT="0" distB="0" distL="0" distR="0" wp14:anchorId="71532B6B" wp14:editId="1EB58BC1">
             <wp:extent cx="3666089" cy="2460686"/>
             <wp:effectExtent l="0" t="0" r="0" b="0"/>
             <wp:docPr id="6" name="Picture 6"/>
@@ -14300,7 +14504,7 @@
       <w:pPr>
         <w:pStyle w:val="21"/>
       </w:pPr>
-      <w:bookmarkStart w:id="40" w:name="_Toc244085491"/>
+      <w:bookmarkStart w:id="40" w:name="_Toc244090984"/>
       <w:r>
         <w:t>7.3. Какие признаки работают</w:t>
       </w:r>
@@ -14317,7 +14521,7 @@
           <w:noProof/>
         </w:rPr>
         <w:drawing>
-          <wp:inline distT="0" distB="0" distL="0" distR="0" wp14:anchorId="0296D8B4" wp14:editId="70043619">
+          <wp:inline distT="0" distB="0" distL="0" distR="0" wp14:anchorId="35BF2389" wp14:editId="00C30FFF">
             <wp:extent cx="5374437" cy="2664357"/>
             <wp:effectExtent l="0" t="0" r="0" b="0"/>
             <wp:docPr id="7" name="Picture 7"/>
@@ -14379,7 +14583,7 @@
       <w:pPr>
         <w:pStyle w:val="21"/>
       </w:pPr>
-      <w:bookmarkStart w:id="41" w:name="_Toc244085492"/>
+      <w:bookmarkStart w:id="41" w:name="_Toc244090985"/>
       <w:r>
         <w:t>7.4. Спутник: v1 против v2</w:t>
       </w:r>
@@ -14404,7 +14608,7 @@
           <w:noProof/>
         </w:rPr>
         <w:drawing>
-          <wp:inline distT="0" distB="0" distL="0" distR="0" wp14:anchorId="6C9C4C93" wp14:editId="43329F1C">
+          <wp:inline distT="0" distB="0" distL="0" distR="0" wp14:anchorId="56495937" wp14:editId="56F079EF">
             <wp:extent cx="5374437" cy="2755802"/>
             <wp:effectExtent l="0" t="0" r="0" b="0"/>
             <wp:docPr id="8" name="Picture 8"/>
@@ -14478,7 +14682,7 @@
       <w:pPr>
         <w:pStyle w:val="21"/>
       </w:pPr>
-      <w:bookmarkStart w:id="42" w:name="_Toc244085493"/>
+      <w:bookmarkStart w:id="42" w:name="_Toc244090986"/>
       <w:r>
         <w:t>7.5. Модели и ансамбли</w:t>
       </w:r>
@@ -14495,7 +14699,7 @@
           <w:noProof/>
         </w:rPr>
         <w:drawing>
-          <wp:inline distT="0" distB="0" distL="0" distR="0" wp14:anchorId="080ECAD2" wp14:editId="3A877F01">
+          <wp:inline distT="0" distB="0" distL="0" distR="0" wp14:anchorId="62829ACB" wp14:editId="477936D6">
             <wp:extent cx="5615517" cy="2631105"/>
             <wp:effectExtent l="0" t="0" r="0" b="0"/>
             <wp:docPr id="9" name="Picture 9"/>
@@ -15979,7 +16183,7 @@
       <w:pPr>
         <w:pStyle w:val="21"/>
       </w:pPr>
-      <w:bookmarkStart w:id="43" w:name="_Toc244085494"/>
+      <w:bookmarkStart w:id="43" w:name="_Toc244090987"/>
       <w:r>
         <w:t>7.6. Лесенка моделей: от наивной до лучшей</w:t>
       </w:r>
@@ -16094,7 +16298,7 @@
           <w:noProof/>
         </w:rPr>
         <w:drawing>
-          <wp:inline distT="0" distB="0" distL="0" distR="0" wp14:anchorId="7B202359" wp14:editId="1AF9134E">
+          <wp:inline distT="0" distB="0" distL="0" distR="0" wp14:anchorId="10398876" wp14:editId="0A34CCBF">
             <wp:extent cx="4962937" cy="2365084"/>
             <wp:effectExtent l="0" t="0" r="0" b="0"/>
             <wp:docPr id="10" name="Picture 10"/>
@@ -16231,7 +16435,7 @@
         </w:rPr>
         <w:lastRenderedPageBreak/>
         <w:drawing>
-          <wp:inline distT="0" distB="0" distL="0" distR="0" wp14:anchorId="6066687B" wp14:editId="53C32C05">
+          <wp:inline distT="0" distB="0" distL="0" distR="0" wp14:anchorId="269F5F81" wp14:editId="4B1FA078">
             <wp:extent cx="5669553" cy="3167302"/>
             <wp:effectExtent l="0" t="0" r="0" b="0"/>
             <wp:docPr id="11" name="Picture 11"/>
@@ -17408,7 +17612,7 @@
           <w:noProof/>
         </w:rPr>
         <w:drawing>
-          <wp:inline distT="0" distB="0" distL="0" distR="0" wp14:anchorId="017CA6E5" wp14:editId="261B41F6">
+          <wp:inline distT="0" distB="0" distL="0" distR="0" wp14:anchorId="175BF5CF" wp14:editId="3DF1D45A">
             <wp:extent cx="5071007" cy="2257014"/>
             <wp:effectExtent l="0" t="0" r="0" b="0"/>
             <wp:docPr id="12" name="Picture 12"/>
@@ -17470,7 +17674,7 @@
       <w:pPr>
         <w:pStyle w:val="21"/>
       </w:pPr>
-      <w:bookmarkStart w:id="44" w:name="_Toc244085495"/>
+      <w:bookmarkStart w:id="44" w:name="_Toc244090988"/>
       <w:r>
         <w:lastRenderedPageBreak/>
         <w:t>7.7. Прогноз по ходу сезона</w:t>
@@ -17488,7 +17692,7 @@
           <w:noProof/>
         </w:rPr>
         <w:drawing>
-          <wp:inline distT="0" distB="0" distL="0" distR="0" wp14:anchorId="7EBE38A1" wp14:editId="628F8204">
+          <wp:inline distT="0" distB="0" distL="0" distR="0" wp14:anchorId="016C457C" wp14:editId="31B24FC8">
             <wp:extent cx="5220644" cy="2489781"/>
             <wp:effectExtent l="0" t="0" r="0" b="0"/>
             <wp:docPr id="13" name="Picture 13"/>
@@ -17543,14 +17747,14 @@
         <w:ind w:firstLine="425"/>
       </w:pPr>
       <w:r>
-        <w:t>Озимая пшеница даёт выигрыш около 15 % уже 1 мая: к этой дате прошли осень, зима и весна, а запас влаги и перезимовка во многом определяют урожай. У яровых, кукурузы, сои и свёклы весенний прогноз лишь немного лучше тренда, а полезный погодный сигнал появляется с 1 августа, когда прошли июнь и июль. Это важно для продукта. Весной калькулятор честно показывает «тренд с широким интервалом» и не обещает точности, которой нет.</w:t>
+        <w:t>Озимая пшеница даёт выигрыш около 15 % уже 1 мая: к этой дате прошли осень, зима и весна, а запас влаги и перезимовка во многом определяют урожай. У яровых, кукурузы, сои и свёклы весенний прогноз лишь немного лучше тренда, а полезный погодный сигнал появляется с 1 августа, когда прошли июнь и июль. Это важно для продукта. Весной калькулятор участка честно показывает «тренд с широким интервалом» и не обещает точности, которой нет.</w:t>
       </w:r>
     </w:p>
     <w:p>
       <w:pPr>
         <w:pStyle w:val="21"/>
       </w:pPr>
-      <w:bookmarkStart w:id="45" w:name="_Toc244085496"/>
+      <w:bookmarkStart w:id="45" w:name="_Toc244090989"/>
       <w:r>
         <w:t>7.8. Итоговые модели</w:t>
       </w:r>
@@ -18684,7 +18888,7 @@
       <w:pPr>
         <w:pStyle w:val="21"/>
       </w:pPr>
-      <w:bookmarkStart w:id="46" w:name="_Toc244085497"/>
+      <w:bookmarkStart w:id="46" w:name="_Toc244090990"/>
       <w:r>
         <w:lastRenderedPageBreak/>
         <w:t>7.9. Ошибка по годам</w:t>
@@ -18702,7 +18906,7 @@
           <w:noProof/>
         </w:rPr>
         <w:drawing>
-          <wp:inline distT="0" distB="0" distL="0" distR="0" wp14:anchorId="367BCFE9" wp14:editId="46E3EC2B">
+          <wp:inline distT="0" distB="0" distL="0" distR="0" wp14:anchorId="20AB8C2B" wp14:editId="702D0ACC">
             <wp:extent cx="5374437" cy="2248700"/>
             <wp:effectExtent l="0" t="0" r="0" b="0"/>
             <wp:docPr id="14" name="Picture 14"/>
@@ -18771,7 +18975,7 @@
           <w:noProof/>
         </w:rPr>
         <w:drawing>
-          <wp:inline distT="0" distB="0" distL="0" distR="0" wp14:anchorId="30E81540" wp14:editId="5283F3BE">
+          <wp:inline distT="0" distB="0" distL="0" distR="0" wp14:anchorId="0B042D02" wp14:editId="3A3F6F62">
             <wp:extent cx="5582265" cy="3254589"/>
             <wp:effectExtent l="0" t="0" r="0" b="0"/>
             <wp:docPr id="15" name="Picture 15"/>
@@ -18825,7 +19029,7 @@
       <w:pPr>
         <w:pStyle w:val="1"/>
       </w:pPr>
-      <w:bookmarkStart w:id="47" w:name="_Toc244085498"/>
+      <w:bookmarkStart w:id="47" w:name="_Toc244090991"/>
       <w:r>
         <w:t>8. Интерпретация и неопределённость</w:t>
       </w:r>
@@ -18835,7 +19039,7 @@
       <w:pPr>
         <w:pStyle w:val="21"/>
       </w:pPr>
-      <w:bookmarkStart w:id="48" w:name="_Toc244085499"/>
+      <w:bookmarkStart w:id="48" w:name="_Toc244090992"/>
       <w:r>
         <w:t>8.1. Что двигает прогноз: SHAP</w:t>
       </w:r>
@@ -18864,7 +19068,7 @@
           <w:noProof/>
         </w:rPr>
         <w:drawing>
-          <wp:inline distT="0" distB="0" distL="0" distR="0" wp14:anchorId="2B2AA268" wp14:editId="1DA53637">
+          <wp:inline distT="0" distB="0" distL="0" distR="0" wp14:anchorId="2EA0CB49" wp14:editId="69A36A56">
             <wp:extent cx="5694492" cy="2938690"/>
             <wp:effectExtent l="0" t="0" r="0" b="0"/>
             <wp:docPr id="16" name="Picture 16"/>
@@ -18933,7 +19137,7 @@
           <w:noProof/>
         </w:rPr>
         <w:drawing>
-          <wp:inline distT="0" distB="0" distL="0" distR="0" wp14:anchorId="661DABED" wp14:editId="1B599C09">
+          <wp:inline distT="0" distB="0" distL="0" distR="0" wp14:anchorId="3D3355A3" wp14:editId="7569135F">
             <wp:extent cx="4604727" cy="3312000"/>
             <wp:effectExtent l="0" t="0" r="0" b="0"/>
             <wp:docPr id="17" name="Picture 17"/>
@@ -19060,7 +19264,7 @@
       <w:pPr>
         <w:pStyle w:val="21"/>
       </w:pPr>
-      <w:bookmarkStart w:id="49" w:name="_Toc244085500"/>
+      <w:bookmarkStart w:id="49" w:name="_Toc244090993"/>
       <w:r>
         <w:t>8.2. Насколько можно доверять интервалу</w:t>
       </w:r>
@@ -19077,7 +19281,7 @@
           <w:noProof/>
         </w:rPr>
         <w:drawing>
-          <wp:inline distT="0" distB="0" distL="0" distR="0" wp14:anchorId="57C3BF30" wp14:editId="0B8A7DF1">
+          <wp:inline distT="0" distB="0" distL="0" distR="0" wp14:anchorId="5B191673" wp14:editId="6C7F2C31">
             <wp:extent cx="5374437" cy="2269483"/>
             <wp:effectExtent l="0" t="0" r="0" b="0"/>
             <wp:docPr id="18" name="Picture 18"/>
@@ -19150,9 +19354,9 @@
       <w:pPr>
         <w:pStyle w:val="21"/>
       </w:pPr>
-      <w:bookmarkStart w:id="50" w:name="_Toc244085501"/>
-      <w:r>
-        <w:t>8.3. Прогноз на 2026 год</w:t>
+      <w:bookmarkStart w:id="50" w:name="_Toc244090994"/>
+      <w:r>
+        <w:t>8.3. Оценка на 2026 год по фактической погоде</w:t>
       </w:r>
       <w:bookmarkEnd w:id="50"/>
     </w:p>
@@ -19161,7 +19365,7 @@
         <w:ind w:firstLine="425"/>
       </w:pPr>
       <w:r>
-        <w:t>Итоговые модели, обученные на сезонах до 2025 года, с погодой 2026 года по 22 октября дают такую картину (средние по субъектам с весами посевной площади):</w:t>
+        <w:t>Итоговые модели, обученные на сезонах до 2025 года, по фактической погоде сезона 2026 года (до 22 октября) дают такую оценку урожайности — это не прогноз, а оценка по фактической погоде завершившегося сезона (средние по субъектам с весами посевной площади):</w:t>
       </w:r>
     </w:p>
     <w:p>
@@ -19176,8 +19380,8 @@
         </w:rPr>
         <w:lastRenderedPageBreak/>
         <w:drawing>
-          <wp:inline distT="0" distB="0" distL="0" distR="0" wp14:anchorId="5B0E306F" wp14:editId="4A6500C5">
-            <wp:extent cx="5827502" cy="2606166"/>
+          <wp:inline distT="0" distB="0" distL="0" distR="0" wp14:anchorId="65CF3BA6" wp14:editId="5A304637">
+            <wp:extent cx="5773467" cy="2606165"/>
             <wp:effectExtent l="0" t="0" r="0" b="0"/>
             <wp:docPr id="19" name="Picture 19"/>
             <wp:cNvGraphicFramePr>
@@ -19199,7 +19403,7 @@
                   <pic:spPr>
                     <a:xfrm>
                       <a:off x="0" y="0"/>
-                      <a:ext cx="5827502" cy="2606166"/>
+                      <a:ext cx="5773467" cy="2606165"/>
                     </a:xfrm>
                     <a:prstGeom prst="rect">
                       <a:avLst/>
@@ -19223,7 +19427,7 @@
         <w:t xml:space="preserve">Рисунок 19. </w:t>
       </w:r>
       <w:r>
-        <w:t>Прогноз урожайности 2026 года относительно тренда</w:t>
+        <w:t>Оценка урожайности 2026 года по фактической погоде сезона относительно тренда</w:t>
       </w:r>
     </w:p>
     <w:p>
@@ -19234,14 +19438,14 @@
         <w:t>Выше тренда модели ставят озимую пшеницу (около +16 %), сахарную свёклу, кукурузу и сою: на юге июль 2026 года был прохладным и влажнее нормы. Ниже тренда — яровую пшеницу и ячмень: в Сибири был жаркий сухой июнь (Алтай: +4,8 °C к норме, водный баланс −78 мм). Подсолнечник — около тренда. Интервалы широкие: у каждой культуры 80-процентный диапазон захватывает и провал на 10–25 %, и прибавку на 20–45 % к тренду. Предварительная модель первой версии ставила подсолнечник на 8 % выше тренда, а оперативные данны</w:t>
       </w:r>
       <w:r>
-        <w:t>е Росстата на 1 октября показывали обратное. Итоговые модели с прошлыми отклонениями и спутником этот перекос убрали. Окончательно прогноз можно будет проверить по итогам Росстата весной 2027 года. Это настоящий прогноз «вслепую», а не подгонка под известный ответ.</w:t>
+        <w:t>е Росстата на 1 октября показывали обратное. Итоговые модели с прошлыми отклонениями и спутником этот перекос убрали. Окончательно прогноз можно будет проверить по итогам Росстата весной 2027 года. Это оценка «вслепую», а не подгонка под известный ответ: итогов Росстата за 2026 год ещё нет.</w:t>
       </w:r>
     </w:p>
     <w:p>
       <w:pPr>
         <w:pStyle w:val="1"/>
       </w:pPr>
-      <w:bookmarkStart w:id="51" w:name="_Toc244085502"/>
+      <w:bookmarkStart w:id="51" w:name="_Toc244090995"/>
       <w:r>
         <w:t>9. Оптимизация структуры посевов</w:t>
       </w:r>
@@ -19259,7 +19463,7 @@
       <w:pPr>
         <w:pStyle w:val="21"/>
       </w:pPr>
-      <w:bookmarkStart w:id="52" w:name="_Toc244085503"/>
+      <w:bookmarkStart w:id="52" w:name="_Toc244090996"/>
       <w:r>
         <w:t>9.1. Постановка</w:t>
       </w:r>
@@ -19402,6 +19606,7 @@
           <w:i/>
           <w:sz w:val="23"/>
         </w:rPr>
+        <w:lastRenderedPageBreak/>
         <w:t>min  −(1 − λ) Σs ps πs + λ (η + (1/α) Σs ps us),   us ≥ −πs − η,  us ≥ 0</w:t>
       </w:r>
     </w:p>
@@ -19410,7 +19615,6 @@
         <w:ind w:firstLine="425"/>
       </w:pPr>
       <w:r>
-        <w:lastRenderedPageBreak/>
         <w:t>Ограничения отражают агрономию и реальность хозяйства:</w:t>
       </w:r>
     </w:p>
@@ -19506,7 +19710,7 @@
       <w:pPr>
         <w:pStyle w:val="21"/>
       </w:pPr>
-      <w:bookmarkStart w:id="53" w:name="_Toc244085504"/>
+      <w:bookmarkStart w:id="53" w:name="_Toc244090997"/>
       <w:r>
         <w:t>9.2. Данные и допущения</w:t>
       </w:r>
@@ -20054,7 +20258,7 @@
       <w:pPr>
         <w:pStyle w:val="21"/>
       </w:pPr>
-      <w:bookmarkStart w:id="54" w:name="_Toc244085505"/>
+      <w:bookmarkStart w:id="54" w:name="_Toc244090998"/>
       <w:r>
         <w:t>9.3. Эффект малых изменений</w:t>
       </w:r>
@@ -20071,7 +20275,7 @@
           <w:noProof/>
         </w:rPr>
         <w:drawing>
-          <wp:inline distT="0" distB="0" distL="0" distR="0" wp14:anchorId="1FDB555E" wp14:editId="3C66BBC9">
+          <wp:inline distT="0" distB="0" distL="0" distR="0" wp14:anchorId="09028FF0" wp14:editId="4258A981">
             <wp:extent cx="5781780" cy="2398337"/>
             <wp:effectExtent l="0" t="0" r="0" b="0"/>
             <wp:docPr id="20" name="Picture 20"/>
@@ -20126,11 +20330,8 @@
         <w:ind w:firstLine="425"/>
       </w:pPr>
       <w:r>
-        <w:t xml:space="preserve">Масштаб задачи — 62 субъектов и 50,1 млн га посевов семи культур. При текущем плане средняя прибыль пула при принятых затратах — 8 729 руб./га. Уже сдвиг не более 5 п. п. на </w:t>
-      </w:r>
-      <w:r>
         <w:lastRenderedPageBreak/>
-        <w:t>культуру поднимает её на 1 301 руб./га (+15 %)</w:t>
+        <w:t>Масштаб задачи — 62 субъектов и 50,1 млн га посевов семи культур. При текущем плане средняя прибыль пула при принятых затратах — 8 729 руб./га. Уже сдвиг не более 5 п. п. на культуру поднимает её на 1 301 руб./га (+15 %)</w:t>
       </w:r>
       <w:r>
         <w:t>, а прибыль в худших 20 % сезонов — на 1 272 руб./га. Худший сезон становится лучше в 56 субъектах из 62. При δ = 10 п. п. ожидаемая прибыль растёт на 2 367 руб./га.</w:t>
@@ -21397,7 +21598,14 @@
               <w:rPr>
                 <w:sz w:val="16"/>
               </w:rPr>
-              <w:t>Республика Башкортостан</w:t>
+              <w:t xml:space="preserve">Республика </w:t>
+            </w:r>
+            <w:r>
+              <w:rPr>
+                <w:sz w:val="16"/>
+              </w:rPr>
+              <w:lastRenderedPageBreak/>
+              <w:t>Башкортостан</w:t>
             </w:r>
           </w:p>
         </w:tc>
@@ -21414,6 +21622,7 @@
               <w:rPr>
                 <w:sz w:val="16"/>
               </w:rPr>
+              <w:lastRenderedPageBreak/>
               <w:t>1 487</w:t>
             </w:r>
           </w:p>
@@ -21482,7 +21691,14 @@
               <w:rPr>
                 <w:sz w:val="16"/>
               </w:rPr>
-              <w:t>озимая пшеница −10; яровая пшеница −10; ячмень +5; кукуруза +10; подсолнечник +5 п.п.</w:t>
+              <w:t xml:space="preserve">озимая пшеница −10; яровая пшеница −10; </w:t>
+            </w:r>
+            <w:r>
+              <w:rPr>
+                <w:sz w:val="16"/>
+              </w:rPr>
+              <w:lastRenderedPageBreak/>
+              <w:t>ячмень +5; кукуруза +10; подсолнечник +5 п.п.</w:t>
             </w:r>
           </w:p>
         </w:tc>
@@ -21498,7 +21714,6 @@
         <w:ind w:firstLine="425"/>
       </w:pPr>
       <w:r>
-        <w:lastRenderedPageBreak/>
         <w:t>Типичная рекомендация — немного сократить озимую и яровую пшеницу в пользу кукурузы, сои и подсолнечника там, где это позволяет севооборот. Это культуры с большей маржой на гектар при текущих ценах. Регионы различаются: на Кубани план, наоборот, сокращает кукурузу и сою в пользу озимой пшеницы. Ограничения не дают уйти в монокультуру, а CVaR штрафует планы, которые проваливаются в засуху.</w:t>
       </w:r>
     </w:p>
@@ -21506,7 +21721,7 @@
       <w:pPr>
         <w:pStyle w:val="21"/>
       </w:pPr>
-      <w:bookmarkStart w:id="55" w:name="_Toc244085506"/>
+      <w:bookmarkStart w:id="55" w:name="_Toc244090999"/>
       <w:r>
         <w:t>9.4. Историческая проверка</w:t>
       </w:r>
@@ -21537,7 +21752,7 @@
           <w:noProof/>
         </w:rPr>
         <w:drawing>
-          <wp:inline distT="0" distB="0" distL="0" distR="0" wp14:anchorId="4C3ED02E" wp14:editId="20C55D77">
+          <wp:inline distT="0" distB="0" distL="0" distR="0" wp14:anchorId="5E6B7FFF" wp14:editId="5D1A3413">
             <wp:extent cx="5832000" cy="2554479"/>
             <wp:effectExtent l="0" t="0" r="0" b="0"/>
             <wp:docPr id="21" name="Picture 21"/>
@@ -22683,6 +22898,7 @@
         <w:pStyle w:val="a0"/>
       </w:pPr>
       <w:r>
+        <w:lastRenderedPageBreak/>
         <w:t>В плохие годы (худшие 20 % лет каждого субъекта) прибыль выросла с 4 669</w:t>
       </w:r>
       <w:r>
@@ -22694,7 +22910,6 @@
         <w:pStyle w:val="a0"/>
       </w:pPr>
       <w:r>
-        <w:lastRenderedPageBreak/>
         <w:t>Обещание систематически завышено примерно на 20 %. Это известное «проклятие оптимизатора»: выбирается план, который по оценке выглядит лучше, чем есть. Поэтому обещанные цифры стоит читать как верхнюю оценку.</w:t>
       </w:r>
     </w:p>
@@ -22726,7 +22941,7 @@
       <w:pPr>
         <w:pStyle w:val="21"/>
       </w:pPr>
-      <w:bookmarkStart w:id="56" w:name="_Toc244085507"/>
+      <w:bookmarkStart w:id="56" w:name="_Toc244091000"/>
       <w:r>
         <w:t>9.5. Чувствительность</w:t>
       </w:r>
@@ -22743,7 +22958,7 @@
           <w:noProof/>
         </w:rPr>
         <w:drawing>
-          <wp:inline distT="0" distB="0" distL="0" distR="0" wp14:anchorId="4E9F4F28" wp14:editId="50ACA2D2">
+          <wp:inline distT="0" distB="0" distL="0" distR="0" wp14:anchorId="514C9FF5" wp14:editId="03A158CB">
             <wp:extent cx="5832000" cy="2514148"/>
             <wp:effectExtent l="0" t="0" r="0" b="0"/>
             <wp:docPr id="22" name="Picture 22"/>
@@ -22805,9 +23020,9 @@
       <w:pPr>
         <w:pStyle w:val="1"/>
       </w:pPr>
-      <w:bookmarkStart w:id="57" w:name="_Toc244085508"/>
-      <w:r>
-        <w:t>10. Прототип «Агрокаст»</w:t>
+      <w:bookmarkStart w:id="57" w:name="_Toc244091001"/>
+      <w:r>
+        <w:t>10. Прототип «Агрокаст»: калькулятор участка</w:t>
       </w:r>
       <w:bookmarkEnd w:id="57"/>
     </w:p>
@@ -22816,33 +23031,125 @@
         <w:ind w:firstLine="425"/>
       </w:pPr>
       <w:r>
-        <w:t>Результаты исследования собраны в прототип — статический сайт «Агрокаст». Он работает без сервера и без интернета: HTML, CSS и JavaScript с библиотекой графиков ECharts. Его можно опубликовать на GitHub Pages прямо из репозитория. Данные для сайта выгружаются скриптами из чистого слоя и из результатов моделей в JSON-файлы с описанным контрактом, так что сайт обновляется вместе с моделями. Прогнозы, интервалы, погодные сценарии и метрики на сайте — результаты итоговых моделей перебора; допущениями остаются т</w:t>
-      </w:r>
-      <w:r>
-        <w:t>олько затраты на гектар, и пользователь может их изменить.</w:t>
-      </w:r>
-    </w:p>
-    <w:p>
-      <w:pPr>
-        <w:ind w:firstLine="425"/>
-      </w:pPr>
-      <w:r>
-        <w:lastRenderedPageBreak/>
-        <w:t>Сайт состоит из пяти экранов.</w:t>
-      </w:r>
-    </w:p>
-    <w:p>
-      <w:pPr>
-        <w:ind w:firstLine="425"/>
-      </w:pPr>
+        <w:t xml:space="preserve">Прототип собран как </w:t>
+      </w:r>
       <w:r>
         <w:rPr>
           <w:b/>
         </w:rPr>
-        <w:t>Обзор.</w:t>
-      </w:r>
-      <w:r>
-        <w:t xml:space="preserve"> Карта России с прогнозом урожайности или отклонением от тренда по субъектам, выбор культуры и шкала дат «1 мая → конец сезона» с проигрыванием. Видно, как прогноз уточняется по мере прихода погоды. Ключевые показатели по стране и крупнейшие регионы.</w:t>
+        <w:t>калькулятор участка</w:t>
+      </w:r>
+      <w:r>
+        <w:t xml:space="preserve"> — именно его просит кейс: ввести параметры участка и получить урожайность в тоннах на гектар и общий объём, а затем понять, что это даёт для затрат и доходов. Региональный прогноз (модель из разделов 6–8) служит его основой: калькулятор берёт прогноз для региона и пересчитывает его на площадь и параметры хозяйства. </w:t>
+      </w:r>
+      <w:r>
+        <w:lastRenderedPageBreak/>
+        <w:t>Прототип — статический сайт без сервера: HTML, CSS и JavaScript с библиотекой графиков ECharts. Исходный код: &lt;https://github.com/Parampaika/AgroCast&gt;, сайт: &lt;https://parampaika.github.io/AgroCa</w:t>
+      </w:r>
+      <w:r>
+        <w:t>st/&gt;. Данные для сайта выгружаются скриптами из чистого слоя и результатов моделей в JSON-файлы с описанным контрактом, поэтому сайт обновляется вместе с моделями.</w:t>
+      </w:r>
+    </w:p>
+    <w:p>
+      <w:pPr>
+        <w:pStyle w:val="21"/>
+      </w:pPr>
+      <w:bookmarkStart w:id="58" w:name="_Toc244091002"/>
+      <w:r>
+        <w:t>10.1. Что в калькуляторе от модели, а что — допущение</w:t>
+      </w:r>
+      <w:bookmarkEnd w:id="58"/>
+    </w:p>
+    <w:p>
+      <w:pPr>
+        <w:ind w:firstLine="425"/>
+      </w:pPr>
+      <w:r>
+        <w:t>Это самое важное для честного чтения результатов.</w:t>
+      </w:r>
+    </w:p>
+    <w:p>
+      <w:pPr>
+        <w:pStyle w:val="a0"/>
+      </w:pPr>
+      <w:r>
+        <w:rPr>
+          <w:b/>
+        </w:rPr>
+        <w:t>От данных и обученной модели:</w:t>
+      </w:r>
+      <w:r>
+        <w:t xml:space="preserve"> базовый прогноз региона по каждой культуре — на выбранную дату сезона, с интервалом; климат и погода региона и сезона; почвы региона (SoilGrids); цены производителей.</w:t>
+      </w:r>
+    </w:p>
+    <w:p>
+      <w:pPr>
+        <w:pStyle w:val="a0"/>
+      </w:pPr>
+      <w:r>
+        <w:rPr>
+          <w:b/>
+        </w:rPr>
+        <w:t>Допущения, а не результат обучения:</w:t>
+      </w:r>
+      <w:r>
+        <w:t xml:space="preserve"> влияние почвы участка относительно региона, сорта семян и уровня агротехники — множители урожайности и затрат (например, «интенсивная агротехника» — +18 % к урожайности и +30 % к затратам). Затраты на гектар тоже допущения. Открытых данных об урожайности по сортам и агротехнике на уровне хозяйств нет, поэтому обучить на них модель нельзя. Все множители видны пользователю, подписаны как допущения и могут быть заменены собственной поправкой в процентах.</w:t>
+      </w:r>
+    </w:p>
+    <w:p>
+      <w:pPr>
+        <w:ind w:firstLine="425"/>
+      </w:pPr>
+      <w:r>
+        <w:t>Иначе говоря, прогноз для участка = прогноз «среднего хозяйства региона» × множители, заданные пользователем. Участок-специфичные эффекты нами не оценивались.</w:t>
+      </w:r>
+    </w:p>
+    <w:p>
+      <w:pPr>
+        <w:pStyle w:val="21"/>
+      </w:pPr>
+      <w:bookmarkStart w:id="59" w:name="_Toc244091003"/>
+      <w:r>
+        <w:t>10.2. Экраны</w:t>
+      </w:r>
+      <w:bookmarkEnd w:id="59"/>
+    </w:p>
+    <w:p>
+      <w:pPr>
+        <w:ind w:firstLine="425"/>
+      </w:pPr>
+      <w:r>
+        <w:rPr>
+          <w:b/>
+        </w:rPr>
+        <w:t>Калькулятор участка</w:t>
+      </w:r>
+      <w:r>
+        <w:t xml:space="preserve"> — экран по умолчанию. Пользователь выбирает регион и дату, на которую считать (1 мая, 1 июня, 1 июля, 1 августа или «итог сезона»), задаёт почву участка относительно региона, сорт семян и агротехнику, при желании вводит собственную поправку к урожайности в процентах и указывает план посевов — гектары по каждой из семи культур; кнопка «Типовой план региона» подставляет структуру посевов по статистике. На выходе:</w:t>
+      </w:r>
+    </w:p>
+    <w:p>
+      <w:pPr>
+        <w:pStyle w:val="a0"/>
+      </w:pPr>
+      <w:r>
+        <w:t>урожайность по каждой культуре в т/га с диапазоном и общий сбор в тоннах;</w:t>
+      </w:r>
+    </w:p>
+    <w:p>
+      <w:pPr>
+        <w:pStyle w:val="a0"/>
+      </w:pPr>
+      <w:r>
+        <w:t>выручка по ценам производителей региона, затраты (допущение) и маржа;</w:t>
+      </w:r>
+    </w:p>
+    <w:p>
+      <w:pPr>
+        <w:pStyle w:val="a0"/>
+      </w:pPr>
+      <w:r>
+        <w:t>диапазон «плохой — обычный — хороший год»: это границы 80-процентного интервала прогноза, то есть результат хуже (лучше) примерно раз в десять лет.</w:t>
       </w:r>
     </w:p>
     <w:p>
@@ -22856,8 +23163,8 @@
           <w:noProof/>
         </w:rPr>
         <w:drawing>
-          <wp:inline distT="0" distB="0" distL="0" distR="0" wp14:anchorId="09EF44B5" wp14:editId="3B2B953E">
-            <wp:extent cx="4212000" cy="2808000"/>
+          <wp:inline distT="0" distB="0" distL="0" distR="0" wp14:anchorId="5FD80E9A" wp14:editId="7EB5263F">
+            <wp:extent cx="2310582" cy="2807999"/>
             <wp:effectExtent l="0" t="0" r="0" b="0"/>
             <wp:docPr id="23" name="Picture 23"/>
             <wp:cNvGraphicFramePr>
@@ -22867,7 +23174,7 @@
               <a:graphicData uri="http://schemas.openxmlformats.org/drawingml/2006/picture">
                 <pic:pic xmlns:pic="http://schemas.openxmlformats.org/drawingml/2006/picture">
                   <pic:nvPicPr>
-                    <pic:cNvPr id="0" name="01_overview.png"/>
+                    <pic:cNvPr id="0" name="01_calc.png"/>
                     <pic:cNvPicPr/>
                   </pic:nvPicPr>
                   <pic:blipFill>
@@ -22879,7 +23186,7 @@
                   <pic:spPr>
                     <a:xfrm>
                       <a:off x="0" y="0"/>
-                      <a:ext cx="4212000" cy="2808000"/>
+                      <a:ext cx="2310582" cy="2807999"/>
                     </a:xfrm>
                     <a:prstGeom prst="rect">
                       <a:avLst/>
@@ -22903,7 +23210,7 @@
         <w:t xml:space="preserve">Рисунок 23. </w:t>
       </w:r>
       <w:r>
-        <w:t>Экран «Обзор»: карта прогноза по субъектам</w:t>
+        <w:t>Калькулятор участка: параметры, план посевов в гектарах, урожайность в т/га, общий сбор, выручка и маржа</w:t>
       </w:r>
     </w:p>
     <w:p>
@@ -22914,10 +23221,25 @@
         <w:rPr>
           <w:b/>
         </w:rPr>
-        <w:t>Регион.</w:t>
-      </w:r>
-      <w:r>
-        <w:t xml:space="preserve"> История урожайности 2000–2025 годов с трендом и веером прогноза, главные погодные факторы сезона, погода сезона против нормы (температура, осадки, ГТК), почвы и все культуры региона.</w:t>
+        <w:lastRenderedPageBreak/>
+        <w:t>Как это помогает планировать затраты и доходы.</w:t>
+      </w:r>
+      <w:r>
+        <w:t xml:space="preserve"> Прогноз в тоннах сразу переводится в деньги. Хозяйство видит ожидаемую выручку и маржу по каждой культуре, затраты, которые нужно профинансировать, и разброс результата между плохим и хорошим годом. До сева это основа решения, что сеять; весной и летом — основа договоров на продажу и расчёта оборотных средств, а с каждой следующей датой прогноз уточняется по факту погоды.</w:t>
+      </w:r>
+    </w:p>
+    <w:p>
+      <w:pPr>
+        <w:ind w:firstLine="425"/>
+      </w:pPr>
+      <w:r>
+        <w:rPr>
+          <w:b/>
+        </w:rPr>
+        <w:t>Что посеять</w:t>
+      </w:r>
+      <w:r>
+        <w:t xml:space="preserve"> связывает калькулятор с оптимизацией (раздел 9). Для плана из калькулятора сайт проверяет его на погоде 21 прошлого сезона и показывает, какую небольшую долю площади и на какую культуру переставить, чтобы вырос ожидаемый доход и не просела прибыль в плохой год. Пользователь регулирует, сколько площади готов переставить и насколько осторожен.</w:t>
       </w:r>
     </w:p>
     <w:p>
@@ -22931,8 +23253,8 @@
           <w:noProof/>
         </w:rPr>
         <w:drawing>
-          <wp:inline distT="0" distB="0" distL="0" distR="0" wp14:anchorId="12093BED" wp14:editId="074CA2C1">
-            <wp:extent cx="3610285" cy="2807999"/>
+          <wp:inline distT="0" distB="0" distL="0" distR="0" wp14:anchorId="06894C35" wp14:editId="5C3D308B">
+            <wp:extent cx="3516104" cy="2808000"/>
             <wp:effectExtent l="0" t="0" r="0" b="0"/>
             <wp:docPr id="24" name="Picture 24"/>
             <wp:cNvGraphicFramePr>
@@ -22942,7 +23264,7 @@
               <a:graphicData uri="http://schemas.openxmlformats.org/drawingml/2006/picture">
                 <pic:pic xmlns:pic="http://schemas.openxmlformats.org/drawingml/2006/picture">
                   <pic:nvPicPr>
-                    <pic:cNvPr id="0" name="02_region.png"/>
+                    <pic:cNvPr id="0" name="04_optimize.png"/>
                     <pic:cNvPicPr/>
                   </pic:nvPicPr>
                   <pic:blipFill>
@@ -22954,7 +23276,7 @@
                   <pic:spPr>
                     <a:xfrm>
                       <a:off x="0" y="0"/>
-                      <a:ext cx="3610285" cy="2807999"/>
+                      <a:ext cx="3516104" cy="2808000"/>
                     </a:xfrm>
                     <a:prstGeom prst="rect">
                       <a:avLst/>
@@ -22978,7 +23300,7 @@
         <w:t xml:space="preserve">Рисунок 24. </w:t>
       </w:r>
       <w:r>
-        <w:t>Карточка региона: история, тренд, веер прогноза и факторы погоды</w:t>
+        <w:t>«Что посеять»: рекомендуемая перестановка площади, эффект и прибыль в плохой год</w:t>
       </w:r>
     </w:p>
     <w:p>
@@ -22989,10 +23311,10 @@
         <w:rPr>
           <w:b/>
         </w:rPr>
-        <w:t>Калькулятор</w:t>
-      </w:r>
-      <w:r>
-        <w:t xml:space="preserve"> — прямой ответ на кейс. Пользователь вводит регион, площадь, структуру посевов и поправки на почву, сорт и агротехнику. На выходе — урожайность в т/га и общий объём по каждой культуре, выручка, затраты и маржа в плохой, обычный и хороший год. Поправки на сорт и агротехнику — параметры пользователя: открытых данных, связывающих их с урожаем на уровне хозяйства, нет.</w:t>
+        <w:t>Регионы</w:t>
+      </w:r>
+      <w:r>
+        <w:t xml:space="preserve"> — контекст калькулятора. Карта России показывает региональный прогноз по культуре и дате: где урожай ожидается выше или ниже обычного. На карточке региона — история урожайности с трендом и интервалом прогноза, главные факторы сезона, погода против нормы и почвы. Важно: это прогноз для региона в целом (среднее по хозяйствам субъекта), а не для отдельного поля.</w:t>
       </w:r>
     </w:p>
     <w:p>
@@ -23005,10 +23327,9 @@
         <w:rPr>
           <w:noProof/>
         </w:rPr>
-        <w:lastRenderedPageBreak/>
         <w:drawing>
-          <wp:inline distT="0" distB="0" distL="0" distR="0" wp14:anchorId="220C8DAC" wp14:editId="56A3C4DE">
-            <wp:extent cx="3964235" cy="2808000"/>
+          <wp:inline distT="0" distB="0" distL="0" distR="0" wp14:anchorId="327C338A" wp14:editId="61D21650">
+            <wp:extent cx="4043519" cy="2807999"/>
             <wp:effectExtent l="0" t="0" r="0" b="0"/>
             <wp:docPr id="25" name="Picture 25"/>
             <wp:cNvGraphicFramePr>
@@ -23018,7 +23339,7 @@
               <a:graphicData uri="http://schemas.openxmlformats.org/drawingml/2006/picture">
                 <pic:pic xmlns:pic="http://schemas.openxmlformats.org/drawingml/2006/picture">
                   <pic:nvPicPr>
-                    <pic:cNvPr id="0" name="03_calc.png"/>
+                    <pic:cNvPr id="0" name="02_regions.png"/>
                     <pic:cNvPicPr/>
                   </pic:nvPicPr>
                   <pic:blipFill>
@@ -23030,7 +23351,7 @@
                   <pic:spPr>
                     <a:xfrm>
                       <a:off x="0" y="0"/>
-                      <a:ext cx="3964235" cy="2808000"/>
+                      <a:ext cx="4043519" cy="2807999"/>
                     </a:xfrm>
                     <a:prstGeom prst="rect">
                       <a:avLst/>
@@ -23054,7 +23375,7 @@
         <w:t xml:space="preserve">Рисунок 25. </w:t>
       </w:r>
       <w:r>
-        <w:t>Калькулятор: урожай в т/га и объём, выручка, затраты и маржа по сценариям</w:t>
+        <w:t>Региональный прогноз: карта России по выбранной культуре и дате</w:t>
       </w:r>
     </w:p>
     <w:p>
@@ -23065,10 +23386,19 @@
         <w:rPr>
           <w:b/>
         </w:rPr>
-        <w:t>Оптимизация.</w:t>
-      </w:r>
-      <w:r>
-        <w:t xml:space="preserve"> Текущий план и рекомендованный при ограничении «менять не больше X %» и выбранном уровне осторожности. Показаны разница планов, эффект в рублях, кривая «насколько меняем план → сколько выигрываем» и прибыль по погодным сценариям.</w:t>
+        <w:lastRenderedPageBreak/>
+        <w:t>Методика</w:t>
+      </w:r>
+      <w:r>
+        <w:t xml:space="preserve"> — источники данных, схема расчёта, точность против простых прогнозов, ограничения. Пользователь видит не только число, но и то, насколько ему можно верить.</w:t>
+      </w:r>
+    </w:p>
+    <w:p>
+      <w:pPr>
+        <w:ind w:firstLine="425"/>
+      </w:pPr>
+      <w:r>
+        <w:t>Интерфейс работает в светлой и тёмной теме и адаптируется до ширины 360 пикселей, то есть доступен и с телефона в поле.</w:t>
       </w:r>
     </w:p>
     <w:p>
@@ -23082,8 +23412,8 @@
           <w:noProof/>
         </w:rPr>
         <w:drawing>
-          <wp:inline distT="0" distB="0" distL="0" distR="0" wp14:anchorId="63C45A21" wp14:editId="7EC289E3">
-            <wp:extent cx="3159000" cy="2808000"/>
+          <wp:inline distT="0" distB="0" distL="0" distR="0" wp14:anchorId="53AEEB74" wp14:editId="788BACA9">
+            <wp:extent cx="540000" cy="2808000"/>
             <wp:effectExtent l="0" t="0" r="0" b="0"/>
             <wp:docPr id="26" name="Picture 26"/>
             <wp:cNvGraphicFramePr>
@@ -23093,7 +23423,7 @@
               <a:graphicData uri="http://schemas.openxmlformats.org/drawingml/2006/picture">
                 <pic:pic xmlns:pic="http://schemas.openxmlformats.org/drawingml/2006/picture">
                   <pic:nvPicPr>
-                    <pic:cNvPr id="0" name="04_optimize.png"/>
+                    <pic:cNvPr id="0" name="06_mobile_calc.png"/>
                     <pic:cNvPicPr/>
                   </pic:nvPicPr>
                   <pic:blipFill>
@@ -23105,7 +23435,7 @@
                   <pic:spPr>
                     <a:xfrm>
                       <a:off x="0" y="0"/>
-                      <a:ext cx="3159000" cy="2808000"/>
+                      <a:ext cx="540000" cy="2808000"/>
                     </a:xfrm>
                     <a:prstGeom prst="rect">
                       <a:avLst/>
@@ -23129,66 +23459,63 @@
         <w:t xml:space="preserve">Рисунок 26. </w:t>
       </w:r>
       <w:r>
-        <w:t>Модуль оптимизации плана посевов</w:t>
-      </w:r>
+        <w:t>Калькулятор участка на экране телефона</w:t>
+      </w:r>
+    </w:p>
+    <w:p>
+      <w:pPr>
+        <w:pStyle w:val="1"/>
+      </w:pPr>
+      <w:bookmarkStart w:id="60" w:name="_Toc244091004"/>
+      <w:r>
+        <w:t>11. Ограничения</w:t>
+      </w:r>
+      <w:bookmarkEnd w:id="60"/>
     </w:p>
     <w:p>
       <w:pPr>
         <w:ind w:firstLine="425"/>
       </w:pPr>
+      <w:r>
+        <w:t>Мы сознательно перечисляем ограничения подробно: от них зависит, как пользоваться результатами.</w:t>
+      </w:r>
+    </w:p>
+    <w:p>
+      <w:pPr>
+        <w:spacing w:after="50"/>
+        <w:ind w:left="510" w:hanging="283"/>
+      </w:pPr>
+      <w:r>
+        <w:t xml:space="preserve">1.  </w:t>
+      </w:r>
       <w:r>
         <w:rPr>
           <w:b/>
         </w:rPr>
-        <w:t>Методика.</w:t>
-      </w:r>
-      <w:r>
-        <w:t xml:space="preserve"> Источники данных, схема расчёта, точность против простых прогнозов, выигрыш по дате прогноза и ограничения. Пользователь видит не только число, но и то, насколько ему можно верить.</w:t>
-      </w:r>
-    </w:p>
-    <w:p>
-      <w:pPr>
-        <w:ind w:firstLine="425"/>
-      </w:pPr>
-      <w:r>
-        <w:t>Интерфейс поддерживает светлую и тёмную тему и адаптируется до ширины 360 пикселей, то есть работает и с телефона в поле.</w:t>
-      </w:r>
-    </w:p>
-    <w:p>
-      <w:pPr>
-        <w:pStyle w:val="1"/>
-      </w:pPr>
-      <w:bookmarkStart w:id="58" w:name="_Toc244085509"/>
-      <w:r>
-        <w:t>11. Ограничения</w:t>
-      </w:r>
-      <w:bookmarkEnd w:id="58"/>
-    </w:p>
-    <w:p>
-      <w:pPr>
-        <w:ind w:firstLine="425"/>
-      </w:pPr>
-      <w:r>
-        <w:t>Мы сознательно перечисляем ограничения подробно: от них зависит, как пользоваться результатами.</w:t>
-      </w:r>
-    </w:p>
-    <w:p>
-      <w:pPr>
-        <w:spacing w:after="50"/>
-        <w:ind w:left="510" w:hanging="283"/>
-      </w:pPr>
-      <w:r>
-        <w:lastRenderedPageBreak/>
-        <w:t xml:space="preserve">1.  </w:t>
+        <w:t>Модель региональная, участок — допущения.</w:t>
+      </w:r>
+      <w:r>
+        <w:t xml:space="preserve"> Открытая статистика урожайности есть только по субъектам (среднее по хозяйствам), поэтому обучена региональная модель. Калькулятор участка пересчитывает её прогноз на площадь хозяйства, а влияние почвы участка, сорта семян и агротехники задаёт множителями-допущениями (</w:t>
       </w:r>
       <w:r>
         <w:rPr>
-          <w:b/>
+          <w:rFonts w:ascii="Consolas" w:hAnsi="Consolas"/>
+          <w:sz w:val="19"/>
         </w:rPr>
-        <w:t>Уровень субъекта, а не поля.</w:t>
-      </w:r>
-      <w:r>
-        <w:t xml:space="preserve"> Открытая статистика урожайности есть только по субъектам. Прогноз хозяйства — это прогноз субъекта, уточнённый поправками пользователя. Внутрирегиональная разница почв, рельефа и агротехники моделью не видна.</w:t>
+        <w:t>web/data/economics.json</w:t>
+      </w:r>
+      <w:r>
+        <w:t xml:space="preserve">, раздел </w:t>
+      </w:r>
+      <w:r>
+        <w:rPr>
+          <w:rFonts w:ascii="Consolas" w:hAnsi="Consolas"/>
+          <w:sz w:val="19"/>
+        </w:rPr>
+        <w:t>adjustments</w:t>
+      </w:r>
+      <w:r>
+        <w:t>). Это не оценки обученной модели: данных об урожайности по сортам и агротехнике хозяйств в открытом доступе нет. Климат и почвы региона — из данных (ERA5, SoilGrids), но участок-специфичные эффекты внутри региона не оценивались. Внутрирегиональная разница рельефа и почв моделью не видна.</w:t>
       </w:r>
     </w:p>
     <w:p>
@@ -23206,7 +23533,7 @@
         <w:t>Нет итогов Росстата за 2025 год.</w:t>
       </w:r>
       <w:r>
-        <w:t xml:space="preserve"> Урожайность полевых культур за 2025 год выйдет весной 2027 года. В проверке 2025 год восстановлен по сбору и посевной с ошибкой 1–3 %, а подсолнечника за 2025 год нет совсем. Прогноз 2026 года пока нельзя проверить по итогам.</w:t>
+        <w:t xml:space="preserve"> Урожайность полевых культур за 2025 год выйдет весной 2027 года. В проверке 2025 год восстановлен по сбору и посевной с ошибкой 1–3 %, а подсолнечника за 2025 год нет совсем. Оценку 2026 года по фактической погоде пока нельзя проверить по итогам Росстата.</w:t>
       </w:r>
     </w:p>
     <w:p>
@@ -23260,7 +23587,11 @@
         <w:t>Затраты в оптимизации — допущения.</w:t>
       </w:r>
       <w:r>
-        <w:t xml:space="preserve"> Открытых нормативов затрат по культурам и регионам нет. Затраты заданы по отраслевым ориентирам и сверены по масштабу с себестоимостью Росстата, но абсолютные суммы эффекта зависят от них. Поэтому в прототипе затраты и цены — параметры пользователя.</w:t>
+        <w:t xml:space="preserve"> Открытых нормативов затрат по культурам и регионам нет. Затраты заданы по отраслевым ориентирам и сверены по масштабу с </w:t>
+      </w:r>
+      <w:r>
+        <w:lastRenderedPageBreak/>
+        <w:t>себестоимостью Росстата, но абсолютные суммы эффекта зависят от них. Поэтому в прототипе затраты и цены — параметры пользователя.</w:t>
       </w:r>
     </w:p>
     <w:p>
@@ -23375,11 +23706,11 @@
       <w:pPr>
         <w:pStyle w:val="1"/>
       </w:pPr>
-      <w:bookmarkStart w:id="59" w:name="_Toc244085510"/>
+      <w:bookmarkStart w:id="61" w:name="_Toc244091005"/>
       <w:r>
         <w:t>12. План развития</w:t>
       </w:r>
-      <w:bookmarkEnd w:id="59"/>
+      <w:bookmarkEnd w:id="61"/>
     </w:p>
     <w:p>
       <w:pPr>
@@ -23393,12 +23724,11 @@
       <w:pPr>
         <w:pStyle w:val="21"/>
       </w:pPr>
-      <w:bookmarkStart w:id="60" w:name="_Toc244085511"/>
-      <w:r>
-        <w:lastRenderedPageBreak/>
+      <w:bookmarkStart w:id="62" w:name="_Toc244091006"/>
+      <w:r>
         <w:t>12.1. Ближайшие шаги (1–3 месяца)</w:t>
       </w:r>
-      <w:bookmarkEnd w:id="60"/>
+      <w:bookmarkEnd w:id="62"/>
     </w:p>
     <w:p>
       <w:pPr>
@@ -23425,7 +23755,7 @@
         <w:t>Проверка 2025–2026 годов.</w:t>
       </w:r>
       <w:r>
-        <w:t xml:space="preserve"> После выхода итогов Росстата (апрель 2027 года) заменить расчётную урожайность 2025 года официальной и проверить прогноз 2026 года вслепую.</w:t>
+        <w:t xml:space="preserve"> После выхода итогов Росстата (апрель 2027 года) заменить расчётную урожайность 2025 года официальной и проверить оценку 2026 года вслепую.</w:t>
       </w:r>
     </w:p>
     <w:p>
@@ -23460,11 +23790,29 @@
       <w:pPr>
         <w:pStyle w:val="21"/>
       </w:pPr>
-      <w:bookmarkStart w:id="61" w:name="_Toc244085512"/>
+      <w:bookmarkStart w:id="63" w:name="_Toc244091007"/>
       <w:r>
         <w:t>12.2. Развитие продукта (3–12 месяцев)</w:t>
       </w:r>
-      <w:bookmarkEnd w:id="61"/>
+      <w:bookmarkEnd w:id="63"/>
+    </w:p>
+    <w:p>
+      <w:pPr>
+        <w:pStyle w:val="a0"/>
+      </w:pPr>
+      <w:r>
+        <w:rPr>
+          <w:b/>
+        </w:rPr>
+        <w:t>Калибровка множителей участка.</w:t>
+      </w:r>
+      <w:r>
+        <w:t xml:space="preserve"> Заменить допущения о влиянии почвы, сорта и агротехники оценками на данных агрохозяйств, опытных станций и банка: чем больше </w:t>
+      </w:r>
+      <w:r>
+        <w:lastRenderedPageBreak/>
+        <w:t>хозяйств с историей урожайности по полям и сортам, тем точнее множители. Это превращает калькулятор из «регионального прогноза с поправками» в модель участка.</w:t>
+      </w:r>
     </w:p>
     <w:p>
       <w:pPr>
@@ -23540,11 +23888,11 @@
       <w:pPr>
         <w:pStyle w:val="21"/>
       </w:pPr>
-      <w:bookmarkStart w:id="62" w:name="_Toc244085513"/>
+      <w:bookmarkStart w:id="64" w:name="_Toc244091008"/>
       <w:r>
         <w:t>12.3. Ценность для банка (горизонт 1–2 года)</w:t>
       </w:r>
-      <w:bookmarkEnd w:id="62"/>
+      <w:bookmarkEnd w:id="64"/>
     </w:p>
     <w:p>
       <w:pPr>
@@ -23606,18 +23954,18 @@
       <w:pPr>
         <w:pStyle w:val="1"/>
       </w:pPr>
-      <w:bookmarkStart w:id="63" w:name="_Toc244085514"/>
+      <w:bookmarkStart w:id="65" w:name="_Toc244091009"/>
       <w:r>
         <w:t>Заключение</w:t>
       </w:r>
-      <w:bookmarkEnd w:id="63"/>
+      <w:bookmarkEnd w:id="65"/>
     </w:p>
     <w:p>
       <w:pPr>
         <w:ind w:firstLine="425"/>
       </w:pPr>
       <w:r>
-        <w:t>Задача кейса — калькулятор урожайности с расчётом в тоннах на гектар и общего объёма для нескольких культур и объяснением пользы для планирования. Она решена как полноценное исследование на открытых данных.</w:t>
+        <w:t>Задача кейса — калькулятор урожайности с расчётом в тоннах на гектар и общего объёма для нескольких культур и объяснением пользы для планирования. Продукт — калькулятор участка; его основа — региональный прогноз, построенный как полноценное исследование на открытых данных.</w:t>
       </w:r>
     </w:p>
     <w:p>
@@ -23662,7 +24010,6 @@
         <w:ind w:left="510" w:hanging="283"/>
       </w:pPr>
       <w:r>
-        <w:lastRenderedPageBreak/>
         <w:t xml:space="preserve">3.  </w:t>
       </w:r>
       <w:r>
@@ -23720,6 +24067,7 @@
         <w:ind w:left="510" w:hanging="283"/>
       </w:pPr>
       <w:r>
+        <w:lastRenderedPageBreak/>
         <w:t xml:space="preserve">6.  </w:t>
       </w:r>
       <w:r>
@@ -23729,7 +24077,7 @@
         <w:t>Продукт.</w:t>
       </w:r>
       <w:r>
-        <w:t xml:space="preserve"> Сайт «Агрокаст» показывает прогноз, калькулятор и оптимизацию в виде, понятном фермеру и кредитному аналитику.</w:t>
+        <w:t xml:space="preserve"> Сайт «Агрокаст» (&lt;https://parampaika.github.io/AgroCast/&gt;, код — &lt;https://github.com/Parampaika/AgroCast&gt;) — калькулятор участка: регион, площадь по культурам, почва, сорт и агротехника дают т/га, общий сбор, выручку и маржу с диапазоном «плохой — обычный — хороший год», а «Что посеять» превращает это в рекомендацию по плану. Честная оговорка: влияние почвы участка, сорта и агротехники — множители-допущения, обученная модель региональная.</w:t>
       </w:r>
     </w:p>
     <w:p>
@@ -23737,7 +24085,7 @@
         <w:ind w:firstLine="425"/>
       </w:pPr>
       <w:r>
-        <w:t>Главный вывод: погода объясняет заметную, но не основную часть колебаний урожайности на уровне региона, и честный прогноз — это распределение, а не точка. Именно поэтому ценность калькулятора не в третьем знаке точности, а в том, что он связывает прогноз с решением: какой план посевов выдержит плохой год и заработает в хороший.</w:t>
+        <w:t>Главный вывод: погода объясняет заметную, но не основную часть колебаний урожайности на уровне региона, и честный прогноз — это распределение, а не точка. Именно поэтому ценность калькулятора участка не в третьем знаке точности, а в том, что он связывает прогноз с решением: какой план посевов выдержит плохой год и заработает в хороший.</w:t>
       </w:r>
     </w:p>
     <w:p>
@@ -23749,22 +24097,22 @@
       <w:pPr>
         <w:pStyle w:val="1"/>
       </w:pPr>
-      <w:bookmarkStart w:id="64" w:name="_Toc244085515"/>
+      <w:bookmarkStart w:id="66" w:name="_Toc244091010"/>
       <w:r>
         <w:lastRenderedPageBreak/>
         <w:t>Список источников</w:t>
       </w:r>
-      <w:bookmarkEnd w:id="64"/>
+      <w:bookmarkEnd w:id="66"/>
     </w:p>
     <w:p>
       <w:pPr>
         <w:pStyle w:val="21"/>
       </w:pPr>
-      <w:bookmarkStart w:id="65" w:name="_Toc244085516"/>
+      <w:bookmarkStart w:id="67" w:name="_Toc244091011"/>
       <w:r>
         <w:t>Литература</w:t>
       </w:r>
-      <w:bookmarkEnd w:id="65"/>
+      <w:bookmarkEnd w:id="67"/>
     </w:p>
     <w:p>
       <w:pPr>
@@ -24135,11 +24483,11 @@
       <w:pPr>
         <w:pStyle w:val="21"/>
       </w:pPr>
-      <w:bookmarkStart w:id="66" w:name="_Toc244085517"/>
+      <w:bookmarkStart w:id="68" w:name="_Toc244091012"/>
       <w:r>
         <w:t>Данные</w:t>
       </w:r>
-      <w:bookmarkEnd w:id="66"/>
+      <w:bookmarkEnd w:id="68"/>
     </w:p>
     <w:p>
       <w:pPr>
@@ -24534,31 +24882,31 @@
       </w:rPr>
     </w:lvl>
   </w:abstractNum>
-  <w:num w:numId="1" w16cid:durableId="2131391892">
+  <w:num w:numId="1" w16cid:durableId="1275555483">
     <w:abstractNumId w:val="8"/>
   </w:num>
-  <w:num w:numId="2" w16cid:durableId="776681317">
+  <w:num w:numId="2" w16cid:durableId="1413888083">
     <w:abstractNumId w:val="6"/>
   </w:num>
-  <w:num w:numId="3" w16cid:durableId="19354350">
+  <w:num w:numId="3" w16cid:durableId="1913809882">
     <w:abstractNumId w:val="5"/>
   </w:num>
-  <w:num w:numId="4" w16cid:durableId="1758670961">
+  <w:num w:numId="4" w16cid:durableId="1618022877">
     <w:abstractNumId w:val="4"/>
   </w:num>
-  <w:num w:numId="5" w16cid:durableId="1007487531">
+  <w:num w:numId="5" w16cid:durableId="1020594057">
     <w:abstractNumId w:val="7"/>
   </w:num>
-  <w:num w:numId="6" w16cid:durableId="1681196045">
+  <w:num w:numId="6" w16cid:durableId="507214515">
     <w:abstractNumId w:val="3"/>
   </w:num>
-  <w:num w:numId="7" w16cid:durableId="1216967473">
+  <w:num w:numId="7" w16cid:durableId="894195176">
     <w:abstractNumId w:val="2"/>
   </w:num>
-  <w:num w:numId="8" w16cid:durableId="509637171">
+  <w:num w:numId="8" w16cid:durableId="6098807">
     <w:abstractNumId w:val="1"/>
   </w:num>
-  <w:num w:numId="9" w16cid:durableId="1729063842">
+  <w:num w:numId="9" w16cid:durableId="1951431427">
     <w:abstractNumId w:val="0"/>
   </w:num>
 </w:numbering>
@@ -35981,7 +36329,7 @@
     <w:autoRedefine/>
     <w:uiPriority w:val="39"/>
     <w:unhideWhenUsed/>
-    <w:rsid w:val="000057EE"/>
+    <w:rsid w:val="00035A58"/>
   </w:style>
   <w:style w:type="paragraph" w:styleId="2c">
     <w:name w:val="toc 2"/>
@@ -35990,7 +36338,7 @@
     <w:autoRedefine/>
     <w:uiPriority w:val="39"/>
     <w:unhideWhenUsed/>
-    <w:rsid w:val="000057EE"/>
+    <w:rsid w:val="00035A58"/>
     <w:pPr>
       <w:ind w:left="210"/>
     </w:pPr>
@@ -36000,7 +36348,7 @@
     <w:basedOn w:val="a2"/>
     <w:uiPriority w:val="99"/>
     <w:unhideWhenUsed/>
-    <w:rsid w:val="000057EE"/>
+    <w:rsid w:val="00035A58"/>
     <w:rPr>
       <w:color w:val="0000FF" w:themeColor="hyperlink"/>
       <w:u w:val="single"/>

</xml_diff>